<commit_message>
DOC: re-format chapter 3
</commit_message>
<xml_diff>
--- a/doc/110123011 HIEU.docx
+++ b/doc/110123011 HIEU.docx
@@ -3535,8 +3535,6 @@
               </w:rPr>
               <w:t>INT</w:t>
             </w:r>
-            <w:bookmarkStart w:id="0" w:name="_GoBack"/>
-            <w:bookmarkEnd w:id="0"/>
           </w:p>
         </w:tc>
         <w:tc>
@@ -3821,21 +3819,29 @@
           <w:tcPr>
             <w:cnfStyle w:val="001000000000" w:firstRow="0" w:lastRow="0" w:firstColumn="1" w:lastColumn="0" w:oddVBand="0" w:evenVBand="0" w:oddHBand="0" w:evenHBand="0" w:firstRowFirstColumn="0" w:firstRowLastColumn="0" w:lastRowFirstColumn="0" w:lastRowLastColumn="0"/>
             <w:tcW w:w="708" w:type="dxa"/>
-            <w:vAlign w:val="top"/>
-          </w:tcPr>
-          <w:p>
-            <w:r>
-              <w:t>STT</w:t>
+          </w:tcPr>
+          <w:p>
+            <w:pPr>
+              <w:ind w:firstLine="0"/>
+            </w:pPr>
+            <w:r>
+              <w:rPr>
+                <w:lang w:val="en-US"/>
+              </w:rPr>
+              <w:t>S</w:t>
+            </w:r>
+            <w:r>
+              <w:t>TT</w:t>
             </w:r>
           </w:p>
         </w:tc>
         <w:tc>
           <w:tcPr>
             <w:tcW w:w="1790" w:type="dxa"/>
-            <w:vAlign w:val="top"/>
-          </w:tcPr>
-          <w:p>
-            <w:pPr>
+          </w:tcPr>
+          <w:p>
+            <w:pPr>
+              <w:ind w:firstLine="0"/>
               <w:cnfStyle w:val="100000000000" w:firstRow="1" w:lastRow="0" w:firstColumn="0" w:lastColumn="0" w:oddVBand="0" w:evenVBand="0" w:oddHBand="0" w:evenHBand="0" w:firstRowFirstColumn="0" w:firstRowLastColumn="0" w:lastRowFirstColumn="0" w:lastRowLastColumn="0"/>
             </w:pPr>
             <w:r>
@@ -3846,10 +3852,10 @@
         <w:tc>
           <w:tcPr>
             <w:tcW w:w="1637" w:type="dxa"/>
-            <w:vAlign w:val="top"/>
-          </w:tcPr>
-          <w:p>
-            <w:pPr>
+          </w:tcPr>
+          <w:p>
+            <w:pPr>
+              <w:ind w:firstLine="0"/>
               <w:cnfStyle w:val="100000000000" w:firstRow="1" w:lastRow="0" w:firstColumn="0" w:lastColumn="0" w:oddVBand="0" w:evenVBand="0" w:oddHBand="0" w:evenHBand="0" w:firstRowFirstColumn="0" w:firstRowLastColumn="0" w:lastRowFirstColumn="0" w:lastRowLastColumn="0"/>
             </w:pPr>
             <w:r>
@@ -3860,10 +3866,10 @@
         <w:tc>
           <w:tcPr>
             <w:tcW w:w="2097" w:type="dxa"/>
-            <w:vAlign w:val="top"/>
-          </w:tcPr>
-          <w:p>
-            <w:pPr>
+          </w:tcPr>
+          <w:p>
+            <w:pPr>
+              <w:ind w:firstLine="0"/>
               <w:cnfStyle w:val="100000000000" w:firstRow="1" w:lastRow="0" w:firstColumn="0" w:lastColumn="0" w:oddVBand="0" w:evenVBand="0" w:oddHBand="0" w:evenHBand="0" w:firstRowFirstColumn="0" w:firstRowLastColumn="0" w:lastRowFirstColumn="0" w:lastRowLastColumn="0"/>
             </w:pPr>
             <w:r>
@@ -3874,10 +3880,10 @@
         <w:tc>
           <w:tcPr>
             <w:tcW w:w="2546" w:type="dxa"/>
-            <w:vAlign w:val="top"/>
-          </w:tcPr>
-          <w:p>
-            <w:pPr>
+          </w:tcPr>
+          <w:p>
+            <w:pPr>
+              <w:ind w:firstLine="0"/>
               <w:cnfStyle w:val="100000000000" w:firstRow="1" w:lastRow="0" w:firstColumn="0" w:lastColumn="0" w:oddVBand="0" w:evenVBand="0" w:oddHBand="0" w:evenHBand="0" w:firstRowFirstColumn="0" w:firstRowLastColumn="0" w:lastRowFirstColumn="0" w:lastRowLastColumn="0"/>
             </w:pPr>
             <w:r>
@@ -3893,8 +3899,10 @@
             <w:tcW w:w="708" w:type="dxa"/>
           </w:tcPr>
           <w:p>
-            <w:r>
-              <w:lastRenderedPageBreak/>
+            <w:pPr>
+              <w:ind w:firstLine="0"/>
+            </w:pPr>
+            <w:r>
               <w:t>1</w:t>
             </w:r>
           </w:p>
@@ -3905,6 +3913,8 @@
           </w:tcPr>
           <w:p>
             <w:pPr>
+              <w:ind w:firstLine="0"/>
+              <w:jc w:val="center"/>
               <w:cnfStyle w:val="000000000000" w:firstRow="0" w:lastRow="0" w:firstColumn="0" w:lastColumn="0" w:oddVBand="0" w:evenVBand="0" w:oddHBand="0" w:evenHBand="0" w:firstRowFirstColumn="0" w:firstRowLastColumn="0" w:lastRowFirstColumn="0" w:lastRowLastColumn="0"/>
             </w:pPr>
             <w:r>
@@ -3918,6 +3928,8 @@
           </w:tcPr>
           <w:p>
             <w:pPr>
+              <w:ind w:firstLine="0"/>
+              <w:jc w:val="center"/>
               <w:cnfStyle w:val="000000000000" w:firstRow="0" w:lastRow="0" w:firstColumn="0" w:lastColumn="0" w:oddVBand="0" w:evenVBand="0" w:oddHBand="0" w:evenHBand="0" w:firstRowFirstColumn="0" w:firstRowLastColumn="0" w:lastRowFirstColumn="0" w:lastRowLastColumn="0"/>
             </w:pPr>
             <w:r>
@@ -3931,6 +3943,7 @@
           </w:tcPr>
           <w:p>
             <w:pPr>
+              <w:jc w:val="center"/>
               <w:cnfStyle w:val="000000000000" w:firstRow="0" w:lastRow="0" w:firstColumn="0" w:lastColumn="0" w:oddVBand="0" w:evenVBand="0" w:oddHBand="0" w:evenHBand="0" w:firstRowFirstColumn="0" w:firstRowLastColumn="0" w:lastRowFirstColumn="0" w:lastRowLastColumn="0"/>
             </w:pPr>
             <w:r>
@@ -3944,6 +3957,7 @@
           </w:tcPr>
           <w:p>
             <w:pPr>
+              <w:jc w:val="center"/>
               <w:cnfStyle w:val="000000000000" w:firstRow="0" w:lastRow="0" w:firstColumn="0" w:lastColumn="0" w:oddVBand="0" w:evenVBand="0" w:oddHBand="0" w:evenHBand="0" w:firstRowFirstColumn="0" w:firstRowLastColumn="0" w:lastRowFirstColumn="0" w:lastRowLastColumn="0"/>
             </w:pPr>
             <w:r>
@@ -3959,7 +3973,11 @@
             <w:tcW w:w="708" w:type="dxa"/>
           </w:tcPr>
           <w:p>
-            <w:r>
+            <w:pPr>
+              <w:ind w:firstLine="0"/>
+            </w:pPr>
+            <w:r>
+              <w:lastRenderedPageBreak/>
               <w:t>2</w:t>
             </w:r>
           </w:p>
@@ -3970,6 +3988,8 @@
           </w:tcPr>
           <w:p>
             <w:pPr>
+              <w:ind w:firstLine="0"/>
+              <w:jc w:val="center"/>
               <w:cnfStyle w:val="000000000000" w:firstRow="0" w:lastRow="0" w:firstColumn="0" w:lastColumn="0" w:oddVBand="0" w:evenVBand="0" w:oddHBand="0" w:evenHBand="0" w:firstRowFirstColumn="0" w:firstRowLastColumn="0" w:lastRowFirstColumn="0" w:lastRowLastColumn="0"/>
             </w:pPr>
             <w:r>
@@ -3983,6 +4003,8 @@
           </w:tcPr>
           <w:p>
             <w:pPr>
+              <w:ind w:firstLine="0"/>
+              <w:jc w:val="center"/>
               <w:cnfStyle w:val="000000000000" w:firstRow="0" w:lastRow="0" w:firstColumn="0" w:lastColumn="0" w:oddVBand="0" w:evenVBand="0" w:oddHBand="0" w:evenHBand="0" w:firstRowFirstColumn="0" w:firstRowLastColumn="0" w:lastRowFirstColumn="0" w:lastRowLastColumn="0"/>
             </w:pPr>
             <w:r>
@@ -3996,6 +4018,8 @@
           </w:tcPr>
           <w:p>
             <w:pPr>
+              <w:ind w:firstLine="0"/>
+              <w:jc w:val="center"/>
               <w:cnfStyle w:val="000000000000" w:firstRow="0" w:lastRow="0" w:firstColumn="0" w:lastColumn="0" w:oddVBand="0" w:evenVBand="0" w:oddHBand="0" w:evenHBand="0" w:firstRowFirstColumn="0" w:firstRowLastColumn="0" w:lastRowFirstColumn="0" w:lastRowLastColumn="0"/>
             </w:pPr>
             <w:r>
@@ -4009,6 +4033,8 @@
           </w:tcPr>
           <w:p>
             <w:pPr>
+              <w:ind w:firstLine="0"/>
+              <w:jc w:val="center"/>
               <w:cnfStyle w:val="000000000000" w:firstRow="0" w:lastRow="0" w:firstColumn="0" w:lastColumn="0" w:oddVBand="0" w:evenVBand="0" w:oddHBand="0" w:evenHBand="0" w:firstRowFirstColumn="0" w:firstRowLastColumn="0" w:lastRowFirstColumn="0" w:lastRowLastColumn="0"/>
             </w:pPr>
             <w:r>
@@ -4024,6 +4050,9 @@
             <w:tcW w:w="708" w:type="dxa"/>
           </w:tcPr>
           <w:p>
+            <w:pPr>
+              <w:ind w:firstLine="0"/>
+            </w:pPr>
             <w:r>
               <w:t>3</w:t>
             </w:r>
@@ -4035,6 +4064,8 @@
           </w:tcPr>
           <w:p>
             <w:pPr>
+              <w:ind w:firstLine="0"/>
+              <w:jc w:val="center"/>
               <w:cnfStyle w:val="000000000000" w:firstRow="0" w:lastRow="0" w:firstColumn="0" w:lastColumn="0" w:oddVBand="0" w:evenVBand="0" w:oddHBand="0" w:evenHBand="0" w:firstRowFirstColumn="0" w:firstRowLastColumn="0" w:lastRowFirstColumn="0" w:lastRowLastColumn="0"/>
             </w:pPr>
             <w:r>
@@ -4048,6 +4079,8 @@
           </w:tcPr>
           <w:p>
             <w:pPr>
+              <w:ind w:firstLine="0"/>
+              <w:jc w:val="center"/>
               <w:cnfStyle w:val="000000000000" w:firstRow="0" w:lastRow="0" w:firstColumn="0" w:lastColumn="0" w:oddVBand="0" w:evenVBand="0" w:oddHBand="0" w:evenHBand="0" w:firstRowFirstColumn="0" w:firstRowLastColumn="0" w:lastRowFirstColumn="0" w:lastRowLastColumn="0"/>
             </w:pPr>
             <w:r>
@@ -4061,6 +4094,8 @@
           </w:tcPr>
           <w:p>
             <w:pPr>
+              <w:ind w:firstLine="0"/>
+              <w:jc w:val="center"/>
               <w:cnfStyle w:val="000000000000" w:firstRow="0" w:lastRow="0" w:firstColumn="0" w:lastColumn="0" w:oddVBand="0" w:evenVBand="0" w:oddHBand="0" w:evenHBand="0" w:firstRowFirstColumn="0" w:firstRowLastColumn="0" w:lastRowFirstColumn="0" w:lastRowLastColumn="0"/>
             </w:pPr>
             <w:r>
@@ -4074,6 +4109,8 @@
           </w:tcPr>
           <w:p>
             <w:pPr>
+              <w:ind w:firstLine="0"/>
+              <w:jc w:val="center"/>
               <w:cnfStyle w:val="000000000000" w:firstRow="0" w:lastRow="0" w:firstColumn="0" w:lastColumn="0" w:oddVBand="0" w:evenVBand="0" w:oddHBand="0" w:evenHBand="0" w:firstRowFirstColumn="0" w:firstRowLastColumn="0" w:lastRowFirstColumn="0" w:lastRowLastColumn="0"/>
             </w:pPr>
             <w:r>
@@ -4089,6 +4126,9 @@
             <w:tcW w:w="708" w:type="dxa"/>
           </w:tcPr>
           <w:p>
+            <w:pPr>
+              <w:ind w:firstLine="0"/>
+            </w:pPr>
             <w:r>
               <w:t>4</w:t>
             </w:r>
@@ -4100,6 +4140,8 @@
           </w:tcPr>
           <w:p>
             <w:pPr>
+              <w:ind w:firstLine="0"/>
+              <w:jc w:val="center"/>
               <w:cnfStyle w:val="000000000000" w:firstRow="0" w:lastRow="0" w:firstColumn="0" w:lastColumn="0" w:oddVBand="0" w:evenVBand="0" w:oddHBand="0" w:evenHBand="0" w:firstRowFirstColumn="0" w:firstRowLastColumn="0" w:lastRowFirstColumn="0" w:lastRowLastColumn="0"/>
             </w:pPr>
             <w:r>
@@ -4113,6 +4155,8 @@
           </w:tcPr>
           <w:p>
             <w:pPr>
+              <w:ind w:firstLine="0"/>
+              <w:jc w:val="center"/>
               <w:cnfStyle w:val="000000000000" w:firstRow="0" w:lastRow="0" w:firstColumn="0" w:lastColumn="0" w:oddVBand="0" w:evenVBand="0" w:oddHBand="0" w:evenHBand="0" w:firstRowFirstColumn="0" w:firstRowLastColumn="0" w:lastRowFirstColumn="0" w:lastRowLastColumn="0"/>
             </w:pPr>
             <w:r>
@@ -4126,6 +4170,8 @@
           </w:tcPr>
           <w:p>
             <w:pPr>
+              <w:ind w:firstLine="0"/>
+              <w:jc w:val="center"/>
               <w:cnfStyle w:val="000000000000" w:firstRow="0" w:lastRow="0" w:firstColumn="0" w:lastColumn="0" w:oddVBand="0" w:evenVBand="0" w:oddHBand="0" w:evenHBand="0" w:firstRowFirstColumn="0" w:firstRowLastColumn="0" w:lastRowFirstColumn="0" w:lastRowLastColumn="0"/>
             </w:pPr>
             <w:r>
@@ -4139,6 +4185,8 @@
           </w:tcPr>
           <w:p>
             <w:pPr>
+              <w:ind w:firstLine="0"/>
+              <w:jc w:val="center"/>
               <w:cnfStyle w:val="000000000000" w:firstRow="0" w:lastRow="0" w:firstColumn="0" w:lastColumn="0" w:oddVBand="0" w:evenVBand="0" w:oddHBand="0" w:evenHBand="0" w:firstRowFirstColumn="0" w:firstRowLastColumn="0" w:lastRowFirstColumn="0" w:lastRowLastColumn="0"/>
             </w:pPr>
             <w:r>
@@ -4154,6 +4202,9 @@
             <w:tcW w:w="708" w:type="dxa"/>
           </w:tcPr>
           <w:p>
+            <w:pPr>
+              <w:ind w:firstLine="0"/>
+            </w:pPr>
             <w:r>
               <w:t>5</w:t>
             </w:r>
@@ -4165,6 +4216,8 @@
           </w:tcPr>
           <w:p>
             <w:pPr>
+              <w:ind w:firstLine="0"/>
+              <w:jc w:val="center"/>
               <w:cnfStyle w:val="000000000000" w:firstRow="0" w:lastRow="0" w:firstColumn="0" w:lastColumn="0" w:oddVBand="0" w:evenVBand="0" w:oddHBand="0" w:evenHBand="0" w:firstRowFirstColumn="0" w:firstRowLastColumn="0" w:lastRowFirstColumn="0" w:lastRowLastColumn="0"/>
             </w:pPr>
             <w:r>
@@ -4178,6 +4231,8 @@
           </w:tcPr>
           <w:p>
             <w:pPr>
+              <w:ind w:firstLine="0"/>
+              <w:jc w:val="center"/>
               <w:cnfStyle w:val="000000000000" w:firstRow="0" w:lastRow="0" w:firstColumn="0" w:lastColumn="0" w:oddVBand="0" w:evenVBand="0" w:oddHBand="0" w:evenHBand="0" w:firstRowFirstColumn="0" w:firstRowLastColumn="0" w:lastRowFirstColumn="0" w:lastRowLastColumn="0"/>
             </w:pPr>
             <w:r>
@@ -4191,6 +4246,8 @@
           </w:tcPr>
           <w:p>
             <w:pPr>
+              <w:ind w:firstLine="0"/>
+              <w:jc w:val="center"/>
               <w:cnfStyle w:val="000000000000" w:firstRow="0" w:lastRow="0" w:firstColumn="0" w:lastColumn="0" w:oddVBand="0" w:evenVBand="0" w:oddHBand="0" w:evenHBand="0" w:firstRowFirstColumn="0" w:firstRowLastColumn="0" w:lastRowFirstColumn="0" w:lastRowLastColumn="0"/>
             </w:pPr>
             <w:r>
@@ -4204,6 +4261,8 @@
           </w:tcPr>
           <w:p>
             <w:pPr>
+              <w:ind w:firstLine="0"/>
+              <w:jc w:val="center"/>
               <w:cnfStyle w:val="000000000000" w:firstRow="0" w:lastRow="0" w:firstColumn="0" w:lastColumn="0" w:oddVBand="0" w:evenVBand="0" w:oddHBand="0" w:evenHBand="0" w:firstRowFirstColumn="0" w:firstRowLastColumn="0" w:lastRowFirstColumn="0" w:lastRowLastColumn="0"/>
             </w:pPr>
             <w:r>
@@ -4219,6 +4278,9 @@
             <w:tcW w:w="708" w:type="dxa"/>
           </w:tcPr>
           <w:p>
+            <w:pPr>
+              <w:ind w:firstLine="0"/>
+            </w:pPr>
             <w:r>
               <w:t>6</w:t>
             </w:r>
@@ -4230,6 +4292,8 @@
           </w:tcPr>
           <w:p>
             <w:pPr>
+              <w:ind w:firstLine="0"/>
+              <w:jc w:val="center"/>
               <w:cnfStyle w:val="000000000000" w:firstRow="0" w:lastRow="0" w:firstColumn="0" w:lastColumn="0" w:oddVBand="0" w:evenVBand="0" w:oddHBand="0" w:evenHBand="0" w:firstRowFirstColumn="0" w:firstRowLastColumn="0" w:lastRowFirstColumn="0" w:lastRowLastColumn="0"/>
             </w:pPr>
             <w:r>
@@ -4243,6 +4307,8 @@
           </w:tcPr>
           <w:p>
             <w:pPr>
+              <w:ind w:firstLine="0"/>
+              <w:jc w:val="center"/>
               <w:cnfStyle w:val="000000000000" w:firstRow="0" w:lastRow="0" w:firstColumn="0" w:lastColumn="0" w:oddVBand="0" w:evenVBand="0" w:oddHBand="0" w:evenHBand="0" w:firstRowFirstColumn="0" w:firstRowLastColumn="0" w:lastRowFirstColumn="0" w:lastRowLastColumn="0"/>
             </w:pPr>
             <w:r>
@@ -4256,6 +4322,8 @@
           </w:tcPr>
           <w:p>
             <w:pPr>
+              <w:ind w:firstLine="0"/>
+              <w:jc w:val="center"/>
               <w:cnfStyle w:val="000000000000" w:firstRow="0" w:lastRow="0" w:firstColumn="0" w:lastColumn="0" w:oddVBand="0" w:evenVBand="0" w:oddHBand="0" w:evenHBand="0" w:firstRowFirstColumn="0" w:firstRowLastColumn="0" w:lastRowFirstColumn="0" w:lastRowLastColumn="0"/>
             </w:pPr>
             <w:r>
@@ -4269,6 +4337,8 @@
           </w:tcPr>
           <w:p>
             <w:pPr>
+              <w:ind w:firstLine="0"/>
+              <w:jc w:val="center"/>
               <w:cnfStyle w:val="000000000000" w:firstRow="0" w:lastRow="0" w:firstColumn="0" w:lastColumn="0" w:oddVBand="0" w:evenVBand="0" w:oddHBand="0" w:evenHBand="0" w:firstRowFirstColumn="0" w:firstRowLastColumn="0" w:lastRowFirstColumn="0" w:lastRowLastColumn="0"/>
             </w:pPr>
             <w:r>
@@ -4284,6 +4354,9 @@
             <w:tcW w:w="708" w:type="dxa"/>
           </w:tcPr>
           <w:p>
+            <w:pPr>
+              <w:ind w:firstLine="0"/>
+            </w:pPr>
             <w:r>
               <w:t>7</w:t>
             </w:r>
@@ -4295,6 +4368,8 @@
           </w:tcPr>
           <w:p>
             <w:pPr>
+              <w:ind w:firstLine="0"/>
+              <w:jc w:val="center"/>
               <w:cnfStyle w:val="000000000000" w:firstRow="0" w:lastRow="0" w:firstColumn="0" w:lastColumn="0" w:oddVBand="0" w:evenVBand="0" w:oddHBand="0" w:evenHBand="0" w:firstRowFirstColumn="0" w:firstRowLastColumn="0" w:lastRowFirstColumn="0" w:lastRowLastColumn="0"/>
             </w:pPr>
             <w:r>
@@ -4308,6 +4383,8 @@
           </w:tcPr>
           <w:p>
             <w:pPr>
+              <w:ind w:firstLine="0"/>
+              <w:jc w:val="center"/>
               <w:cnfStyle w:val="000000000000" w:firstRow="0" w:lastRow="0" w:firstColumn="0" w:lastColumn="0" w:oddVBand="0" w:evenVBand="0" w:oddHBand="0" w:evenHBand="0" w:firstRowFirstColumn="0" w:firstRowLastColumn="0" w:lastRowFirstColumn="0" w:lastRowLastColumn="0"/>
             </w:pPr>
             <w:r>
@@ -4321,6 +4398,8 @@
           </w:tcPr>
           <w:p>
             <w:pPr>
+              <w:ind w:firstLine="0"/>
+              <w:jc w:val="center"/>
               <w:cnfStyle w:val="000000000000" w:firstRow="0" w:lastRow="0" w:firstColumn="0" w:lastColumn="0" w:oddVBand="0" w:evenVBand="0" w:oddHBand="0" w:evenHBand="0" w:firstRowFirstColumn="0" w:firstRowLastColumn="0" w:lastRowFirstColumn="0" w:lastRowLastColumn="0"/>
             </w:pPr>
             <w:r>
@@ -4334,6 +4413,8 @@
           </w:tcPr>
           <w:p>
             <w:pPr>
+              <w:ind w:firstLine="0"/>
+              <w:jc w:val="center"/>
               <w:cnfStyle w:val="000000000000" w:firstRow="0" w:lastRow="0" w:firstColumn="0" w:lastColumn="0" w:oddVBand="0" w:evenVBand="0" w:oddHBand="0" w:evenHBand="0" w:firstRowFirstColumn="0" w:firstRowLastColumn="0" w:lastRowFirstColumn="0" w:lastRowLastColumn="0"/>
             </w:pPr>
             <w:r>
@@ -4349,6 +4430,9 @@
             <w:tcW w:w="708" w:type="dxa"/>
           </w:tcPr>
           <w:p>
+            <w:pPr>
+              <w:ind w:firstLine="0"/>
+            </w:pPr>
             <w:r>
               <w:t>8</w:t>
             </w:r>
@@ -4360,6 +4444,8 @@
           </w:tcPr>
           <w:p>
             <w:pPr>
+              <w:ind w:firstLine="0"/>
+              <w:jc w:val="center"/>
               <w:cnfStyle w:val="000000000000" w:firstRow="0" w:lastRow="0" w:firstColumn="0" w:lastColumn="0" w:oddVBand="0" w:evenVBand="0" w:oddHBand="0" w:evenHBand="0" w:firstRowFirstColumn="0" w:firstRowLastColumn="0" w:lastRowFirstColumn="0" w:lastRowLastColumn="0"/>
             </w:pPr>
             <w:r>
@@ -4373,6 +4459,8 @@
           </w:tcPr>
           <w:p>
             <w:pPr>
+              <w:ind w:firstLine="0"/>
+              <w:jc w:val="center"/>
               <w:cnfStyle w:val="000000000000" w:firstRow="0" w:lastRow="0" w:firstColumn="0" w:lastColumn="0" w:oddVBand="0" w:evenVBand="0" w:oddHBand="0" w:evenHBand="0" w:firstRowFirstColumn="0" w:firstRowLastColumn="0" w:lastRowFirstColumn="0" w:lastRowLastColumn="0"/>
             </w:pPr>
             <w:r>
@@ -4386,6 +4474,8 @@
           </w:tcPr>
           <w:p>
             <w:pPr>
+              <w:ind w:firstLine="0"/>
+              <w:jc w:val="center"/>
               <w:cnfStyle w:val="000000000000" w:firstRow="0" w:lastRow="0" w:firstColumn="0" w:lastColumn="0" w:oddVBand="0" w:evenVBand="0" w:oddHBand="0" w:evenHBand="0" w:firstRowFirstColumn="0" w:firstRowLastColumn="0" w:lastRowFirstColumn="0" w:lastRowLastColumn="0"/>
             </w:pPr>
             <w:r>
@@ -4399,6 +4489,8 @@
           </w:tcPr>
           <w:p>
             <w:pPr>
+              <w:ind w:firstLine="0"/>
+              <w:jc w:val="center"/>
               <w:cnfStyle w:val="000000000000" w:firstRow="0" w:lastRow="0" w:firstColumn="0" w:lastColumn="0" w:oddVBand="0" w:evenVBand="0" w:oddHBand="0" w:evenHBand="0" w:firstRowFirstColumn="0" w:firstRowLastColumn="0" w:lastRowFirstColumn="0" w:lastRowLastColumn="0"/>
             </w:pPr>
             <w:r>
@@ -4414,6 +4506,9 @@
             <w:tcW w:w="708" w:type="dxa"/>
           </w:tcPr>
           <w:p>
+            <w:pPr>
+              <w:ind w:firstLine="0"/>
+            </w:pPr>
             <w:r>
               <w:t>9</w:t>
             </w:r>
@@ -4425,6 +4520,8 @@
           </w:tcPr>
           <w:p>
             <w:pPr>
+              <w:ind w:firstLine="0"/>
+              <w:jc w:val="center"/>
               <w:cnfStyle w:val="000000000000" w:firstRow="0" w:lastRow="0" w:firstColumn="0" w:lastColumn="0" w:oddVBand="0" w:evenVBand="0" w:oddHBand="0" w:evenHBand="0" w:firstRowFirstColumn="0" w:firstRowLastColumn="0" w:lastRowFirstColumn="0" w:lastRowLastColumn="0"/>
             </w:pPr>
             <w:r>
@@ -4438,6 +4535,8 @@
           </w:tcPr>
           <w:p>
             <w:pPr>
+              <w:ind w:firstLine="0"/>
+              <w:jc w:val="center"/>
               <w:cnfStyle w:val="000000000000" w:firstRow="0" w:lastRow="0" w:firstColumn="0" w:lastColumn="0" w:oddVBand="0" w:evenVBand="0" w:oddHBand="0" w:evenHBand="0" w:firstRowFirstColumn="0" w:firstRowLastColumn="0" w:lastRowFirstColumn="0" w:lastRowLastColumn="0"/>
             </w:pPr>
             <w:r>
@@ -4451,6 +4550,8 @@
           </w:tcPr>
           <w:p>
             <w:pPr>
+              <w:ind w:firstLine="0"/>
+              <w:jc w:val="center"/>
               <w:cnfStyle w:val="000000000000" w:firstRow="0" w:lastRow="0" w:firstColumn="0" w:lastColumn="0" w:oddVBand="0" w:evenVBand="0" w:oddHBand="0" w:evenHBand="0" w:firstRowFirstColumn="0" w:firstRowLastColumn="0" w:lastRowFirstColumn="0" w:lastRowLastColumn="0"/>
             </w:pPr>
             <w:r>
@@ -4464,6 +4565,8 @@
           </w:tcPr>
           <w:p>
             <w:pPr>
+              <w:ind w:firstLine="0"/>
+              <w:jc w:val="center"/>
               <w:cnfStyle w:val="000000000000" w:firstRow="0" w:lastRow="0" w:firstColumn="0" w:lastColumn="0" w:oddVBand="0" w:evenVBand="0" w:oddHBand="0" w:evenHBand="0" w:firstRowFirstColumn="0" w:firstRowLastColumn="0" w:lastRowFirstColumn="0" w:lastRowLastColumn="0"/>
             </w:pPr>
             <w:r>
@@ -4479,8 +4582,17 @@
             <w:tcW w:w="708" w:type="dxa"/>
           </w:tcPr>
           <w:p>
-            <w:r>
-              <w:t>10</w:t>
+            <w:pPr>
+              <w:ind w:firstLine="0"/>
+            </w:pPr>
+            <w:r>
+              <w:rPr>
+                <w:lang w:val="en-US"/>
+              </w:rPr>
+              <w:t>1</w:t>
+            </w:r>
+            <w:r>
+              <w:t>0</w:t>
             </w:r>
           </w:p>
         </w:tc>
@@ -4490,6 +4602,8 @@
           </w:tcPr>
           <w:p>
             <w:pPr>
+              <w:ind w:firstLine="0"/>
+              <w:jc w:val="center"/>
               <w:cnfStyle w:val="000000000000" w:firstRow="0" w:lastRow="0" w:firstColumn="0" w:lastColumn="0" w:oddVBand="0" w:evenVBand="0" w:oddHBand="0" w:evenHBand="0" w:firstRowFirstColumn="0" w:firstRowLastColumn="0" w:lastRowFirstColumn="0" w:lastRowLastColumn="0"/>
             </w:pPr>
             <w:r>
@@ -4503,6 +4617,8 @@
           </w:tcPr>
           <w:p>
             <w:pPr>
+              <w:ind w:firstLine="0"/>
+              <w:jc w:val="center"/>
               <w:cnfStyle w:val="000000000000" w:firstRow="0" w:lastRow="0" w:firstColumn="0" w:lastColumn="0" w:oddVBand="0" w:evenVBand="0" w:oddHBand="0" w:evenHBand="0" w:firstRowFirstColumn="0" w:firstRowLastColumn="0" w:lastRowFirstColumn="0" w:lastRowLastColumn="0"/>
             </w:pPr>
             <w:r>
@@ -4516,6 +4632,8 @@
           </w:tcPr>
           <w:p>
             <w:pPr>
+              <w:ind w:firstLine="0"/>
+              <w:jc w:val="center"/>
               <w:cnfStyle w:val="000000000000" w:firstRow="0" w:lastRow="0" w:firstColumn="0" w:lastColumn="0" w:oddVBand="0" w:evenVBand="0" w:oddHBand="0" w:evenHBand="0" w:firstRowFirstColumn="0" w:firstRowLastColumn="0" w:lastRowFirstColumn="0" w:lastRowLastColumn="0"/>
             </w:pPr>
             <w:r>
@@ -4529,6 +4647,8 @@
           </w:tcPr>
           <w:p>
             <w:pPr>
+              <w:ind w:firstLine="0"/>
+              <w:jc w:val="center"/>
               <w:cnfStyle w:val="000000000000" w:firstRow="0" w:lastRow="0" w:firstColumn="0" w:lastColumn="0" w:oddVBand="0" w:evenVBand="0" w:oddHBand="0" w:evenHBand="0" w:firstRowFirstColumn="0" w:firstRowLastColumn="0" w:lastRowFirstColumn="0" w:lastRowLastColumn="0"/>
             </w:pPr>
             <w:r>
@@ -4544,8 +4664,20 @@
             <w:tcW w:w="708" w:type="dxa"/>
           </w:tcPr>
           <w:p>
-            <w:r>
-              <w:t>11</w:t>
+            <w:pPr>
+              <w:ind w:firstLine="0"/>
+              <w:rPr>
+                <w:lang w:val="en-US"/>
+              </w:rPr>
+            </w:pPr>
+            <w:r>
+              <w:t>1</w:t>
+            </w:r>
+            <w:r>
+              <w:rPr>
+                <w:lang w:val="en-US"/>
+              </w:rPr>
+              <w:t>1</w:t>
             </w:r>
           </w:p>
         </w:tc>
@@ -4555,6 +4687,8 @@
           </w:tcPr>
           <w:p>
             <w:pPr>
+              <w:ind w:firstLine="0"/>
+              <w:jc w:val="center"/>
               <w:cnfStyle w:val="000000000000" w:firstRow="0" w:lastRow="0" w:firstColumn="0" w:lastColumn="0" w:oddVBand="0" w:evenVBand="0" w:oddHBand="0" w:evenHBand="0" w:firstRowFirstColumn="0" w:firstRowLastColumn="0" w:lastRowFirstColumn="0" w:lastRowLastColumn="0"/>
             </w:pPr>
             <w:r>
@@ -4568,6 +4702,8 @@
           </w:tcPr>
           <w:p>
             <w:pPr>
+              <w:ind w:firstLine="0"/>
+              <w:jc w:val="center"/>
               <w:cnfStyle w:val="000000000000" w:firstRow="0" w:lastRow="0" w:firstColumn="0" w:lastColumn="0" w:oddVBand="0" w:evenVBand="0" w:oddHBand="0" w:evenHBand="0" w:firstRowFirstColumn="0" w:firstRowLastColumn="0" w:lastRowFirstColumn="0" w:lastRowLastColumn="0"/>
             </w:pPr>
             <w:r>
@@ -4581,6 +4717,8 @@
           </w:tcPr>
           <w:p>
             <w:pPr>
+              <w:ind w:firstLine="0"/>
+              <w:jc w:val="center"/>
               <w:cnfStyle w:val="000000000000" w:firstRow="0" w:lastRow="0" w:firstColumn="0" w:lastColumn="0" w:oddVBand="0" w:evenVBand="0" w:oddHBand="0" w:evenHBand="0" w:firstRowFirstColumn="0" w:firstRowLastColumn="0" w:lastRowFirstColumn="0" w:lastRowLastColumn="0"/>
             </w:pPr>
             <w:r>
@@ -4594,6 +4732,8 @@
           </w:tcPr>
           <w:p>
             <w:pPr>
+              <w:ind w:firstLine="0"/>
+              <w:jc w:val="center"/>
               <w:cnfStyle w:val="000000000000" w:firstRow="0" w:lastRow="0" w:firstColumn="0" w:lastColumn="0" w:oddVBand="0" w:evenVBand="0" w:oddHBand="0" w:evenHBand="0" w:firstRowFirstColumn="0" w:firstRowLastColumn="0" w:lastRowFirstColumn="0" w:lastRowLastColumn="0"/>
             </w:pPr>
             <w:r>
@@ -4608,7 +4748,6 @@
         <w:pStyle w:val="Heading3"/>
       </w:pPr>
       <w:r>
-        <w:lastRenderedPageBreak/>
         <w:t>Quản lý đơn vị vận chuyển</w:t>
       </w:r>
     </w:p>
@@ -4638,8 +4777,18 @@
             <w:vAlign w:val="top"/>
           </w:tcPr>
           <w:p>
-            <w:r>
-              <w:t>STT</w:t>
+            <w:pPr>
+              <w:ind w:firstLine="0"/>
+              <w:jc w:val="left"/>
+            </w:pPr>
+            <w:r>
+              <w:rPr>
+                <w:lang w:val="en-US"/>
+              </w:rPr>
+              <w:t>S</w:t>
+            </w:r>
+            <w:r>
+              <w:t>TT</w:t>
             </w:r>
           </w:p>
         </w:tc>
@@ -4650,6 +4799,8 @@
           </w:tcPr>
           <w:p>
             <w:pPr>
+              <w:ind w:firstLine="0"/>
+              <w:jc w:val="left"/>
               <w:cnfStyle w:val="100000000000" w:firstRow="1" w:lastRow="0" w:firstColumn="0" w:lastColumn="0" w:oddVBand="0" w:evenVBand="0" w:oddHBand="0" w:evenHBand="0" w:firstRowFirstColumn="0" w:firstRowLastColumn="0" w:lastRowFirstColumn="0" w:lastRowLastColumn="0"/>
             </w:pPr>
             <w:r>
@@ -4664,6 +4815,8 @@
           </w:tcPr>
           <w:p>
             <w:pPr>
+              <w:ind w:firstLine="0"/>
+              <w:jc w:val="left"/>
               <w:cnfStyle w:val="100000000000" w:firstRow="1" w:lastRow="0" w:firstColumn="0" w:lastColumn="0" w:oddVBand="0" w:evenVBand="0" w:oddHBand="0" w:evenHBand="0" w:firstRowFirstColumn="0" w:firstRowLastColumn="0" w:lastRowFirstColumn="0" w:lastRowLastColumn="0"/>
             </w:pPr>
             <w:r>
@@ -4678,6 +4831,8 @@
           </w:tcPr>
           <w:p>
             <w:pPr>
+              <w:ind w:firstLine="0"/>
+              <w:jc w:val="left"/>
               <w:cnfStyle w:val="100000000000" w:firstRow="1" w:lastRow="0" w:firstColumn="0" w:lastColumn="0" w:oddVBand="0" w:evenVBand="0" w:oddHBand="0" w:evenHBand="0" w:firstRowFirstColumn="0" w:firstRowLastColumn="0" w:lastRowFirstColumn="0" w:lastRowLastColumn="0"/>
             </w:pPr>
             <w:r>
@@ -4692,6 +4847,8 @@
           </w:tcPr>
           <w:p>
             <w:pPr>
+              <w:ind w:firstLine="0"/>
+              <w:jc w:val="left"/>
               <w:cnfStyle w:val="100000000000" w:firstRow="1" w:lastRow="0" w:firstColumn="0" w:lastColumn="0" w:oddVBand="0" w:evenVBand="0" w:oddHBand="0" w:evenHBand="0" w:firstRowFirstColumn="0" w:firstRowLastColumn="0" w:lastRowFirstColumn="0" w:lastRowLastColumn="0"/>
             </w:pPr>
             <w:r>
@@ -4712,6 +4869,10 @@
             <w:vAlign w:val="top"/>
           </w:tcPr>
           <w:p>
+            <w:pPr>
+              <w:ind w:firstLine="0"/>
+              <w:jc w:val="left"/>
+            </w:pPr>
             <w:r>
               <w:t>1</w:t>
             </w:r>
@@ -4724,6 +4885,8 @@
           </w:tcPr>
           <w:p>
             <w:pPr>
+              <w:ind w:firstLine="0"/>
+              <w:jc w:val="left"/>
               <w:cnfStyle w:val="100000000000" w:firstRow="1" w:lastRow="0" w:firstColumn="0" w:lastColumn="0" w:oddVBand="0" w:evenVBand="0" w:oddHBand="0" w:evenHBand="0" w:firstRowFirstColumn="0" w:firstRowLastColumn="0" w:lastRowFirstColumn="0" w:lastRowLastColumn="0"/>
             </w:pPr>
             <w:r>
@@ -4786,6 +4949,10 @@
             <w:vAlign w:val="top"/>
           </w:tcPr>
           <w:p>
+            <w:pPr>
+              <w:ind w:firstLine="0"/>
+              <w:jc w:val="left"/>
+            </w:pPr>
             <w:r>
               <w:t>2</w:t>
             </w:r>
@@ -4860,6 +5027,10 @@
             <w:vAlign w:val="top"/>
           </w:tcPr>
           <w:p>
+            <w:pPr>
+              <w:ind w:firstLine="0"/>
+              <w:jc w:val="left"/>
+            </w:pPr>
             <w:r>
               <w:t>3</w:t>
             </w:r>
@@ -4928,6 +5099,7 @@
         <w:pStyle w:val="Heading3"/>
       </w:pPr>
       <w:r>
+        <w:lastRenderedPageBreak/>
         <w:t>Quản lý sản phẩm</w:t>
       </w:r>
     </w:p>
@@ -4954,21 +5126,29 @@
           <w:tcPr>
             <w:cnfStyle w:val="001000000000" w:firstRow="0" w:lastRow="0" w:firstColumn="1" w:lastColumn="0" w:oddVBand="0" w:evenVBand="0" w:oddHBand="0" w:evenHBand="0" w:firstRowFirstColumn="0" w:firstRowLastColumn="0" w:lastRowFirstColumn="0" w:lastRowLastColumn="0"/>
             <w:tcW w:w="692" w:type="dxa"/>
-            <w:vAlign w:val="top"/>
-          </w:tcPr>
-          <w:p>
-            <w:r>
-              <w:t>STT</w:t>
+          </w:tcPr>
+          <w:p>
+            <w:pPr>
+              <w:ind w:firstLine="0"/>
+            </w:pPr>
+            <w:r>
+              <w:rPr>
+                <w:lang w:val="en-US"/>
+              </w:rPr>
+              <w:t>S</w:t>
+            </w:r>
+            <w:r>
+              <w:t>TT</w:t>
             </w:r>
           </w:p>
         </w:tc>
         <w:tc>
           <w:tcPr>
             <w:tcW w:w="1780" w:type="dxa"/>
-            <w:vAlign w:val="top"/>
-          </w:tcPr>
-          <w:p>
-            <w:pPr>
+          </w:tcPr>
+          <w:p>
+            <w:pPr>
+              <w:ind w:firstLine="0"/>
               <w:cnfStyle w:val="100000000000" w:firstRow="1" w:lastRow="0" w:firstColumn="0" w:lastColumn="0" w:oddVBand="0" w:evenVBand="0" w:oddHBand="0" w:evenHBand="0" w:firstRowFirstColumn="0" w:firstRowLastColumn="0" w:lastRowFirstColumn="0" w:lastRowLastColumn="0"/>
             </w:pPr>
             <w:r>
@@ -4979,10 +5159,10 @@
         <w:tc>
           <w:tcPr>
             <w:tcW w:w="1492" w:type="dxa"/>
-            <w:vAlign w:val="top"/>
-          </w:tcPr>
-          <w:p>
-            <w:pPr>
+          </w:tcPr>
+          <w:p>
+            <w:pPr>
+              <w:ind w:firstLine="0"/>
               <w:cnfStyle w:val="100000000000" w:firstRow="1" w:lastRow="0" w:firstColumn="0" w:lastColumn="0" w:oddVBand="0" w:evenVBand="0" w:oddHBand="0" w:evenHBand="0" w:firstRowFirstColumn="0" w:firstRowLastColumn="0" w:lastRowFirstColumn="0" w:lastRowLastColumn="0"/>
             </w:pPr>
             <w:r>
@@ -4993,10 +5173,10 @@
         <w:tc>
           <w:tcPr>
             <w:tcW w:w="2268" w:type="dxa"/>
-            <w:vAlign w:val="top"/>
-          </w:tcPr>
-          <w:p>
-            <w:pPr>
+          </w:tcPr>
+          <w:p>
+            <w:pPr>
+              <w:ind w:firstLine="0"/>
               <w:cnfStyle w:val="100000000000" w:firstRow="1" w:lastRow="0" w:firstColumn="0" w:lastColumn="0" w:oddVBand="0" w:evenVBand="0" w:oddHBand="0" w:evenHBand="0" w:firstRowFirstColumn="0" w:firstRowLastColumn="0" w:lastRowFirstColumn="0" w:lastRowLastColumn="0"/>
             </w:pPr>
             <w:r>
@@ -5007,10 +5187,10 @@
         <w:tc>
           <w:tcPr>
             <w:tcW w:w="2546" w:type="dxa"/>
-            <w:vAlign w:val="top"/>
-          </w:tcPr>
-          <w:p>
-            <w:pPr>
+          </w:tcPr>
+          <w:p>
+            <w:pPr>
+              <w:ind w:firstLine="0"/>
               <w:cnfStyle w:val="100000000000" w:firstRow="1" w:lastRow="0" w:firstColumn="0" w:lastColumn="0" w:oddVBand="0" w:evenVBand="0" w:oddHBand="0" w:evenHBand="0" w:firstRowFirstColumn="0" w:firstRowLastColumn="0" w:lastRowFirstColumn="0" w:lastRowLastColumn="0"/>
             </w:pPr>
             <w:r>
@@ -5024,9 +5204,11 @@
           <w:tcPr>
             <w:cnfStyle w:val="001000000000" w:firstRow="0" w:lastRow="0" w:firstColumn="1" w:lastColumn="0" w:oddVBand="0" w:evenVBand="0" w:oddHBand="0" w:evenHBand="0" w:firstRowFirstColumn="0" w:firstRowLastColumn="0" w:lastRowFirstColumn="0" w:lastRowLastColumn="0"/>
             <w:tcW w:w="692" w:type="dxa"/>
-            <w:vAlign w:val="top"/>
-          </w:tcPr>
-          <w:p>
+          </w:tcPr>
+          <w:p>
+            <w:pPr>
+              <w:ind w:firstLine="0"/>
+            </w:pPr>
             <w:r>
               <w:t>1</w:t>
             </w:r>
@@ -5035,10 +5217,11 @@
         <w:tc>
           <w:tcPr>
             <w:tcW w:w="1780" w:type="dxa"/>
-            <w:vAlign w:val="top"/>
-          </w:tcPr>
-          <w:p>
-            <w:pPr>
+          </w:tcPr>
+          <w:p>
+            <w:pPr>
+              <w:ind w:firstLine="0"/>
+              <w:jc w:val="center"/>
               <w:cnfStyle w:val="000000000000" w:firstRow="0" w:lastRow="0" w:firstColumn="0" w:lastColumn="0" w:oddVBand="0" w:evenVBand="0" w:oddHBand="0" w:evenHBand="0" w:firstRowFirstColumn="0" w:firstRowLastColumn="0" w:lastRowFirstColumn="0" w:lastRowLastColumn="0"/>
             </w:pPr>
             <w:r>
@@ -5049,10 +5232,11 @@
         <w:tc>
           <w:tcPr>
             <w:tcW w:w="1492" w:type="dxa"/>
-            <w:vAlign w:val="top"/>
-          </w:tcPr>
-          <w:p>
-            <w:pPr>
+          </w:tcPr>
+          <w:p>
+            <w:pPr>
+              <w:ind w:firstLine="0"/>
+              <w:jc w:val="center"/>
               <w:cnfStyle w:val="000000000000" w:firstRow="0" w:lastRow="0" w:firstColumn="0" w:lastColumn="0" w:oddVBand="0" w:evenVBand="0" w:oddHBand="0" w:evenHBand="0" w:firstRowFirstColumn="0" w:firstRowLastColumn="0" w:lastRowFirstColumn="0" w:lastRowLastColumn="0"/>
             </w:pPr>
             <w:r>
@@ -5063,10 +5247,11 @@
         <w:tc>
           <w:tcPr>
             <w:tcW w:w="2268" w:type="dxa"/>
-            <w:vAlign w:val="top"/>
-          </w:tcPr>
-          <w:p>
-            <w:pPr>
+          </w:tcPr>
+          <w:p>
+            <w:pPr>
+              <w:ind w:firstLine="0"/>
+              <w:jc w:val="center"/>
               <w:cnfStyle w:val="000000000000" w:firstRow="0" w:lastRow="0" w:firstColumn="0" w:lastColumn="0" w:oddVBand="0" w:evenVBand="0" w:oddHBand="0" w:evenHBand="0" w:firstRowFirstColumn="0" w:firstRowLastColumn="0" w:lastRowFirstColumn="0" w:lastRowLastColumn="0"/>
             </w:pPr>
             <w:r>
@@ -5077,10 +5262,11 @@
         <w:tc>
           <w:tcPr>
             <w:tcW w:w="2546" w:type="dxa"/>
-            <w:vAlign w:val="top"/>
-          </w:tcPr>
-          <w:p>
-            <w:pPr>
+          </w:tcPr>
+          <w:p>
+            <w:pPr>
+              <w:ind w:firstLine="0"/>
+              <w:jc w:val="center"/>
               <w:cnfStyle w:val="000000000000" w:firstRow="0" w:lastRow="0" w:firstColumn="0" w:lastColumn="0" w:oddVBand="0" w:evenVBand="0" w:oddHBand="0" w:evenHBand="0" w:firstRowFirstColumn="0" w:firstRowLastColumn="0" w:lastRowFirstColumn="0" w:lastRowLastColumn="0"/>
             </w:pPr>
             <w:r>
@@ -5094,9 +5280,11 @@
           <w:tcPr>
             <w:cnfStyle w:val="001000000000" w:firstRow="0" w:lastRow="0" w:firstColumn="1" w:lastColumn="0" w:oddVBand="0" w:evenVBand="0" w:oddHBand="0" w:evenHBand="0" w:firstRowFirstColumn="0" w:firstRowLastColumn="0" w:lastRowFirstColumn="0" w:lastRowLastColumn="0"/>
             <w:tcW w:w="692" w:type="dxa"/>
-            <w:vAlign w:val="top"/>
-          </w:tcPr>
-          <w:p>
+          </w:tcPr>
+          <w:p>
+            <w:pPr>
+              <w:ind w:firstLine="0"/>
+            </w:pPr>
             <w:r>
               <w:t>2</w:t>
             </w:r>
@@ -5105,10 +5293,11 @@
         <w:tc>
           <w:tcPr>
             <w:tcW w:w="1780" w:type="dxa"/>
-            <w:vAlign w:val="top"/>
-          </w:tcPr>
-          <w:p>
-            <w:pPr>
+          </w:tcPr>
+          <w:p>
+            <w:pPr>
+              <w:ind w:firstLine="0"/>
+              <w:jc w:val="center"/>
               <w:cnfStyle w:val="000000000000" w:firstRow="0" w:lastRow="0" w:firstColumn="0" w:lastColumn="0" w:oddVBand="0" w:evenVBand="0" w:oddHBand="0" w:evenHBand="0" w:firstRowFirstColumn="0" w:firstRowLastColumn="0" w:lastRowFirstColumn="0" w:lastRowLastColumn="0"/>
             </w:pPr>
             <w:r>
@@ -5119,10 +5308,11 @@
         <w:tc>
           <w:tcPr>
             <w:tcW w:w="1492" w:type="dxa"/>
-            <w:vAlign w:val="top"/>
-          </w:tcPr>
-          <w:p>
-            <w:pPr>
+          </w:tcPr>
+          <w:p>
+            <w:pPr>
+              <w:ind w:firstLine="0"/>
+              <w:jc w:val="center"/>
               <w:cnfStyle w:val="000000000000" w:firstRow="0" w:lastRow="0" w:firstColumn="0" w:lastColumn="0" w:oddVBand="0" w:evenVBand="0" w:oddHBand="0" w:evenHBand="0" w:firstRowFirstColumn="0" w:firstRowLastColumn="0" w:lastRowFirstColumn="0" w:lastRowLastColumn="0"/>
             </w:pPr>
             <w:r>
@@ -5133,10 +5323,11 @@
         <w:tc>
           <w:tcPr>
             <w:tcW w:w="2268" w:type="dxa"/>
-            <w:vAlign w:val="top"/>
-          </w:tcPr>
-          <w:p>
-            <w:pPr>
+          </w:tcPr>
+          <w:p>
+            <w:pPr>
+              <w:ind w:firstLine="0"/>
+              <w:jc w:val="center"/>
               <w:cnfStyle w:val="000000000000" w:firstRow="0" w:lastRow="0" w:firstColumn="0" w:lastColumn="0" w:oddVBand="0" w:evenVBand="0" w:oddHBand="0" w:evenHBand="0" w:firstRowFirstColumn="0" w:firstRowLastColumn="0" w:lastRowFirstColumn="0" w:lastRowLastColumn="0"/>
             </w:pPr>
             <w:r>
@@ -5147,10 +5338,11 @@
         <w:tc>
           <w:tcPr>
             <w:tcW w:w="2546" w:type="dxa"/>
-            <w:vAlign w:val="top"/>
-          </w:tcPr>
-          <w:p>
-            <w:pPr>
+          </w:tcPr>
+          <w:p>
+            <w:pPr>
+              <w:ind w:firstLine="0"/>
+              <w:jc w:val="center"/>
               <w:cnfStyle w:val="000000000000" w:firstRow="0" w:lastRow="0" w:firstColumn="0" w:lastColumn="0" w:oddVBand="0" w:evenVBand="0" w:oddHBand="0" w:evenHBand="0" w:firstRowFirstColumn="0" w:firstRowLastColumn="0" w:lastRowFirstColumn="0" w:lastRowLastColumn="0"/>
             </w:pPr>
             <w:r>
@@ -5164,9 +5356,11 @@
           <w:tcPr>
             <w:cnfStyle w:val="001000000000" w:firstRow="0" w:lastRow="0" w:firstColumn="1" w:lastColumn="0" w:oddVBand="0" w:evenVBand="0" w:oddHBand="0" w:evenHBand="0" w:firstRowFirstColumn="0" w:firstRowLastColumn="0" w:lastRowFirstColumn="0" w:lastRowLastColumn="0"/>
             <w:tcW w:w="692" w:type="dxa"/>
-            <w:vAlign w:val="top"/>
-          </w:tcPr>
-          <w:p>
+          </w:tcPr>
+          <w:p>
+            <w:pPr>
+              <w:ind w:firstLine="0"/>
+            </w:pPr>
             <w:r>
               <w:t>3</w:t>
             </w:r>
@@ -5175,10 +5369,11 @@
         <w:tc>
           <w:tcPr>
             <w:tcW w:w="1780" w:type="dxa"/>
-            <w:vAlign w:val="top"/>
-          </w:tcPr>
-          <w:p>
-            <w:pPr>
+          </w:tcPr>
+          <w:p>
+            <w:pPr>
+              <w:ind w:firstLine="0"/>
+              <w:jc w:val="center"/>
               <w:cnfStyle w:val="000000000000" w:firstRow="0" w:lastRow="0" w:firstColumn="0" w:lastColumn="0" w:oddVBand="0" w:evenVBand="0" w:oddHBand="0" w:evenHBand="0" w:firstRowFirstColumn="0" w:firstRowLastColumn="0" w:lastRowFirstColumn="0" w:lastRowLastColumn="0"/>
             </w:pPr>
             <w:r>
@@ -5189,10 +5384,11 @@
         <w:tc>
           <w:tcPr>
             <w:tcW w:w="1492" w:type="dxa"/>
-            <w:vAlign w:val="top"/>
-          </w:tcPr>
-          <w:p>
-            <w:pPr>
+          </w:tcPr>
+          <w:p>
+            <w:pPr>
+              <w:ind w:firstLine="0"/>
+              <w:jc w:val="center"/>
               <w:cnfStyle w:val="000000000000" w:firstRow="0" w:lastRow="0" w:firstColumn="0" w:lastColumn="0" w:oddVBand="0" w:evenVBand="0" w:oddHBand="0" w:evenHBand="0" w:firstRowFirstColumn="0" w:firstRowLastColumn="0" w:lastRowFirstColumn="0" w:lastRowLastColumn="0"/>
             </w:pPr>
             <w:r>
@@ -5203,10 +5399,11 @@
         <w:tc>
           <w:tcPr>
             <w:tcW w:w="2268" w:type="dxa"/>
-            <w:vAlign w:val="top"/>
-          </w:tcPr>
-          <w:p>
-            <w:pPr>
+          </w:tcPr>
+          <w:p>
+            <w:pPr>
+              <w:ind w:firstLine="0"/>
+              <w:jc w:val="center"/>
               <w:cnfStyle w:val="000000000000" w:firstRow="0" w:lastRow="0" w:firstColumn="0" w:lastColumn="0" w:oddVBand="0" w:evenVBand="0" w:oddHBand="0" w:evenHBand="0" w:firstRowFirstColumn="0" w:firstRowLastColumn="0" w:lastRowFirstColumn="0" w:lastRowLastColumn="0"/>
             </w:pPr>
             <w:r>
@@ -5217,10 +5414,11 @@
         <w:tc>
           <w:tcPr>
             <w:tcW w:w="2546" w:type="dxa"/>
-            <w:vAlign w:val="top"/>
-          </w:tcPr>
-          <w:p>
-            <w:pPr>
+          </w:tcPr>
+          <w:p>
+            <w:pPr>
+              <w:ind w:firstLine="0"/>
+              <w:jc w:val="center"/>
               <w:cnfStyle w:val="000000000000" w:firstRow="0" w:lastRow="0" w:firstColumn="0" w:lastColumn="0" w:oddVBand="0" w:evenVBand="0" w:oddHBand="0" w:evenHBand="0" w:firstRowFirstColumn="0" w:firstRowLastColumn="0" w:lastRowFirstColumn="0" w:lastRowLastColumn="0"/>
             </w:pPr>
             <w:r>
@@ -5234,9 +5432,11 @@
           <w:tcPr>
             <w:cnfStyle w:val="001000000000" w:firstRow="0" w:lastRow="0" w:firstColumn="1" w:lastColumn="0" w:oddVBand="0" w:evenVBand="0" w:oddHBand="0" w:evenHBand="0" w:firstRowFirstColumn="0" w:firstRowLastColumn="0" w:lastRowFirstColumn="0" w:lastRowLastColumn="0"/>
             <w:tcW w:w="692" w:type="dxa"/>
-            <w:vAlign w:val="top"/>
-          </w:tcPr>
-          <w:p>
+          </w:tcPr>
+          <w:p>
+            <w:pPr>
+              <w:ind w:firstLine="0"/>
+            </w:pPr>
             <w:r>
               <w:t>4</w:t>
             </w:r>
@@ -5245,10 +5445,11 @@
         <w:tc>
           <w:tcPr>
             <w:tcW w:w="1780" w:type="dxa"/>
-            <w:vAlign w:val="top"/>
-          </w:tcPr>
-          <w:p>
-            <w:pPr>
+          </w:tcPr>
+          <w:p>
+            <w:pPr>
+              <w:ind w:firstLine="0"/>
+              <w:jc w:val="center"/>
               <w:cnfStyle w:val="000000000000" w:firstRow="0" w:lastRow="0" w:firstColumn="0" w:lastColumn="0" w:oddVBand="0" w:evenVBand="0" w:oddHBand="0" w:evenHBand="0" w:firstRowFirstColumn="0" w:firstRowLastColumn="0" w:lastRowFirstColumn="0" w:lastRowLastColumn="0"/>
             </w:pPr>
             <w:r>
@@ -5259,10 +5460,11 @@
         <w:tc>
           <w:tcPr>
             <w:tcW w:w="1492" w:type="dxa"/>
-            <w:vAlign w:val="top"/>
-          </w:tcPr>
-          <w:p>
-            <w:pPr>
+          </w:tcPr>
+          <w:p>
+            <w:pPr>
+              <w:ind w:firstLine="0"/>
+              <w:jc w:val="center"/>
               <w:cnfStyle w:val="000000000000" w:firstRow="0" w:lastRow="0" w:firstColumn="0" w:lastColumn="0" w:oddVBand="0" w:evenVBand="0" w:oddHBand="0" w:evenHBand="0" w:firstRowFirstColumn="0" w:firstRowLastColumn="0" w:lastRowFirstColumn="0" w:lastRowLastColumn="0"/>
             </w:pPr>
             <w:r>
@@ -5273,10 +5475,11 @@
         <w:tc>
           <w:tcPr>
             <w:tcW w:w="2268" w:type="dxa"/>
-            <w:vAlign w:val="top"/>
-          </w:tcPr>
-          <w:p>
-            <w:pPr>
+          </w:tcPr>
+          <w:p>
+            <w:pPr>
+              <w:ind w:firstLine="0"/>
+              <w:jc w:val="center"/>
               <w:cnfStyle w:val="000000000000" w:firstRow="0" w:lastRow="0" w:firstColumn="0" w:lastColumn="0" w:oddVBand="0" w:evenVBand="0" w:oddHBand="0" w:evenHBand="0" w:firstRowFirstColumn="0" w:firstRowLastColumn="0" w:lastRowFirstColumn="0" w:lastRowLastColumn="0"/>
             </w:pPr>
             <w:r>
@@ -5287,10 +5490,11 @@
         <w:tc>
           <w:tcPr>
             <w:tcW w:w="2546" w:type="dxa"/>
-            <w:vAlign w:val="top"/>
-          </w:tcPr>
-          <w:p>
-            <w:pPr>
+          </w:tcPr>
+          <w:p>
+            <w:pPr>
+              <w:ind w:firstLine="0"/>
+              <w:jc w:val="center"/>
               <w:cnfStyle w:val="000000000000" w:firstRow="0" w:lastRow="0" w:firstColumn="0" w:lastColumn="0" w:oddVBand="0" w:evenVBand="0" w:oddHBand="0" w:evenHBand="0" w:firstRowFirstColumn="0" w:firstRowLastColumn="0" w:lastRowFirstColumn="0" w:lastRowLastColumn="0"/>
             </w:pPr>
             <w:r>
@@ -5304,9 +5508,11 @@
           <w:tcPr>
             <w:cnfStyle w:val="001000000000" w:firstRow="0" w:lastRow="0" w:firstColumn="1" w:lastColumn="0" w:oddVBand="0" w:evenVBand="0" w:oddHBand="0" w:evenHBand="0" w:firstRowFirstColumn="0" w:firstRowLastColumn="0" w:lastRowFirstColumn="0" w:lastRowLastColumn="0"/>
             <w:tcW w:w="692" w:type="dxa"/>
-            <w:vAlign w:val="top"/>
-          </w:tcPr>
-          <w:p>
+          </w:tcPr>
+          <w:p>
+            <w:pPr>
+              <w:ind w:firstLine="0"/>
+            </w:pPr>
             <w:r>
               <w:t>5</w:t>
             </w:r>
@@ -5315,10 +5521,11 @@
         <w:tc>
           <w:tcPr>
             <w:tcW w:w="1780" w:type="dxa"/>
-            <w:vAlign w:val="top"/>
-          </w:tcPr>
-          <w:p>
-            <w:pPr>
+          </w:tcPr>
+          <w:p>
+            <w:pPr>
+              <w:ind w:firstLine="0"/>
+              <w:jc w:val="center"/>
               <w:cnfStyle w:val="000000000000" w:firstRow="0" w:lastRow="0" w:firstColumn="0" w:lastColumn="0" w:oddVBand="0" w:evenVBand="0" w:oddHBand="0" w:evenHBand="0" w:firstRowFirstColumn="0" w:firstRowLastColumn="0" w:lastRowFirstColumn="0" w:lastRowLastColumn="0"/>
             </w:pPr>
             <w:r>
@@ -5329,10 +5536,11 @@
         <w:tc>
           <w:tcPr>
             <w:tcW w:w="1492" w:type="dxa"/>
-            <w:vAlign w:val="top"/>
-          </w:tcPr>
-          <w:p>
-            <w:pPr>
+          </w:tcPr>
+          <w:p>
+            <w:pPr>
+              <w:ind w:firstLine="0"/>
+              <w:jc w:val="center"/>
               <w:cnfStyle w:val="000000000000" w:firstRow="0" w:lastRow="0" w:firstColumn="0" w:lastColumn="0" w:oddVBand="0" w:evenVBand="0" w:oddHBand="0" w:evenHBand="0" w:firstRowFirstColumn="0" w:firstRowLastColumn="0" w:lastRowFirstColumn="0" w:lastRowLastColumn="0"/>
             </w:pPr>
             <w:r>
@@ -5343,10 +5551,11 @@
         <w:tc>
           <w:tcPr>
             <w:tcW w:w="2268" w:type="dxa"/>
-            <w:vAlign w:val="top"/>
-          </w:tcPr>
-          <w:p>
-            <w:pPr>
+          </w:tcPr>
+          <w:p>
+            <w:pPr>
+              <w:ind w:firstLine="0"/>
+              <w:jc w:val="center"/>
               <w:cnfStyle w:val="000000000000" w:firstRow="0" w:lastRow="0" w:firstColumn="0" w:lastColumn="0" w:oddVBand="0" w:evenVBand="0" w:oddHBand="0" w:evenHBand="0" w:firstRowFirstColumn="0" w:firstRowLastColumn="0" w:lastRowFirstColumn="0" w:lastRowLastColumn="0"/>
             </w:pPr>
             <w:r>
@@ -5357,10 +5566,11 @@
         <w:tc>
           <w:tcPr>
             <w:tcW w:w="2546" w:type="dxa"/>
-            <w:vAlign w:val="top"/>
-          </w:tcPr>
-          <w:p>
-            <w:pPr>
+          </w:tcPr>
+          <w:p>
+            <w:pPr>
+              <w:ind w:firstLine="0"/>
+              <w:jc w:val="center"/>
               <w:cnfStyle w:val="000000000000" w:firstRow="0" w:lastRow="0" w:firstColumn="0" w:lastColumn="0" w:oddVBand="0" w:evenVBand="0" w:oddHBand="0" w:evenHBand="0" w:firstRowFirstColumn="0" w:firstRowLastColumn="0" w:lastRowFirstColumn="0" w:lastRowLastColumn="0"/>
             </w:pPr>
             <w:r>
@@ -5374,9 +5584,11 @@
           <w:tcPr>
             <w:cnfStyle w:val="001000000000" w:firstRow="0" w:lastRow="0" w:firstColumn="1" w:lastColumn="0" w:oddVBand="0" w:evenVBand="0" w:oddHBand="0" w:evenHBand="0" w:firstRowFirstColumn="0" w:firstRowLastColumn="0" w:lastRowFirstColumn="0" w:lastRowLastColumn="0"/>
             <w:tcW w:w="692" w:type="dxa"/>
-            <w:vAlign w:val="top"/>
-          </w:tcPr>
-          <w:p>
+          </w:tcPr>
+          <w:p>
+            <w:pPr>
+              <w:ind w:firstLine="0"/>
+            </w:pPr>
             <w:r>
               <w:t>6</w:t>
             </w:r>
@@ -5385,10 +5597,11 @@
         <w:tc>
           <w:tcPr>
             <w:tcW w:w="1780" w:type="dxa"/>
-            <w:vAlign w:val="top"/>
-          </w:tcPr>
-          <w:p>
-            <w:pPr>
+          </w:tcPr>
+          <w:p>
+            <w:pPr>
+              <w:ind w:firstLine="0"/>
+              <w:jc w:val="center"/>
               <w:cnfStyle w:val="000000000000" w:firstRow="0" w:lastRow="0" w:firstColumn="0" w:lastColumn="0" w:oddVBand="0" w:evenVBand="0" w:oddHBand="0" w:evenHBand="0" w:firstRowFirstColumn="0" w:firstRowLastColumn="0" w:lastRowFirstColumn="0" w:lastRowLastColumn="0"/>
             </w:pPr>
             <w:r>
@@ -5399,10 +5612,11 @@
         <w:tc>
           <w:tcPr>
             <w:tcW w:w="1492" w:type="dxa"/>
-            <w:vAlign w:val="top"/>
-          </w:tcPr>
-          <w:p>
-            <w:pPr>
+          </w:tcPr>
+          <w:p>
+            <w:pPr>
+              <w:ind w:firstLine="0"/>
+              <w:jc w:val="center"/>
               <w:cnfStyle w:val="000000000000" w:firstRow="0" w:lastRow="0" w:firstColumn="0" w:lastColumn="0" w:oddVBand="0" w:evenVBand="0" w:oddHBand="0" w:evenHBand="0" w:firstRowFirstColumn="0" w:firstRowLastColumn="0" w:lastRowFirstColumn="0" w:lastRowLastColumn="0"/>
             </w:pPr>
             <w:r>
@@ -5413,10 +5627,11 @@
         <w:tc>
           <w:tcPr>
             <w:tcW w:w="2268" w:type="dxa"/>
-            <w:vAlign w:val="top"/>
-          </w:tcPr>
-          <w:p>
-            <w:pPr>
+          </w:tcPr>
+          <w:p>
+            <w:pPr>
+              <w:ind w:firstLine="0"/>
+              <w:jc w:val="center"/>
               <w:cnfStyle w:val="000000000000" w:firstRow="0" w:lastRow="0" w:firstColumn="0" w:lastColumn="0" w:oddVBand="0" w:evenVBand="0" w:oddHBand="0" w:evenHBand="0" w:firstRowFirstColumn="0" w:firstRowLastColumn="0" w:lastRowFirstColumn="0" w:lastRowLastColumn="0"/>
             </w:pPr>
             <w:r>
@@ -5427,10 +5642,11 @@
         <w:tc>
           <w:tcPr>
             <w:tcW w:w="2546" w:type="dxa"/>
-            <w:vAlign w:val="top"/>
-          </w:tcPr>
-          <w:p>
-            <w:pPr>
+          </w:tcPr>
+          <w:p>
+            <w:pPr>
+              <w:ind w:firstLine="0"/>
+              <w:jc w:val="center"/>
               <w:cnfStyle w:val="000000000000" w:firstRow="0" w:lastRow="0" w:firstColumn="0" w:lastColumn="0" w:oddVBand="0" w:evenVBand="0" w:oddHBand="0" w:evenHBand="0" w:firstRowFirstColumn="0" w:firstRowLastColumn="0" w:lastRowFirstColumn="0" w:lastRowLastColumn="0"/>
             </w:pPr>
             <w:r>
@@ -5444,9 +5660,11 @@
           <w:tcPr>
             <w:cnfStyle w:val="001000000000" w:firstRow="0" w:lastRow="0" w:firstColumn="1" w:lastColumn="0" w:oddVBand="0" w:evenVBand="0" w:oddHBand="0" w:evenHBand="0" w:firstRowFirstColumn="0" w:firstRowLastColumn="0" w:lastRowFirstColumn="0" w:lastRowLastColumn="0"/>
             <w:tcW w:w="692" w:type="dxa"/>
-            <w:vAlign w:val="top"/>
-          </w:tcPr>
-          <w:p>
+          </w:tcPr>
+          <w:p>
+            <w:pPr>
+              <w:ind w:firstLine="0"/>
+            </w:pPr>
             <w:r>
               <w:t>7</w:t>
             </w:r>
@@ -5455,10 +5673,11 @@
         <w:tc>
           <w:tcPr>
             <w:tcW w:w="1780" w:type="dxa"/>
-            <w:vAlign w:val="top"/>
-          </w:tcPr>
-          <w:p>
-            <w:pPr>
+          </w:tcPr>
+          <w:p>
+            <w:pPr>
+              <w:ind w:firstLine="0"/>
+              <w:jc w:val="center"/>
               <w:cnfStyle w:val="000000000000" w:firstRow="0" w:lastRow="0" w:firstColumn="0" w:lastColumn="0" w:oddVBand="0" w:evenVBand="0" w:oddHBand="0" w:evenHBand="0" w:firstRowFirstColumn="0" w:firstRowLastColumn="0" w:lastRowFirstColumn="0" w:lastRowLastColumn="0"/>
             </w:pPr>
             <w:r>
@@ -5469,10 +5688,11 @@
         <w:tc>
           <w:tcPr>
             <w:tcW w:w="1492" w:type="dxa"/>
-            <w:vAlign w:val="top"/>
-          </w:tcPr>
-          <w:p>
-            <w:pPr>
+          </w:tcPr>
+          <w:p>
+            <w:pPr>
+              <w:ind w:firstLine="0"/>
+              <w:jc w:val="center"/>
               <w:cnfStyle w:val="000000000000" w:firstRow="0" w:lastRow="0" w:firstColumn="0" w:lastColumn="0" w:oddVBand="0" w:evenVBand="0" w:oddHBand="0" w:evenHBand="0" w:firstRowFirstColumn="0" w:firstRowLastColumn="0" w:lastRowFirstColumn="0" w:lastRowLastColumn="0"/>
             </w:pPr>
             <w:r>
@@ -5483,33 +5703,33 @@
         <w:tc>
           <w:tcPr>
             <w:tcW w:w="2268" w:type="dxa"/>
-            <w:vAlign w:val="top"/>
-          </w:tcPr>
-          <w:p>
-            <w:pPr>
-              <w:cnfStyle w:val="000000000000" w:firstRow="0" w:lastRow="0" w:firstColumn="0" w:lastColumn="0" w:oddVBand="0" w:evenVBand="0" w:oddHBand="0" w:evenHBand="0" w:firstRowFirstColumn="0" w:firstRowLastColumn="0" w:lastRowFirstColumn="0" w:lastRowLastColumn="0"/>
-            </w:pPr>
-            <w:r>
-              <w:t xml:space="preserve">NOT NULL, DEFAULT 0, CHECK </w:t>
-            </w:r>
-            <w:r>
-              <w:lastRenderedPageBreak/>
-              <w:t>(StockQuantity &gt;= 0)</w:t>
+          </w:tcPr>
+          <w:p>
+            <w:pPr>
+              <w:ind w:firstLine="0"/>
+              <w:jc w:val="center"/>
+              <w:cnfStyle w:val="000000000000" w:firstRow="0" w:lastRow="0" w:firstColumn="0" w:lastColumn="0" w:oddVBand="0" w:evenVBand="0" w:oddHBand="0" w:evenHBand="0" w:firstRowFirstColumn="0" w:firstRowLastColumn="0" w:lastRowFirstColumn="0" w:lastRowLastColumn="0"/>
+            </w:pPr>
+            <w:r>
+              <w:t>NOT NULL, DEFAULT 0, CHECK (StockQuantity &gt;= 0)</w:t>
             </w:r>
           </w:p>
         </w:tc>
         <w:tc>
           <w:tcPr>
             <w:tcW w:w="2546" w:type="dxa"/>
-            <w:vAlign w:val="top"/>
-          </w:tcPr>
-          <w:p>
-            <w:pPr>
-              <w:cnfStyle w:val="000000000000" w:firstRow="0" w:lastRow="0" w:firstColumn="0" w:lastColumn="0" w:oddVBand="0" w:evenVBand="0" w:oddHBand="0" w:evenHBand="0" w:firstRowFirstColumn="0" w:firstRowLastColumn="0" w:lastRowFirstColumn="0" w:lastRowLastColumn="0"/>
-            </w:pPr>
-            <w:r>
-              <w:lastRenderedPageBreak/>
-              <w:t>Số lượng tồn kho</w:t>
+          </w:tcPr>
+          <w:p>
+            <w:pPr>
+              <w:ind w:firstLine="0"/>
+              <w:jc w:val="center"/>
+              <w:cnfStyle w:val="000000000000" w:firstRow="0" w:lastRow="0" w:firstColumn="0" w:lastColumn="0" w:oddVBand="0" w:evenVBand="0" w:oddHBand="0" w:evenHBand="0" w:firstRowFirstColumn="0" w:firstRowLastColumn="0" w:lastRowFirstColumn="0" w:lastRowLastColumn="0"/>
+            </w:pPr>
+            <w:r>
+              <w:t>Số lượng tồ</w:t>
+            </w:r>
+            <w:r>
+              <w:t>n kho</w:t>
             </w:r>
           </w:p>
         </w:tc>
@@ -5519,11 +5739,12 @@
           <w:tcPr>
             <w:cnfStyle w:val="001000000000" w:firstRow="0" w:lastRow="0" w:firstColumn="1" w:lastColumn="0" w:oddVBand="0" w:evenVBand="0" w:oddHBand="0" w:evenHBand="0" w:firstRowFirstColumn="0" w:firstRowLastColumn="0" w:lastRowFirstColumn="0" w:lastRowLastColumn="0"/>
             <w:tcW w:w="692" w:type="dxa"/>
-            <w:vAlign w:val="top"/>
-          </w:tcPr>
-          <w:p>
-            <w:r>
-              <w:lastRenderedPageBreak/>
+          </w:tcPr>
+          <w:p>
+            <w:pPr>
+              <w:ind w:firstLine="0"/>
+            </w:pPr>
+            <w:r>
               <w:t>8</w:t>
             </w:r>
           </w:p>
@@ -5531,10 +5752,11 @@
         <w:tc>
           <w:tcPr>
             <w:tcW w:w="1780" w:type="dxa"/>
-            <w:vAlign w:val="top"/>
-          </w:tcPr>
-          <w:p>
-            <w:pPr>
+          </w:tcPr>
+          <w:p>
+            <w:pPr>
+              <w:ind w:firstLine="0"/>
+              <w:jc w:val="center"/>
               <w:cnfStyle w:val="000000000000" w:firstRow="0" w:lastRow="0" w:firstColumn="0" w:lastColumn="0" w:oddVBand="0" w:evenVBand="0" w:oddHBand="0" w:evenHBand="0" w:firstRowFirstColumn="0" w:firstRowLastColumn="0" w:lastRowFirstColumn="0" w:lastRowLastColumn="0"/>
             </w:pPr>
             <w:r>
@@ -5545,10 +5767,11 @@
         <w:tc>
           <w:tcPr>
             <w:tcW w:w="1492" w:type="dxa"/>
-            <w:vAlign w:val="top"/>
-          </w:tcPr>
-          <w:p>
-            <w:pPr>
+          </w:tcPr>
+          <w:p>
+            <w:pPr>
+              <w:ind w:firstLine="0"/>
+              <w:jc w:val="center"/>
               <w:cnfStyle w:val="000000000000" w:firstRow="0" w:lastRow="0" w:firstColumn="0" w:lastColumn="0" w:oddVBand="0" w:evenVBand="0" w:oddHBand="0" w:evenHBand="0" w:firstRowFirstColumn="0" w:firstRowLastColumn="0" w:lastRowFirstColumn="0" w:lastRowLastColumn="0"/>
             </w:pPr>
             <w:r>
@@ -5559,10 +5782,11 @@
         <w:tc>
           <w:tcPr>
             <w:tcW w:w="2268" w:type="dxa"/>
-            <w:vAlign w:val="top"/>
-          </w:tcPr>
-          <w:p>
-            <w:pPr>
+          </w:tcPr>
+          <w:p>
+            <w:pPr>
+              <w:ind w:firstLine="0"/>
+              <w:jc w:val="center"/>
               <w:cnfStyle w:val="000000000000" w:firstRow="0" w:lastRow="0" w:firstColumn="0" w:lastColumn="0" w:oddVBand="0" w:evenVBand="0" w:oddHBand="0" w:evenHBand="0" w:firstRowFirstColumn="0" w:firstRowLastColumn="0" w:lastRowFirstColumn="0" w:lastRowLastColumn="0"/>
             </w:pPr>
             <w:r>
@@ -5573,10 +5797,11 @@
         <w:tc>
           <w:tcPr>
             <w:tcW w:w="2546" w:type="dxa"/>
-            <w:vAlign w:val="top"/>
-          </w:tcPr>
-          <w:p>
-            <w:pPr>
+          </w:tcPr>
+          <w:p>
+            <w:pPr>
+              <w:ind w:firstLine="0"/>
+              <w:jc w:val="center"/>
               <w:cnfStyle w:val="000000000000" w:firstRow="0" w:lastRow="0" w:firstColumn="0" w:lastColumn="0" w:oddVBand="0" w:evenVBand="0" w:oddHBand="0" w:evenHBand="0" w:firstRowFirstColumn="0" w:firstRowLastColumn="0" w:lastRowFirstColumn="0" w:lastRowLastColumn="0"/>
             </w:pPr>
             <w:r>
@@ -5590,9 +5815,11 @@
           <w:tcPr>
             <w:cnfStyle w:val="001000000000" w:firstRow="0" w:lastRow="0" w:firstColumn="1" w:lastColumn="0" w:oddVBand="0" w:evenVBand="0" w:oddHBand="0" w:evenHBand="0" w:firstRowFirstColumn="0" w:firstRowLastColumn="0" w:lastRowFirstColumn="0" w:lastRowLastColumn="0"/>
             <w:tcW w:w="692" w:type="dxa"/>
-            <w:vAlign w:val="top"/>
-          </w:tcPr>
-          <w:p>
+          </w:tcPr>
+          <w:p>
+            <w:pPr>
+              <w:ind w:firstLine="0"/>
+            </w:pPr>
             <w:r>
               <w:t>9</w:t>
             </w:r>
@@ -5601,10 +5828,11 @@
         <w:tc>
           <w:tcPr>
             <w:tcW w:w="1780" w:type="dxa"/>
-            <w:vAlign w:val="top"/>
-          </w:tcPr>
-          <w:p>
-            <w:pPr>
+          </w:tcPr>
+          <w:p>
+            <w:pPr>
+              <w:ind w:firstLine="0"/>
+              <w:jc w:val="center"/>
               <w:cnfStyle w:val="000000000000" w:firstRow="0" w:lastRow="0" w:firstColumn="0" w:lastColumn="0" w:oddVBand="0" w:evenVBand="0" w:oddHBand="0" w:evenHBand="0" w:firstRowFirstColumn="0" w:firstRowLastColumn="0" w:lastRowFirstColumn="0" w:lastRowLastColumn="0"/>
             </w:pPr>
             <w:r>
@@ -5615,10 +5843,11 @@
         <w:tc>
           <w:tcPr>
             <w:tcW w:w="1492" w:type="dxa"/>
-            <w:vAlign w:val="top"/>
-          </w:tcPr>
-          <w:p>
-            <w:pPr>
+          </w:tcPr>
+          <w:p>
+            <w:pPr>
+              <w:ind w:firstLine="0"/>
+              <w:jc w:val="center"/>
               <w:cnfStyle w:val="000000000000" w:firstRow="0" w:lastRow="0" w:firstColumn="0" w:lastColumn="0" w:oddVBand="0" w:evenVBand="0" w:oddHBand="0" w:evenHBand="0" w:firstRowFirstColumn="0" w:firstRowLastColumn="0" w:lastRowFirstColumn="0" w:lastRowLastColumn="0"/>
             </w:pPr>
             <w:r>
@@ -5629,10 +5858,11 @@
         <w:tc>
           <w:tcPr>
             <w:tcW w:w="2268" w:type="dxa"/>
-            <w:vAlign w:val="top"/>
-          </w:tcPr>
-          <w:p>
-            <w:pPr>
+          </w:tcPr>
+          <w:p>
+            <w:pPr>
+              <w:ind w:firstLine="0"/>
+              <w:jc w:val="center"/>
               <w:cnfStyle w:val="000000000000" w:firstRow="0" w:lastRow="0" w:firstColumn="0" w:lastColumn="0" w:oddVBand="0" w:evenVBand="0" w:oddHBand="0" w:evenHBand="0" w:firstRowFirstColumn="0" w:firstRowLastColumn="0" w:lastRowFirstColumn="0" w:lastRowLastColumn="0"/>
             </w:pPr>
             <w:r>
@@ -5643,10 +5873,11 @@
         <w:tc>
           <w:tcPr>
             <w:tcW w:w="2546" w:type="dxa"/>
-            <w:vAlign w:val="top"/>
-          </w:tcPr>
-          <w:p>
-            <w:pPr>
+          </w:tcPr>
+          <w:p>
+            <w:pPr>
+              <w:ind w:firstLine="0"/>
+              <w:jc w:val="center"/>
               <w:cnfStyle w:val="000000000000" w:firstRow="0" w:lastRow="0" w:firstColumn="0" w:lastColumn="0" w:oddVBand="0" w:evenVBand="0" w:oddHBand="0" w:evenHBand="0" w:firstRowFirstColumn="0" w:firstRowLastColumn="0" w:lastRowFirstColumn="0" w:lastRowLastColumn="0"/>
             </w:pPr>
             <w:r>
@@ -5660,21 +5891,30 @@
           <w:tcPr>
             <w:cnfStyle w:val="001000000000" w:firstRow="0" w:lastRow="0" w:firstColumn="1" w:lastColumn="0" w:oddVBand="0" w:evenVBand="0" w:oddHBand="0" w:evenHBand="0" w:firstRowFirstColumn="0" w:firstRowLastColumn="0" w:lastRowFirstColumn="0" w:lastRowLastColumn="0"/>
             <w:tcW w:w="692" w:type="dxa"/>
-            <w:vAlign w:val="top"/>
-          </w:tcPr>
-          <w:p>
-            <w:r>
-              <w:t>10</w:t>
+          </w:tcPr>
+          <w:p>
+            <w:r>
+              <w:t>1</w:t>
+            </w:r>
+            <w:r>
+              <w:rPr>
+                <w:lang w:val="en-US"/>
+              </w:rPr>
+              <w:t>1</w:t>
+            </w:r>
+            <w:r>
+              <w:t>0</w:t>
             </w:r>
           </w:p>
         </w:tc>
         <w:tc>
           <w:tcPr>
             <w:tcW w:w="1780" w:type="dxa"/>
-            <w:vAlign w:val="top"/>
-          </w:tcPr>
-          <w:p>
-            <w:pPr>
+          </w:tcPr>
+          <w:p>
+            <w:pPr>
+              <w:ind w:firstLine="0"/>
+              <w:jc w:val="center"/>
               <w:cnfStyle w:val="000000000000" w:firstRow="0" w:lastRow="0" w:firstColumn="0" w:lastColumn="0" w:oddVBand="0" w:evenVBand="0" w:oddHBand="0" w:evenHBand="0" w:firstRowFirstColumn="0" w:firstRowLastColumn="0" w:lastRowFirstColumn="0" w:lastRowLastColumn="0"/>
             </w:pPr>
             <w:r>
@@ -5685,10 +5925,11 @@
         <w:tc>
           <w:tcPr>
             <w:tcW w:w="1492" w:type="dxa"/>
-            <w:vAlign w:val="top"/>
-          </w:tcPr>
-          <w:p>
-            <w:pPr>
+          </w:tcPr>
+          <w:p>
+            <w:pPr>
+              <w:ind w:firstLine="0"/>
+              <w:jc w:val="center"/>
               <w:cnfStyle w:val="000000000000" w:firstRow="0" w:lastRow="0" w:firstColumn="0" w:lastColumn="0" w:oddVBand="0" w:evenVBand="0" w:oddHBand="0" w:evenHBand="0" w:firstRowFirstColumn="0" w:firstRowLastColumn="0" w:lastRowFirstColumn="0" w:lastRowLastColumn="0"/>
             </w:pPr>
             <w:r>
@@ -5699,10 +5940,11 @@
         <w:tc>
           <w:tcPr>
             <w:tcW w:w="2268" w:type="dxa"/>
-            <w:vAlign w:val="top"/>
-          </w:tcPr>
-          <w:p>
-            <w:pPr>
+          </w:tcPr>
+          <w:p>
+            <w:pPr>
+              <w:ind w:firstLine="0"/>
+              <w:jc w:val="center"/>
               <w:cnfStyle w:val="000000000000" w:firstRow="0" w:lastRow="0" w:firstColumn="0" w:lastColumn="0" w:oddVBand="0" w:evenVBand="0" w:oddHBand="0" w:evenHBand="0" w:firstRowFirstColumn="0" w:firstRowLastColumn="0" w:lastRowFirstColumn="0" w:lastRowLastColumn="0"/>
             </w:pPr>
             <w:r>
@@ -5713,10 +5955,11 @@
         <w:tc>
           <w:tcPr>
             <w:tcW w:w="2546" w:type="dxa"/>
-            <w:vAlign w:val="top"/>
-          </w:tcPr>
-          <w:p>
-            <w:pPr>
+          </w:tcPr>
+          <w:p>
+            <w:pPr>
+              <w:ind w:firstLine="0"/>
+              <w:jc w:val="center"/>
               <w:cnfStyle w:val="000000000000" w:firstRow="0" w:lastRow="0" w:firstColumn="0" w:lastColumn="0" w:oddVBand="0" w:evenVBand="0" w:oddHBand="0" w:evenHBand="0" w:firstRowFirstColumn="0" w:firstRowLastColumn="0" w:lastRowFirstColumn="0" w:lastRowLastColumn="0"/>
             </w:pPr>
             <w:r>
@@ -5741,11 +5984,11 @@
         <w:tblLook w:val="04A0" w:firstRow="1" w:lastRow="0" w:firstColumn="1" w:lastColumn="0" w:noHBand="0" w:noVBand="1"/>
       </w:tblPr>
       <w:tblGrid>
-        <w:gridCol w:w="1133"/>
-        <w:gridCol w:w="1855"/>
-        <w:gridCol w:w="2151"/>
-        <w:gridCol w:w="2371"/>
-        <w:gridCol w:w="1268"/>
+        <w:gridCol w:w="708"/>
+        <w:gridCol w:w="1660"/>
+        <w:gridCol w:w="2051"/>
+        <w:gridCol w:w="3278"/>
+        <w:gridCol w:w="1081"/>
       </w:tblGrid>
       <w:tr>
         <w:trPr>
@@ -5756,9 +5999,11 @@
           <w:tcPr>
             <w:cnfStyle w:val="001000000000" w:firstRow="0" w:lastRow="0" w:firstColumn="1" w:lastColumn="0" w:oddVBand="0" w:evenVBand="0" w:oddHBand="0" w:evenHBand="0" w:firstRowFirstColumn="0" w:firstRowLastColumn="0" w:lastRowFirstColumn="0" w:lastRowLastColumn="0"/>
             <w:tcW w:w="0" w:type="auto"/>
-            <w:vAlign w:val="top"/>
-          </w:tcPr>
-          <w:p>
+          </w:tcPr>
+          <w:p>
+            <w:pPr>
+              <w:ind w:firstLine="0"/>
+            </w:pPr>
             <w:r>
               <w:t>STT</w:t>
             </w:r>
@@ -5767,10 +6012,10 @@
         <w:tc>
           <w:tcPr>
             <w:tcW w:w="0" w:type="auto"/>
-            <w:vAlign w:val="top"/>
-          </w:tcPr>
-          <w:p>
-            <w:pPr>
+          </w:tcPr>
+          <w:p>
+            <w:pPr>
+              <w:ind w:firstLine="0"/>
               <w:cnfStyle w:val="100000000000" w:firstRow="1" w:lastRow="0" w:firstColumn="0" w:lastColumn="0" w:oddVBand="0" w:evenVBand="0" w:oddHBand="0" w:evenHBand="0" w:firstRowFirstColumn="0" w:firstRowLastColumn="0" w:lastRowFirstColumn="0" w:lastRowLastColumn="0"/>
             </w:pPr>
             <w:r>
@@ -5781,10 +6026,10 @@
         <w:tc>
           <w:tcPr>
             <w:tcW w:w="0" w:type="auto"/>
-            <w:vAlign w:val="top"/>
-          </w:tcPr>
-          <w:p>
-            <w:pPr>
+          </w:tcPr>
+          <w:p>
+            <w:pPr>
+              <w:ind w:firstLine="0"/>
               <w:cnfStyle w:val="100000000000" w:firstRow="1" w:lastRow="0" w:firstColumn="0" w:lastColumn="0" w:oddVBand="0" w:evenVBand="0" w:oddHBand="0" w:evenHBand="0" w:firstRowFirstColumn="0" w:firstRowLastColumn="0" w:lastRowFirstColumn="0" w:lastRowLastColumn="0"/>
             </w:pPr>
             <w:r>
@@ -5795,10 +6040,10 @@
         <w:tc>
           <w:tcPr>
             <w:tcW w:w="0" w:type="auto"/>
-            <w:vAlign w:val="top"/>
-          </w:tcPr>
-          <w:p>
-            <w:pPr>
+          </w:tcPr>
+          <w:p>
+            <w:pPr>
+              <w:ind w:firstLine="0"/>
               <w:cnfStyle w:val="100000000000" w:firstRow="1" w:lastRow="0" w:firstColumn="0" w:lastColumn="0" w:oddVBand="0" w:evenVBand="0" w:oddHBand="0" w:evenHBand="0" w:firstRowFirstColumn="0" w:firstRowLastColumn="0" w:lastRowFirstColumn="0" w:lastRowLastColumn="0"/>
             </w:pPr>
             <w:r>
@@ -5809,10 +6054,10 @@
         <w:tc>
           <w:tcPr>
             <w:tcW w:w="0" w:type="auto"/>
-            <w:vAlign w:val="top"/>
-          </w:tcPr>
-          <w:p>
-            <w:pPr>
+          </w:tcPr>
+          <w:p>
+            <w:pPr>
+              <w:ind w:firstLine="0"/>
               <w:cnfStyle w:val="100000000000" w:firstRow="1" w:lastRow="0" w:firstColumn="0" w:lastColumn="0" w:oddVBand="0" w:evenVBand="0" w:oddHBand="0" w:evenHBand="0" w:firstRowFirstColumn="0" w:firstRowLastColumn="0" w:lastRowFirstColumn="0" w:lastRowLastColumn="0"/>
             </w:pPr>
             <w:r>
@@ -5828,6 +6073,9 @@
             <w:tcW w:w="0" w:type="auto"/>
           </w:tcPr>
           <w:p>
+            <w:pPr>
+              <w:ind w:firstLine="0"/>
+            </w:pPr>
             <w:r>
               <w:t>1</w:t>
             </w:r>
@@ -5839,6 +6087,8 @@
           </w:tcPr>
           <w:p>
             <w:pPr>
+              <w:ind w:firstLine="0"/>
+              <w:jc w:val="center"/>
               <w:cnfStyle w:val="000000000000" w:firstRow="0" w:lastRow="0" w:firstColumn="0" w:lastColumn="0" w:oddVBand="0" w:evenVBand="0" w:oddHBand="0" w:evenHBand="0" w:firstRowFirstColumn="0" w:firstRowLastColumn="0" w:lastRowFirstColumn="0" w:lastRowLastColumn="0"/>
             </w:pPr>
             <w:r>
@@ -5852,6 +6102,8 @@
           </w:tcPr>
           <w:p>
             <w:pPr>
+              <w:ind w:firstLine="0"/>
+              <w:jc w:val="center"/>
               <w:cnfStyle w:val="000000000000" w:firstRow="0" w:lastRow="0" w:firstColumn="0" w:lastColumn="0" w:oddVBand="0" w:evenVBand="0" w:oddHBand="0" w:evenHBand="0" w:firstRowFirstColumn="0" w:firstRowLastColumn="0" w:lastRowFirstColumn="0" w:lastRowLastColumn="0"/>
             </w:pPr>
             <w:r>
@@ -5865,6 +6117,8 @@
           </w:tcPr>
           <w:p>
             <w:pPr>
+              <w:ind w:firstLine="0"/>
+              <w:jc w:val="center"/>
               <w:cnfStyle w:val="000000000000" w:firstRow="0" w:lastRow="0" w:firstColumn="0" w:lastColumn="0" w:oddVBand="0" w:evenVBand="0" w:oddHBand="0" w:evenHBand="0" w:firstRowFirstColumn="0" w:firstRowLastColumn="0" w:lastRowFirstColumn="0" w:lastRowLastColumn="0"/>
             </w:pPr>
             <w:r>
@@ -5878,6 +6132,8 @@
           </w:tcPr>
           <w:p>
             <w:pPr>
+              <w:ind w:firstLine="0"/>
+              <w:jc w:val="center"/>
               <w:cnfStyle w:val="000000000000" w:firstRow="0" w:lastRow="0" w:firstColumn="0" w:lastColumn="0" w:oddVBand="0" w:evenVBand="0" w:oddHBand="0" w:evenHBand="0" w:firstRowFirstColumn="0" w:firstRowLastColumn="0" w:lastRowFirstColumn="0" w:lastRowLastColumn="0"/>
             </w:pPr>
             <w:r>
@@ -5893,7 +6149,11 @@
             <w:tcW w:w="0" w:type="auto"/>
           </w:tcPr>
           <w:p>
-            <w:r>
+            <w:pPr>
+              <w:ind w:firstLine="0"/>
+            </w:pPr>
+            <w:r>
+              <w:lastRenderedPageBreak/>
               <w:t>2</w:t>
             </w:r>
           </w:p>
@@ -5904,6 +6164,8 @@
           </w:tcPr>
           <w:p>
             <w:pPr>
+              <w:ind w:firstLine="0"/>
+              <w:jc w:val="center"/>
               <w:cnfStyle w:val="000000000000" w:firstRow="0" w:lastRow="0" w:firstColumn="0" w:lastColumn="0" w:oddVBand="0" w:evenVBand="0" w:oddHBand="0" w:evenHBand="0" w:firstRowFirstColumn="0" w:firstRowLastColumn="0" w:lastRowFirstColumn="0" w:lastRowLastColumn="0"/>
             </w:pPr>
             <w:r>
@@ -5917,6 +6179,8 @@
           </w:tcPr>
           <w:p>
             <w:pPr>
+              <w:ind w:firstLine="0"/>
+              <w:jc w:val="center"/>
               <w:cnfStyle w:val="000000000000" w:firstRow="0" w:lastRow="0" w:firstColumn="0" w:lastColumn="0" w:oddVBand="0" w:evenVBand="0" w:oddHBand="0" w:evenHBand="0" w:firstRowFirstColumn="0" w:firstRowLastColumn="0" w:lastRowFirstColumn="0" w:lastRowLastColumn="0"/>
             </w:pPr>
             <w:r>
@@ -5930,6 +6194,8 @@
           </w:tcPr>
           <w:p>
             <w:pPr>
+              <w:ind w:firstLine="0"/>
+              <w:jc w:val="center"/>
               <w:cnfStyle w:val="000000000000" w:firstRow="0" w:lastRow="0" w:firstColumn="0" w:lastColumn="0" w:oddVBand="0" w:evenVBand="0" w:oddHBand="0" w:evenHBand="0" w:firstRowFirstColumn="0" w:firstRowLastColumn="0" w:lastRowFirstColumn="0" w:lastRowLastColumn="0"/>
             </w:pPr>
             <w:r>
@@ -5943,6 +6209,8 @@
           </w:tcPr>
           <w:p>
             <w:pPr>
+              <w:ind w:firstLine="0"/>
+              <w:jc w:val="center"/>
               <w:cnfStyle w:val="000000000000" w:firstRow="0" w:lastRow="0" w:firstColumn="0" w:lastColumn="0" w:oddVBand="0" w:evenVBand="0" w:oddHBand="0" w:evenHBand="0" w:firstRowFirstColumn="0" w:firstRowLastColumn="0" w:lastRowFirstColumn="0" w:lastRowLastColumn="0"/>
             </w:pPr>
             <w:r>
@@ -5958,6 +6226,9 @@
             <w:tcW w:w="0" w:type="auto"/>
           </w:tcPr>
           <w:p>
+            <w:pPr>
+              <w:ind w:firstLine="0"/>
+            </w:pPr>
             <w:r>
               <w:t>3</w:t>
             </w:r>
@@ -5969,6 +6240,8 @@
           </w:tcPr>
           <w:p>
             <w:pPr>
+              <w:ind w:firstLine="0"/>
+              <w:jc w:val="center"/>
               <w:cnfStyle w:val="000000000000" w:firstRow="0" w:lastRow="0" w:firstColumn="0" w:lastColumn="0" w:oddVBand="0" w:evenVBand="0" w:oddHBand="0" w:evenHBand="0" w:firstRowFirstColumn="0" w:firstRowLastColumn="0" w:lastRowFirstColumn="0" w:lastRowLastColumn="0"/>
             </w:pPr>
             <w:r>
@@ -5982,6 +6255,8 @@
           </w:tcPr>
           <w:p>
             <w:pPr>
+              <w:ind w:firstLine="0"/>
+              <w:jc w:val="center"/>
               <w:cnfStyle w:val="000000000000" w:firstRow="0" w:lastRow="0" w:firstColumn="0" w:lastColumn="0" w:oddVBand="0" w:evenVBand="0" w:oddHBand="0" w:evenHBand="0" w:firstRowFirstColumn="0" w:firstRowLastColumn="0" w:lastRowFirstColumn="0" w:lastRowLastColumn="0"/>
             </w:pPr>
             <w:r>
@@ -5995,6 +6270,8 @@
           </w:tcPr>
           <w:p>
             <w:pPr>
+              <w:ind w:firstLine="0"/>
+              <w:jc w:val="center"/>
               <w:cnfStyle w:val="000000000000" w:firstRow="0" w:lastRow="0" w:firstColumn="0" w:lastColumn="0" w:oddVBand="0" w:evenVBand="0" w:oddHBand="0" w:evenHBand="0" w:firstRowFirstColumn="0" w:firstRowLastColumn="0" w:lastRowFirstColumn="0" w:lastRowLastColumn="0"/>
             </w:pPr>
             <w:r>
@@ -6008,6 +6285,8 @@
           </w:tcPr>
           <w:p>
             <w:pPr>
+              <w:ind w:firstLine="0"/>
+              <w:jc w:val="center"/>
               <w:cnfStyle w:val="000000000000" w:firstRow="0" w:lastRow="0" w:firstColumn="0" w:lastColumn="0" w:oddVBand="0" w:evenVBand="0" w:oddHBand="0" w:evenHBand="0" w:firstRowFirstColumn="0" w:firstRowLastColumn="0" w:lastRowFirstColumn="0" w:lastRowLastColumn="0"/>
             </w:pPr>
             <w:r>
@@ -6023,6 +6302,9 @@
             <w:tcW w:w="0" w:type="auto"/>
           </w:tcPr>
           <w:p>
+            <w:pPr>
+              <w:ind w:firstLine="0"/>
+            </w:pPr>
             <w:r>
               <w:t>4</w:t>
             </w:r>
@@ -6034,6 +6316,8 @@
           </w:tcPr>
           <w:p>
             <w:pPr>
+              <w:ind w:firstLine="0"/>
+              <w:jc w:val="center"/>
               <w:cnfStyle w:val="000000000000" w:firstRow="0" w:lastRow="0" w:firstColumn="0" w:lastColumn="0" w:oddVBand="0" w:evenVBand="0" w:oddHBand="0" w:evenHBand="0" w:firstRowFirstColumn="0" w:firstRowLastColumn="0" w:lastRowFirstColumn="0" w:lastRowLastColumn="0"/>
             </w:pPr>
             <w:r>
@@ -6047,6 +6331,8 @@
           </w:tcPr>
           <w:p>
             <w:pPr>
+              <w:ind w:firstLine="0"/>
+              <w:jc w:val="center"/>
               <w:cnfStyle w:val="000000000000" w:firstRow="0" w:lastRow="0" w:firstColumn="0" w:lastColumn="0" w:oddVBand="0" w:evenVBand="0" w:oddHBand="0" w:evenHBand="0" w:firstRowFirstColumn="0" w:firstRowLastColumn="0" w:lastRowFirstColumn="0" w:lastRowLastColumn="0"/>
             </w:pPr>
             <w:r>
@@ -6060,6 +6346,8 @@
           </w:tcPr>
           <w:p>
             <w:pPr>
+              <w:ind w:firstLine="0"/>
+              <w:jc w:val="center"/>
               <w:cnfStyle w:val="000000000000" w:firstRow="0" w:lastRow="0" w:firstColumn="0" w:lastColumn="0" w:oddVBand="0" w:evenVBand="0" w:oddHBand="0" w:evenHBand="0" w:firstRowFirstColumn="0" w:firstRowLastColumn="0" w:lastRowFirstColumn="0" w:lastRowLastColumn="0"/>
             </w:pPr>
             <w:r>
@@ -6073,6 +6361,8 @@
           </w:tcPr>
           <w:p>
             <w:pPr>
+              <w:ind w:firstLine="0"/>
+              <w:jc w:val="center"/>
               <w:cnfStyle w:val="000000000000" w:firstRow="0" w:lastRow="0" w:firstColumn="0" w:lastColumn="0" w:oddVBand="0" w:evenVBand="0" w:oddHBand="0" w:evenHBand="0" w:firstRowFirstColumn="0" w:firstRowLastColumn="0" w:lastRowFirstColumn="0" w:lastRowLastColumn="0"/>
             </w:pPr>
             <w:r>
@@ -6088,6 +6378,9 @@
             <w:tcW w:w="0" w:type="auto"/>
           </w:tcPr>
           <w:p>
+            <w:pPr>
+              <w:ind w:firstLine="0"/>
+            </w:pPr>
             <w:r>
               <w:t>5</w:t>
             </w:r>
@@ -6099,6 +6392,8 @@
           </w:tcPr>
           <w:p>
             <w:pPr>
+              <w:ind w:firstLine="0"/>
+              <w:jc w:val="center"/>
               <w:cnfStyle w:val="000000000000" w:firstRow="0" w:lastRow="0" w:firstColumn="0" w:lastColumn="0" w:oddVBand="0" w:evenVBand="0" w:oddHBand="0" w:evenHBand="0" w:firstRowFirstColumn="0" w:firstRowLastColumn="0" w:lastRowFirstColumn="0" w:lastRowLastColumn="0"/>
             </w:pPr>
             <w:r>
@@ -6112,6 +6407,8 @@
           </w:tcPr>
           <w:p>
             <w:pPr>
+              <w:ind w:firstLine="0"/>
+              <w:jc w:val="center"/>
               <w:cnfStyle w:val="000000000000" w:firstRow="0" w:lastRow="0" w:firstColumn="0" w:lastColumn="0" w:oddVBand="0" w:evenVBand="0" w:oddHBand="0" w:evenHBand="0" w:firstRowFirstColumn="0" w:firstRowLastColumn="0" w:lastRowFirstColumn="0" w:lastRowLastColumn="0"/>
             </w:pPr>
             <w:r>
@@ -6125,6 +6422,8 @@
           </w:tcPr>
           <w:p>
             <w:pPr>
+              <w:ind w:firstLine="0"/>
+              <w:jc w:val="center"/>
               <w:cnfStyle w:val="000000000000" w:firstRow="0" w:lastRow="0" w:firstColumn="0" w:lastColumn="0" w:oddVBand="0" w:evenVBand="0" w:oddHBand="0" w:evenHBand="0" w:firstRowFirstColumn="0" w:firstRowLastColumn="0" w:lastRowFirstColumn="0" w:lastRowLastColumn="0"/>
             </w:pPr>
             <w:r>
@@ -6138,6 +6437,8 @@
           </w:tcPr>
           <w:p>
             <w:pPr>
+              <w:ind w:firstLine="0"/>
+              <w:jc w:val="center"/>
               <w:cnfStyle w:val="000000000000" w:firstRow="0" w:lastRow="0" w:firstColumn="0" w:lastColumn="0" w:oddVBand="0" w:evenVBand="0" w:oddHBand="0" w:evenHBand="0" w:firstRowFirstColumn="0" w:firstRowLastColumn="0" w:lastRowFirstColumn="0" w:lastRowLastColumn="0"/>
             </w:pPr>
             <w:r>
@@ -6153,6 +6454,9 @@
             <w:tcW w:w="0" w:type="auto"/>
           </w:tcPr>
           <w:p>
+            <w:pPr>
+              <w:ind w:firstLine="0"/>
+            </w:pPr>
             <w:r>
               <w:t>6</w:t>
             </w:r>
@@ -6164,6 +6468,8 @@
           </w:tcPr>
           <w:p>
             <w:pPr>
+              <w:ind w:firstLine="0"/>
+              <w:jc w:val="center"/>
               <w:cnfStyle w:val="000000000000" w:firstRow="0" w:lastRow="0" w:firstColumn="0" w:lastColumn="0" w:oddVBand="0" w:evenVBand="0" w:oddHBand="0" w:evenHBand="0" w:firstRowFirstColumn="0" w:firstRowLastColumn="0" w:lastRowFirstColumn="0" w:lastRowLastColumn="0"/>
             </w:pPr>
             <w:r>
@@ -6177,6 +6483,8 @@
           </w:tcPr>
           <w:p>
             <w:pPr>
+              <w:ind w:firstLine="0"/>
+              <w:jc w:val="center"/>
               <w:cnfStyle w:val="000000000000" w:firstRow="0" w:lastRow="0" w:firstColumn="0" w:lastColumn="0" w:oddVBand="0" w:evenVBand="0" w:oddHBand="0" w:evenHBand="0" w:firstRowFirstColumn="0" w:firstRowLastColumn="0" w:lastRowFirstColumn="0" w:lastRowLastColumn="0"/>
             </w:pPr>
             <w:r>
@@ -6190,6 +6498,8 @@
           </w:tcPr>
           <w:p>
             <w:pPr>
+              <w:ind w:firstLine="0"/>
+              <w:jc w:val="center"/>
               <w:cnfStyle w:val="000000000000" w:firstRow="0" w:lastRow="0" w:firstColumn="0" w:lastColumn="0" w:oddVBand="0" w:evenVBand="0" w:oddHBand="0" w:evenHBand="0" w:firstRowFirstColumn="0" w:firstRowLastColumn="0" w:lastRowFirstColumn="0" w:lastRowLastColumn="0"/>
             </w:pPr>
             <w:r>
@@ -6203,6 +6513,8 @@
           </w:tcPr>
           <w:p>
             <w:pPr>
+              <w:ind w:firstLine="0"/>
+              <w:jc w:val="center"/>
               <w:cnfStyle w:val="000000000000" w:firstRow="0" w:lastRow="0" w:firstColumn="0" w:lastColumn="0" w:oddVBand="0" w:evenVBand="0" w:oddHBand="0" w:evenHBand="0" w:firstRowFirstColumn="0" w:firstRowLastColumn="0" w:lastRowFirstColumn="0" w:lastRowLastColumn="0"/>
             </w:pPr>
             <w:r>
@@ -6218,6 +6530,9 @@
             <w:tcW w:w="0" w:type="auto"/>
           </w:tcPr>
           <w:p>
+            <w:pPr>
+              <w:ind w:firstLine="0"/>
+            </w:pPr>
             <w:r>
               <w:t>7</w:t>
             </w:r>
@@ -6229,6 +6544,8 @@
           </w:tcPr>
           <w:p>
             <w:pPr>
+              <w:ind w:firstLine="0"/>
+              <w:jc w:val="center"/>
               <w:cnfStyle w:val="000000000000" w:firstRow="0" w:lastRow="0" w:firstColumn="0" w:lastColumn="0" w:oddVBand="0" w:evenVBand="0" w:oddHBand="0" w:evenHBand="0" w:firstRowFirstColumn="0" w:firstRowLastColumn="0" w:lastRowFirstColumn="0" w:lastRowLastColumn="0"/>
             </w:pPr>
             <w:r>
@@ -6242,6 +6559,8 @@
           </w:tcPr>
           <w:p>
             <w:pPr>
+              <w:ind w:firstLine="0"/>
+              <w:jc w:val="center"/>
               <w:cnfStyle w:val="000000000000" w:firstRow="0" w:lastRow="0" w:firstColumn="0" w:lastColumn="0" w:oddVBand="0" w:evenVBand="0" w:oddHBand="0" w:evenHBand="0" w:firstRowFirstColumn="0" w:firstRowLastColumn="0" w:lastRowFirstColumn="0" w:lastRowLastColumn="0"/>
             </w:pPr>
             <w:r>
@@ -6255,6 +6574,8 @@
           </w:tcPr>
           <w:p>
             <w:pPr>
+              <w:ind w:firstLine="0"/>
+              <w:jc w:val="center"/>
               <w:cnfStyle w:val="000000000000" w:firstRow="0" w:lastRow="0" w:firstColumn="0" w:lastColumn="0" w:oddVBand="0" w:evenVBand="0" w:oddHBand="0" w:evenHBand="0" w:firstRowFirstColumn="0" w:firstRowLastColumn="0" w:lastRowFirstColumn="0" w:lastRowLastColumn="0"/>
             </w:pPr>
             <w:r>
@@ -6268,6 +6589,8 @@
           </w:tcPr>
           <w:p>
             <w:pPr>
+              <w:ind w:firstLine="0"/>
+              <w:jc w:val="center"/>
               <w:cnfStyle w:val="000000000000" w:firstRow="0" w:lastRow="0" w:firstColumn="0" w:lastColumn="0" w:oddVBand="0" w:evenVBand="0" w:oddHBand="0" w:evenHBand="0" w:firstRowFirstColumn="0" w:firstRowLastColumn="0" w:lastRowFirstColumn="0" w:lastRowLastColumn="0"/>
             </w:pPr>
             <w:r>
@@ -6283,8 +6606,10 @@
             <w:tcW w:w="0" w:type="auto"/>
           </w:tcPr>
           <w:p>
-            <w:r>
-              <w:lastRenderedPageBreak/>
+            <w:pPr>
+              <w:ind w:firstLine="0"/>
+            </w:pPr>
+            <w:r>
               <w:t>8</w:t>
             </w:r>
           </w:p>
@@ -6295,6 +6620,8 @@
           </w:tcPr>
           <w:p>
             <w:pPr>
+              <w:ind w:firstLine="0"/>
+              <w:jc w:val="center"/>
               <w:cnfStyle w:val="000000000000" w:firstRow="0" w:lastRow="0" w:firstColumn="0" w:lastColumn="0" w:oddVBand="0" w:evenVBand="0" w:oddHBand="0" w:evenHBand="0" w:firstRowFirstColumn="0" w:firstRowLastColumn="0" w:lastRowFirstColumn="0" w:lastRowLastColumn="0"/>
             </w:pPr>
             <w:r>
@@ -6308,6 +6635,8 @@
           </w:tcPr>
           <w:p>
             <w:pPr>
+              <w:ind w:firstLine="0"/>
+              <w:jc w:val="center"/>
               <w:cnfStyle w:val="000000000000" w:firstRow="0" w:lastRow="0" w:firstColumn="0" w:lastColumn="0" w:oddVBand="0" w:evenVBand="0" w:oddHBand="0" w:evenHBand="0" w:firstRowFirstColumn="0" w:firstRowLastColumn="0" w:lastRowFirstColumn="0" w:lastRowLastColumn="0"/>
             </w:pPr>
             <w:r>
@@ -6321,6 +6650,8 @@
           </w:tcPr>
           <w:p>
             <w:pPr>
+              <w:ind w:firstLine="0"/>
+              <w:jc w:val="center"/>
               <w:cnfStyle w:val="000000000000" w:firstRow="0" w:lastRow="0" w:firstColumn="0" w:lastColumn="0" w:oddVBand="0" w:evenVBand="0" w:oddHBand="0" w:evenHBand="0" w:firstRowFirstColumn="0" w:firstRowLastColumn="0" w:lastRowFirstColumn="0" w:lastRowLastColumn="0"/>
             </w:pPr>
             <w:r>
@@ -6334,6 +6665,8 @@
           </w:tcPr>
           <w:p>
             <w:pPr>
+              <w:ind w:firstLine="0"/>
+              <w:jc w:val="center"/>
               <w:cnfStyle w:val="000000000000" w:firstRow="0" w:lastRow="0" w:firstColumn="0" w:lastColumn="0" w:oddVBand="0" w:evenVBand="0" w:oddHBand="0" w:evenHBand="0" w:firstRowFirstColumn="0" w:firstRowLastColumn="0" w:lastRowFirstColumn="0" w:lastRowLastColumn="0"/>
             </w:pPr>
             <w:r>
@@ -6358,11 +6691,11 @@
         <w:tblLook w:val="04A0" w:firstRow="1" w:lastRow="0" w:firstColumn="1" w:lastColumn="0" w:noHBand="0" w:noVBand="1"/>
       </w:tblPr>
       <w:tblGrid>
-        <w:gridCol w:w="1110"/>
-        <w:gridCol w:w="1779"/>
-        <w:gridCol w:w="2083"/>
-        <w:gridCol w:w="2541"/>
-        <w:gridCol w:w="1265"/>
+        <w:gridCol w:w="691"/>
+        <w:gridCol w:w="1568"/>
+        <w:gridCol w:w="1966"/>
+        <w:gridCol w:w="2963"/>
+        <w:gridCol w:w="1590"/>
       </w:tblGrid>
       <w:tr>
         <w:trPr>
@@ -6373,9 +6706,11 @@
           <w:tcPr>
             <w:cnfStyle w:val="001000000000" w:firstRow="0" w:lastRow="0" w:firstColumn="1" w:lastColumn="0" w:oddVBand="0" w:evenVBand="0" w:oddHBand="0" w:evenHBand="0" w:firstRowFirstColumn="0" w:firstRowLastColumn="0" w:lastRowFirstColumn="0" w:lastRowLastColumn="0"/>
             <w:tcW w:w="0" w:type="auto"/>
-            <w:vAlign w:val="top"/>
-          </w:tcPr>
-          <w:p>
+          </w:tcPr>
+          <w:p>
+            <w:pPr>
+              <w:ind w:firstLine="0"/>
+            </w:pPr>
             <w:r>
               <w:t>STT</w:t>
             </w:r>
@@ -6384,10 +6719,10 @@
         <w:tc>
           <w:tcPr>
             <w:tcW w:w="0" w:type="auto"/>
-            <w:vAlign w:val="top"/>
-          </w:tcPr>
-          <w:p>
-            <w:pPr>
+          </w:tcPr>
+          <w:p>
+            <w:pPr>
+              <w:ind w:firstLine="0"/>
               <w:cnfStyle w:val="100000000000" w:firstRow="1" w:lastRow="0" w:firstColumn="0" w:lastColumn="0" w:oddVBand="0" w:evenVBand="0" w:oddHBand="0" w:evenHBand="0" w:firstRowFirstColumn="0" w:firstRowLastColumn="0" w:lastRowFirstColumn="0" w:lastRowLastColumn="0"/>
             </w:pPr>
             <w:r>
@@ -6398,10 +6733,10 @@
         <w:tc>
           <w:tcPr>
             <w:tcW w:w="0" w:type="auto"/>
-            <w:vAlign w:val="top"/>
-          </w:tcPr>
-          <w:p>
-            <w:pPr>
+          </w:tcPr>
+          <w:p>
+            <w:pPr>
+              <w:ind w:firstLine="0"/>
               <w:cnfStyle w:val="100000000000" w:firstRow="1" w:lastRow="0" w:firstColumn="0" w:lastColumn="0" w:oddVBand="0" w:evenVBand="0" w:oddHBand="0" w:evenHBand="0" w:firstRowFirstColumn="0" w:firstRowLastColumn="0" w:lastRowFirstColumn="0" w:lastRowLastColumn="0"/>
             </w:pPr>
             <w:r>
@@ -6412,10 +6747,10 @@
         <w:tc>
           <w:tcPr>
             <w:tcW w:w="0" w:type="auto"/>
-            <w:vAlign w:val="top"/>
-          </w:tcPr>
-          <w:p>
-            <w:pPr>
+          </w:tcPr>
+          <w:p>
+            <w:pPr>
+              <w:ind w:firstLine="0"/>
               <w:cnfStyle w:val="100000000000" w:firstRow="1" w:lastRow="0" w:firstColumn="0" w:lastColumn="0" w:oddVBand="0" w:evenVBand="0" w:oddHBand="0" w:evenHBand="0" w:firstRowFirstColumn="0" w:firstRowLastColumn="0" w:lastRowFirstColumn="0" w:lastRowLastColumn="0"/>
             </w:pPr>
             <w:r>
@@ -6426,10 +6761,10 @@
         <w:tc>
           <w:tcPr>
             <w:tcW w:w="0" w:type="auto"/>
-            <w:vAlign w:val="top"/>
-          </w:tcPr>
-          <w:p>
-            <w:pPr>
+          </w:tcPr>
+          <w:p>
+            <w:pPr>
+              <w:ind w:firstLine="0"/>
               <w:cnfStyle w:val="100000000000" w:firstRow="1" w:lastRow="0" w:firstColumn="0" w:lastColumn="0" w:oddVBand="0" w:evenVBand="0" w:oddHBand="0" w:evenHBand="0" w:firstRowFirstColumn="0" w:firstRowLastColumn="0" w:lastRowFirstColumn="0" w:lastRowLastColumn="0"/>
             </w:pPr>
             <w:r>
@@ -6443,9 +6778,11 @@
           <w:tcPr>
             <w:cnfStyle w:val="001000000000" w:firstRow="0" w:lastRow="0" w:firstColumn="1" w:lastColumn="0" w:oddVBand="0" w:evenVBand="0" w:oddHBand="0" w:evenHBand="0" w:firstRowFirstColumn="0" w:firstRowLastColumn="0" w:lastRowFirstColumn="0" w:lastRowLastColumn="0"/>
             <w:tcW w:w="0" w:type="auto"/>
-            <w:vAlign w:val="top"/>
-          </w:tcPr>
-          <w:p>
+          </w:tcPr>
+          <w:p>
+            <w:pPr>
+              <w:ind w:firstLine="0"/>
+            </w:pPr>
             <w:r>
               <w:t>1</w:t>
             </w:r>
@@ -6454,10 +6791,11 @@
         <w:tc>
           <w:tcPr>
             <w:tcW w:w="0" w:type="auto"/>
-            <w:vAlign w:val="top"/>
-          </w:tcPr>
-          <w:p>
-            <w:pPr>
+          </w:tcPr>
+          <w:p>
+            <w:pPr>
+              <w:ind w:firstLine="0"/>
+              <w:jc w:val="center"/>
               <w:cnfStyle w:val="000000000000" w:firstRow="0" w:lastRow="0" w:firstColumn="0" w:lastColumn="0" w:oddVBand="0" w:evenVBand="0" w:oddHBand="0" w:evenHBand="0" w:firstRowFirstColumn="0" w:firstRowLastColumn="0" w:lastRowFirstColumn="0" w:lastRowLastColumn="0"/>
             </w:pPr>
             <w:r>
@@ -6468,10 +6806,11 @@
         <w:tc>
           <w:tcPr>
             <w:tcW w:w="0" w:type="auto"/>
-            <w:vAlign w:val="top"/>
-          </w:tcPr>
-          <w:p>
-            <w:pPr>
+          </w:tcPr>
+          <w:p>
+            <w:pPr>
+              <w:ind w:firstLine="0"/>
+              <w:jc w:val="center"/>
               <w:cnfStyle w:val="000000000000" w:firstRow="0" w:lastRow="0" w:firstColumn="0" w:lastColumn="0" w:oddVBand="0" w:evenVBand="0" w:oddHBand="0" w:evenHBand="0" w:firstRowFirstColumn="0" w:firstRowLastColumn="0" w:lastRowFirstColumn="0" w:lastRowLastColumn="0"/>
             </w:pPr>
             <w:r>
@@ -6482,10 +6821,11 @@
         <w:tc>
           <w:tcPr>
             <w:tcW w:w="0" w:type="auto"/>
-            <w:vAlign w:val="top"/>
-          </w:tcPr>
-          <w:p>
-            <w:pPr>
+          </w:tcPr>
+          <w:p>
+            <w:pPr>
+              <w:ind w:firstLine="0"/>
+              <w:jc w:val="center"/>
               <w:cnfStyle w:val="000000000000" w:firstRow="0" w:lastRow="0" w:firstColumn="0" w:lastColumn="0" w:oddVBand="0" w:evenVBand="0" w:oddHBand="0" w:evenHBand="0" w:firstRowFirstColumn="0" w:firstRowLastColumn="0" w:lastRowFirstColumn="0" w:lastRowLastColumn="0"/>
             </w:pPr>
             <w:r>
@@ -6496,10 +6836,11 @@
         <w:tc>
           <w:tcPr>
             <w:tcW w:w="0" w:type="auto"/>
-            <w:vAlign w:val="top"/>
-          </w:tcPr>
-          <w:p>
-            <w:pPr>
+          </w:tcPr>
+          <w:p>
+            <w:pPr>
+              <w:ind w:firstLine="0"/>
+              <w:jc w:val="center"/>
               <w:cnfStyle w:val="000000000000" w:firstRow="0" w:lastRow="0" w:firstColumn="0" w:lastColumn="0" w:oddVBand="0" w:evenVBand="0" w:oddHBand="0" w:evenHBand="0" w:firstRowFirstColumn="0" w:firstRowLastColumn="0" w:lastRowFirstColumn="0" w:lastRowLastColumn="0"/>
             </w:pPr>
             <w:r>
@@ -6513,9 +6854,11 @@
           <w:tcPr>
             <w:cnfStyle w:val="001000000000" w:firstRow="0" w:lastRow="0" w:firstColumn="1" w:lastColumn="0" w:oddVBand="0" w:evenVBand="0" w:oddHBand="0" w:evenHBand="0" w:firstRowFirstColumn="0" w:firstRowLastColumn="0" w:lastRowFirstColumn="0" w:lastRowLastColumn="0"/>
             <w:tcW w:w="0" w:type="auto"/>
-            <w:vAlign w:val="top"/>
-          </w:tcPr>
-          <w:p>
+          </w:tcPr>
+          <w:p>
+            <w:pPr>
+              <w:ind w:firstLine="0"/>
+            </w:pPr>
             <w:r>
               <w:t>2</w:t>
             </w:r>
@@ -6524,10 +6867,11 @@
         <w:tc>
           <w:tcPr>
             <w:tcW w:w="0" w:type="auto"/>
-            <w:vAlign w:val="top"/>
-          </w:tcPr>
-          <w:p>
-            <w:pPr>
+          </w:tcPr>
+          <w:p>
+            <w:pPr>
+              <w:ind w:firstLine="0"/>
+              <w:jc w:val="center"/>
               <w:cnfStyle w:val="000000000000" w:firstRow="0" w:lastRow="0" w:firstColumn="0" w:lastColumn="0" w:oddVBand="0" w:evenVBand="0" w:oddHBand="0" w:evenHBand="0" w:firstRowFirstColumn="0" w:firstRowLastColumn="0" w:lastRowFirstColumn="0" w:lastRowLastColumn="0"/>
             </w:pPr>
             <w:r>
@@ -6538,10 +6882,11 @@
         <w:tc>
           <w:tcPr>
             <w:tcW w:w="0" w:type="auto"/>
-            <w:vAlign w:val="top"/>
-          </w:tcPr>
-          <w:p>
-            <w:pPr>
+          </w:tcPr>
+          <w:p>
+            <w:pPr>
+              <w:ind w:firstLine="0"/>
+              <w:jc w:val="center"/>
               <w:cnfStyle w:val="000000000000" w:firstRow="0" w:lastRow="0" w:firstColumn="0" w:lastColumn="0" w:oddVBand="0" w:evenVBand="0" w:oddHBand="0" w:evenHBand="0" w:firstRowFirstColumn="0" w:firstRowLastColumn="0" w:lastRowFirstColumn="0" w:lastRowLastColumn="0"/>
             </w:pPr>
             <w:r>
@@ -6552,10 +6897,11 @@
         <w:tc>
           <w:tcPr>
             <w:tcW w:w="0" w:type="auto"/>
-            <w:vAlign w:val="top"/>
-          </w:tcPr>
-          <w:p>
-            <w:pPr>
+          </w:tcPr>
+          <w:p>
+            <w:pPr>
+              <w:ind w:firstLine="0"/>
+              <w:jc w:val="center"/>
               <w:cnfStyle w:val="000000000000" w:firstRow="0" w:lastRow="0" w:firstColumn="0" w:lastColumn="0" w:oddVBand="0" w:evenVBand="0" w:oddHBand="0" w:evenHBand="0" w:firstRowFirstColumn="0" w:firstRowLastColumn="0" w:lastRowFirstColumn="0" w:lastRowLastColumn="0"/>
             </w:pPr>
             <w:r>
@@ -6566,10 +6912,11 @@
         <w:tc>
           <w:tcPr>
             <w:tcW w:w="0" w:type="auto"/>
-            <w:vAlign w:val="top"/>
-          </w:tcPr>
-          <w:p>
-            <w:pPr>
+          </w:tcPr>
+          <w:p>
+            <w:pPr>
+              <w:ind w:firstLine="0"/>
+              <w:jc w:val="center"/>
               <w:cnfStyle w:val="000000000000" w:firstRow="0" w:lastRow="0" w:firstColumn="0" w:lastColumn="0" w:oddVBand="0" w:evenVBand="0" w:oddHBand="0" w:evenHBand="0" w:firstRowFirstColumn="0" w:firstRowLastColumn="0" w:lastRowFirstColumn="0" w:lastRowLastColumn="0"/>
             </w:pPr>
             <w:r>
@@ -6583,9 +6930,11 @@
           <w:tcPr>
             <w:cnfStyle w:val="001000000000" w:firstRow="0" w:lastRow="0" w:firstColumn="1" w:lastColumn="0" w:oddVBand="0" w:evenVBand="0" w:oddHBand="0" w:evenHBand="0" w:firstRowFirstColumn="0" w:firstRowLastColumn="0" w:lastRowFirstColumn="0" w:lastRowLastColumn="0"/>
             <w:tcW w:w="0" w:type="auto"/>
-            <w:vAlign w:val="top"/>
-          </w:tcPr>
-          <w:p>
+          </w:tcPr>
+          <w:p>
+            <w:pPr>
+              <w:ind w:firstLine="0"/>
+            </w:pPr>
             <w:r>
               <w:t>3</w:t>
             </w:r>
@@ -6594,10 +6943,11 @@
         <w:tc>
           <w:tcPr>
             <w:tcW w:w="0" w:type="auto"/>
-            <w:vAlign w:val="top"/>
-          </w:tcPr>
-          <w:p>
-            <w:pPr>
+          </w:tcPr>
+          <w:p>
+            <w:pPr>
+              <w:ind w:firstLine="0"/>
+              <w:jc w:val="center"/>
               <w:cnfStyle w:val="000000000000" w:firstRow="0" w:lastRow="0" w:firstColumn="0" w:lastColumn="0" w:oddVBand="0" w:evenVBand="0" w:oddHBand="0" w:evenHBand="0" w:firstRowFirstColumn="0" w:firstRowLastColumn="0" w:lastRowFirstColumn="0" w:lastRowLastColumn="0"/>
             </w:pPr>
             <w:r>
@@ -6608,10 +6958,11 @@
         <w:tc>
           <w:tcPr>
             <w:tcW w:w="0" w:type="auto"/>
-            <w:vAlign w:val="top"/>
-          </w:tcPr>
-          <w:p>
-            <w:pPr>
+          </w:tcPr>
+          <w:p>
+            <w:pPr>
+              <w:ind w:firstLine="0"/>
+              <w:jc w:val="center"/>
               <w:cnfStyle w:val="000000000000" w:firstRow="0" w:lastRow="0" w:firstColumn="0" w:lastColumn="0" w:oddVBand="0" w:evenVBand="0" w:oddHBand="0" w:evenHBand="0" w:firstRowFirstColumn="0" w:firstRowLastColumn="0" w:lastRowFirstColumn="0" w:lastRowLastColumn="0"/>
             </w:pPr>
             <w:r>
@@ -6622,10 +6973,10 @@
         <w:tc>
           <w:tcPr>
             <w:tcW w:w="0" w:type="auto"/>
-            <w:vAlign w:val="top"/>
-          </w:tcPr>
-          <w:p>
-            <w:pPr>
+          </w:tcPr>
+          <w:p>
+            <w:pPr>
+              <w:jc w:val="center"/>
               <w:cnfStyle w:val="000000000000" w:firstRow="0" w:lastRow="0" w:firstColumn="0" w:lastColumn="0" w:oddVBand="0" w:evenVBand="0" w:oddHBand="0" w:evenHBand="0" w:firstRowFirstColumn="0" w:firstRowLastColumn="0" w:lastRowFirstColumn="0" w:lastRowLastColumn="0"/>
             </w:pPr>
             <w:r>
@@ -6636,10 +6987,11 @@
         <w:tc>
           <w:tcPr>
             <w:tcW w:w="0" w:type="auto"/>
-            <w:vAlign w:val="top"/>
-          </w:tcPr>
-          <w:p>
-            <w:pPr>
+          </w:tcPr>
+          <w:p>
+            <w:pPr>
+              <w:ind w:firstLine="0"/>
+              <w:jc w:val="center"/>
               <w:cnfStyle w:val="000000000000" w:firstRow="0" w:lastRow="0" w:firstColumn="0" w:lastColumn="0" w:oddVBand="0" w:evenVBand="0" w:oddHBand="0" w:evenHBand="0" w:firstRowFirstColumn="0" w:firstRowLastColumn="0" w:lastRowFirstColumn="0" w:lastRowLastColumn="0"/>
             </w:pPr>
             <w:r>
@@ -6653,9 +7005,11 @@
           <w:tcPr>
             <w:cnfStyle w:val="001000000000" w:firstRow="0" w:lastRow="0" w:firstColumn="1" w:lastColumn="0" w:oddVBand="0" w:evenVBand="0" w:oddHBand="0" w:evenHBand="0" w:firstRowFirstColumn="0" w:firstRowLastColumn="0" w:lastRowFirstColumn="0" w:lastRowLastColumn="0"/>
             <w:tcW w:w="0" w:type="auto"/>
-            <w:vAlign w:val="top"/>
-          </w:tcPr>
-          <w:p>
+          </w:tcPr>
+          <w:p>
+            <w:pPr>
+              <w:ind w:firstLine="0"/>
+            </w:pPr>
             <w:r>
               <w:t>4</w:t>
             </w:r>
@@ -6664,10 +7018,11 @@
         <w:tc>
           <w:tcPr>
             <w:tcW w:w="0" w:type="auto"/>
-            <w:vAlign w:val="top"/>
-          </w:tcPr>
-          <w:p>
-            <w:pPr>
+          </w:tcPr>
+          <w:p>
+            <w:pPr>
+              <w:ind w:firstLine="0"/>
+              <w:jc w:val="center"/>
               <w:cnfStyle w:val="000000000000" w:firstRow="0" w:lastRow="0" w:firstColumn="0" w:lastColumn="0" w:oddVBand="0" w:evenVBand="0" w:oddHBand="0" w:evenHBand="0" w:firstRowFirstColumn="0" w:firstRowLastColumn="0" w:lastRowFirstColumn="0" w:lastRowLastColumn="0"/>
             </w:pPr>
             <w:r>
@@ -6678,10 +7033,11 @@
         <w:tc>
           <w:tcPr>
             <w:tcW w:w="0" w:type="auto"/>
-            <w:vAlign w:val="top"/>
-          </w:tcPr>
-          <w:p>
-            <w:pPr>
+          </w:tcPr>
+          <w:p>
+            <w:pPr>
+              <w:ind w:firstLine="0"/>
+              <w:jc w:val="center"/>
               <w:cnfStyle w:val="000000000000" w:firstRow="0" w:lastRow="0" w:firstColumn="0" w:lastColumn="0" w:oddVBand="0" w:evenVBand="0" w:oddHBand="0" w:evenHBand="0" w:firstRowFirstColumn="0" w:firstRowLastColumn="0" w:lastRowFirstColumn="0" w:lastRowLastColumn="0"/>
             </w:pPr>
             <w:r>
@@ -6692,10 +7048,11 @@
         <w:tc>
           <w:tcPr>
             <w:tcW w:w="0" w:type="auto"/>
-            <w:vAlign w:val="top"/>
-          </w:tcPr>
-          <w:p>
-            <w:pPr>
+          </w:tcPr>
+          <w:p>
+            <w:pPr>
+              <w:ind w:firstLine="0"/>
+              <w:jc w:val="center"/>
               <w:cnfStyle w:val="000000000000" w:firstRow="0" w:lastRow="0" w:firstColumn="0" w:lastColumn="0" w:oddVBand="0" w:evenVBand="0" w:oddHBand="0" w:evenHBand="0" w:firstRowFirstColumn="0" w:firstRowLastColumn="0" w:lastRowFirstColumn="0" w:lastRowLastColumn="0"/>
             </w:pPr>
             <w:r>
@@ -6706,10 +7063,11 @@
         <w:tc>
           <w:tcPr>
             <w:tcW w:w="0" w:type="auto"/>
-            <w:vAlign w:val="top"/>
-          </w:tcPr>
-          <w:p>
-            <w:pPr>
+          </w:tcPr>
+          <w:p>
+            <w:pPr>
+              <w:ind w:firstLine="0"/>
+              <w:jc w:val="center"/>
               <w:cnfStyle w:val="000000000000" w:firstRow="0" w:lastRow="0" w:firstColumn="0" w:lastColumn="0" w:oddVBand="0" w:evenVBand="0" w:oddHBand="0" w:evenHBand="0" w:firstRowFirstColumn="0" w:firstRowLastColumn="0" w:lastRowFirstColumn="0" w:lastRowLastColumn="0"/>
             </w:pPr>
             <w:r>
@@ -6723,10 +7081,13 @@
           <w:tcPr>
             <w:cnfStyle w:val="001000000000" w:firstRow="0" w:lastRow="0" w:firstColumn="1" w:lastColumn="0" w:oddVBand="0" w:evenVBand="0" w:oddHBand="0" w:evenHBand="0" w:firstRowFirstColumn="0" w:firstRowLastColumn="0" w:lastRowFirstColumn="0" w:lastRowLastColumn="0"/>
             <w:tcW w:w="0" w:type="auto"/>
-            <w:vAlign w:val="top"/>
-          </w:tcPr>
-          <w:p>
-            <w:r>
+          </w:tcPr>
+          <w:p>
+            <w:pPr>
+              <w:ind w:firstLine="0"/>
+            </w:pPr>
+            <w:r>
+              <w:lastRenderedPageBreak/>
               <w:t>5</w:t>
             </w:r>
           </w:p>
@@ -6734,10 +7095,11 @@
         <w:tc>
           <w:tcPr>
             <w:tcW w:w="0" w:type="auto"/>
-            <w:vAlign w:val="top"/>
-          </w:tcPr>
-          <w:p>
-            <w:pPr>
+          </w:tcPr>
+          <w:p>
+            <w:pPr>
+              <w:ind w:firstLine="0"/>
+              <w:jc w:val="center"/>
               <w:cnfStyle w:val="000000000000" w:firstRow="0" w:lastRow="0" w:firstColumn="0" w:lastColumn="0" w:oddVBand="0" w:evenVBand="0" w:oddHBand="0" w:evenHBand="0" w:firstRowFirstColumn="0" w:firstRowLastColumn="0" w:lastRowFirstColumn="0" w:lastRowLastColumn="0"/>
             </w:pPr>
             <w:r>
@@ -6748,10 +7110,11 @@
         <w:tc>
           <w:tcPr>
             <w:tcW w:w="0" w:type="auto"/>
-            <w:vAlign w:val="top"/>
-          </w:tcPr>
-          <w:p>
-            <w:pPr>
+          </w:tcPr>
+          <w:p>
+            <w:pPr>
+              <w:ind w:firstLine="0"/>
+              <w:jc w:val="center"/>
               <w:cnfStyle w:val="000000000000" w:firstRow="0" w:lastRow="0" w:firstColumn="0" w:lastColumn="0" w:oddVBand="0" w:evenVBand="0" w:oddHBand="0" w:evenHBand="0" w:firstRowFirstColumn="0" w:firstRowLastColumn="0" w:lastRowFirstColumn="0" w:lastRowLastColumn="0"/>
             </w:pPr>
             <w:r>
@@ -6762,10 +7125,11 @@
         <w:tc>
           <w:tcPr>
             <w:tcW w:w="0" w:type="auto"/>
-            <w:vAlign w:val="top"/>
-          </w:tcPr>
-          <w:p>
-            <w:pPr>
+          </w:tcPr>
+          <w:p>
+            <w:pPr>
+              <w:ind w:firstLine="0"/>
+              <w:jc w:val="center"/>
               <w:cnfStyle w:val="000000000000" w:firstRow="0" w:lastRow="0" w:firstColumn="0" w:lastColumn="0" w:oddVBand="0" w:evenVBand="0" w:oddHBand="0" w:evenHBand="0" w:firstRowFirstColumn="0" w:firstRowLastColumn="0" w:lastRowFirstColumn="0" w:lastRowLastColumn="0"/>
             </w:pPr>
             <w:r>
@@ -6776,10 +7140,11 @@
         <w:tc>
           <w:tcPr>
             <w:tcW w:w="0" w:type="auto"/>
-            <w:vAlign w:val="top"/>
-          </w:tcPr>
-          <w:p>
-            <w:pPr>
+          </w:tcPr>
+          <w:p>
+            <w:pPr>
+              <w:ind w:firstLine="0"/>
+              <w:jc w:val="center"/>
               <w:cnfStyle w:val="000000000000" w:firstRow="0" w:lastRow="0" w:firstColumn="0" w:lastColumn="0" w:oddVBand="0" w:evenVBand="0" w:oddHBand="0" w:evenHBand="0" w:firstRowFirstColumn="0" w:firstRowLastColumn="0" w:lastRowFirstColumn="0" w:lastRowLastColumn="0"/>
             </w:pPr>
             <w:r>
@@ -6793,9 +7158,11 @@
           <w:tcPr>
             <w:cnfStyle w:val="001000000000" w:firstRow="0" w:lastRow="0" w:firstColumn="1" w:lastColumn="0" w:oddVBand="0" w:evenVBand="0" w:oddHBand="0" w:evenHBand="0" w:firstRowFirstColumn="0" w:firstRowLastColumn="0" w:lastRowFirstColumn="0" w:lastRowLastColumn="0"/>
             <w:tcW w:w="0" w:type="auto"/>
-            <w:vAlign w:val="top"/>
-          </w:tcPr>
-          <w:p>
+          </w:tcPr>
+          <w:p>
+            <w:pPr>
+              <w:ind w:firstLine="0"/>
+            </w:pPr>
             <w:r>
               <w:t>6</w:t>
             </w:r>
@@ -6804,10 +7171,11 @@
         <w:tc>
           <w:tcPr>
             <w:tcW w:w="0" w:type="auto"/>
-            <w:vAlign w:val="top"/>
-          </w:tcPr>
-          <w:p>
-            <w:pPr>
+          </w:tcPr>
+          <w:p>
+            <w:pPr>
+              <w:ind w:firstLine="0"/>
+              <w:jc w:val="center"/>
               <w:cnfStyle w:val="000000000000" w:firstRow="0" w:lastRow="0" w:firstColumn="0" w:lastColumn="0" w:oddVBand="0" w:evenVBand="0" w:oddHBand="0" w:evenHBand="0" w:firstRowFirstColumn="0" w:firstRowLastColumn="0" w:lastRowFirstColumn="0" w:lastRowLastColumn="0"/>
             </w:pPr>
             <w:r>
@@ -6818,10 +7186,11 @@
         <w:tc>
           <w:tcPr>
             <w:tcW w:w="0" w:type="auto"/>
-            <w:vAlign w:val="top"/>
-          </w:tcPr>
-          <w:p>
-            <w:pPr>
+          </w:tcPr>
+          <w:p>
+            <w:pPr>
+              <w:ind w:firstLine="0"/>
+              <w:jc w:val="center"/>
               <w:cnfStyle w:val="000000000000" w:firstRow="0" w:lastRow="0" w:firstColumn="0" w:lastColumn="0" w:oddVBand="0" w:evenVBand="0" w:oddHBand="0" w:evenHBand="0" w:firstRowFirstColumn="0" w:firstRowLastColumn="0" w:lastRowFirstColumn="0" w:lastRowLastColumn="0"/>
             </w:pPr>
             <w:r>
@@ -6832,10 +7201,11 @@
         <w:tc>
           <w:tcPr>
             <w:tcW w:w="0" w:type="auto"/>
-            <w:vAlign w:val="top"/>
-          </w:tcPr>
-          <w:p>
-            <w:pPr>
+          </w:tcPr>
+          <w:p>
+            <w:pPr>
+              <w:ind w:firstLine="0"/>
+              <w:jc w:val="center"/>
               <w:cnfStyle w:val="000000000000" w:firstRow="0" w:lastRow="0" w:firstColumn="0" w:lastColumn="0" w:oddVBand="0" w:evenVBand="0" w:oddHBand="0" w:evenHBand="0" w:firstRowFirstColumn="0" w:firstRowLastColumn="0" w:lastRowFirstColumn="0" w:lastRowLastColumn="0"/>
             </w:pPr>
             <w:r>
@@ -6846,10 +7216,11 @@
         <w:tc>
           <w:tcPr>
             <w:tcW w:w="0" w:type="auto"/>
-            <w:vAlign w:val="top"/>
-          </w:tcPr>
-          <w:p>
-            <w:pPr>
+          </w:tcPr>
+          <w:p>
+            <w:pPr>
+              <w:ind w:firstLine="0"/>
+              <w:jc w:val="center"/>
               <w:cnfStyle w:val="000000000000" w:firstRow="0" w:lastRow="0" w:firstColumn="0" w:lastColumn="0" w:oddVBand="0" w:evenVBand="0" w:oddHBand="0" w:evenHBand="0" w:firstRowFirstColumn="0" w:firstRowLastColumn="0" w:lastRowFirstColumn="0" w:lastRowLastColumn="0"/>
             </w:pPr>
             <w:r>
@@ -6863,9 +7234,11 @@
           <w:tcPr>
             <w:cnfStyle w:val="001000000000" w:firstRow="0" w:lastRow="0" w:firstColumn="1" w:lastColumn="0" w:oddVBand="0" w:evenVBand="0" w:oddHBand="0" w:evenHBand="0" w:firstRowFirstColumn="0" w:firstRowLastColumn="0" w:lastRowFirstColumn="0" w:lastRowLastColumn="0"/>
             <w:tcW w:w="0" w:type="auto"/>
-            <w:vAlign w:val="top"/>
-          </w:tcPr>
-          <w:p>
+          </w:tcPr>
+          <w:p>
+            <w:pPr>
+              <w:ind w:firstLine="0"/>
+            </w:pPr>
             <w:r>
               <w:t>7</w:t>
             </w:r>
@@ -6874,10 +7247,11 @@
         <w:tc>
           <w:tcPr>
             <w:tcW w:w="0" w:type="auto"/>
-            <w:vAlign w:val="top"/>
-          </w:tcPr>
-          <w:p>
-            <w:pPr>
+          </w:tcPr>
+          <w:p>
+            <w:pPr>
+              <w:ind w:firstLine="0"/>
+              <w:jc w:val="center"/>
               <w:cnfStyle w:val="000000000000" w:firstRow="0" w:lastRow="0" w:firstColumn="0" w:lastColumn="0" w:oddVBand="0" w:evenVBand="0" w:oddHBand="0" w:evenHBand="0" w:firstRowFirstColumn="0" w:firstRowLastColumn="0" w:lastRowFirstColumn="0" w:lastRowLastColumn="0"/>
             </w:pPr>
             <w:r>
@@ -6888,10 +7262,11 @@
         <w:tc>
           <w:tcPr>
             <w:tcW w:w="0" w:type="auto"/>
-            <w:vAlign w:val="top"/>
-          </w:tcPr>
-          <w:p>
-            <w:pPr>
+          </w:tcPr>
+          <w:p>
+            <w:pPr>
+              <w:ind w:firstLine="0"/>
+              <w:jc w:val="center"/>
               <w:cnfStyle w:val="000000000000" w:firstRow="0" w:lastRow="0" w:firstColumn="0" w:lastColumn="0" w:oddVBand="0" w:evenVBand="0" w:oddHBand="0" w:evenHBand="0" w:firstRowFirstColumn="0" w:firstRowLastColumn="0" w:lastRowFirstColumn="0" w:lastRowLastColumn="0"/>
             </w:pPr>
             <w:r>
@@ -6902,10 +7277,11 @@
         <w:tc>
           <w:tcPr>
             <w:tcW w:w="0" w:type="auto"/>
-            <w:vAlign w:val="top"/>
-          </w:tcPr>
-          <w:p>
-            <w:pPr>
+          </w:tcPr>
+          <w:p>
+            <w:pPr>
+              <w:ind w:firstLine="0"/>
+              <w:jc w:val="center"/>
               <w:cnfStyle w:val="000000000000" w:firstRow="0" w:lastRow="0" w:firstColumn="0" w:lastColumn="0" w:oddVBand="0" w:evenVBand="0" w:oddHBand="0" w:evenHBand="0" w:firstRowFirstColumn="0" w:firstRowLastColumn="0" w:lastRowFirstColumn="0" w:lastRowLastColumn="0"/>
             </w:pPr>
             <w:r>
@@ -6916,18 +7292,15 @@
         <w:tc>
           <w:tcPr>
             <w:tcW w:w="0" w:type="auto"/>
-            <w:vAlign w:val="top"/>
-          </w:tcPr>
-          <w:p>
-            <w:pPr>
-              <w:cnfStyle w:val="000000000000" w:firstRow="0" w:lastRow="0" w:firstColumn="0" w:lastColumn="0" w:oddVBand="0" w:evenVBand="0" w:oddHBand="0" w:evenHBand="0" w:firstRowFirstColumn="0" w:firstRowLastColumn="0" w:lastRowFirstColumn="0" w:lastRowLastColumn="0"/>
-            </w:pPr>
-            <w:r>
-              <w:t xml:space="preserve">Mã đơn vị </w:t>
-            </w:r>
-            <w:r>
-              <w:lastRenderedPageBreak/>
-              <w:t>vận chuyển</w:t>
+          </w:tcPr>
+          <w:p>
+            <w:pPr>
+              <w:ind w:firstLine="0"/>
+              <w:jc w:val="center"/>
+              <w:cnfStyle w:val="000000000000" w:firstRow="0" w:lastRow="0" w:firstColumn="0" w:lastColumn="0" w:oddVBand="0" w:evenVBand="0" w:oddHBand="0" w:evenHBand="0" w:firstRowFirstColumn="0" w:firstRowLastColumn="0" w:lastRowFirstColumn="0" w:lastRowLastColumn="0"/>
+            </w:pPr>
+            <w:r>
+              <w:t>Mã đơn vị vận chuyển</w:t>
             </w:r>
           </w:p>
         </w:tc>
@@ -6938,7 +7311,6 @@
         <w:pStyle w:val="Heading3"/>
       </w:pPr>
       <w:r>
-        <w:lastRenderedPageBreak/>
         <w:t>Chi tiết đơn hàng</w:t>
       </w:r>
     </w:p>
@@ -6973,21 +7345,32 @@
           <w:tcPr>
             <w:cnfStyle w:val="001000000000" w:firstRow="0" w:lastRow="0" w:firstColumn="1" w:lastColumn="0" w:oddVBand="0" w:evenVBand="0" w:oddHBand="0" w:evenHBand="0" w:firstRowFirstColumn="0" w:firstRowLastColumn="0" w:lastRowFirstColumn="0" w:lastRowLastColumn="0"/>
             <w:tcW w:w="708" w:type="dxa"/>
-            <w:vAlign w:val="top"/>
-          </w:tcPr>
-          <w:p>
-            <w:r>
-              <w:t>STT</w:t>
+          </w:tcPr>
+          <w:p>
+            <w:r>
+              <w:rPr>
+                <w:lang w:val="en-US"/>
+              </w:rPr>
+              <w:t>S</w:t>
+            </w:r>
+            <w:r>
+              <w:rPr>
+                <w:lang w:val="en-US"/>
+              </w:rPr>
+              <w:t>S</w:t>
+            </w:r>
+            <w:r>
+              <w:t>TT</w:t>
             </w:r>
           </w:p>
         </w:tc>
         <w:tc>
           <w:tcPr>
             <w:tcW w:w="1849" w:type="dxa"/>
-            <w:vAlign w:val="top"/>
-          </w:tcPr>
-          <w:p>
-            <w:pPr>
+          </w:tcPr>
+          <w:p>
+            <w:pPr>
+              <w:ind w:firstLine="0"/>
               <w:cnfStyle w:val="100000000000" w:firstRow="1" w:lastRow="0" w:firstColumn="0" w:lastColumn="0" w:oddVBand="0" w:evenVBand="0" w:oddHBand="0" w:evenHBand="0" w:firstRowFirstColumn="0" w:firstRowLastColumn="0" w:lastRowFirstColumn="0" w:lastRowLastColumn="0"/>
             </w:pPr>
             <w:r>
@@ -6998,10 +7381,10 @@
         <w:tc>
           <w:tcPr>
             <w:tcW w:w="2168" w:type="dxa"/>
-            <w:vAlign w:val="top"/>
-          </w:tcPr>
-          <w:p>
-            <w:pPr>
+          </w:tcPr>
+          <w:p>
+            <w:pPr>
+              <w:ind w:firstLine="0"/>
               <w:cnfStyle w:val="100000000000" w:firstRow="1" w:lastRow="0" w:firstColumn="0" w:lastColumn="0" w:oddVBand="0" w:evenVBand="0" w:oddHBand="0" w:evenHBand="0" w:firstRowFirstColumn="0" w:firstRowLastColumn="0" w:lastRowFirstColumn="0" w:lastRowLastColumn="0"/>
             </w:pPr>
             <w:r>
@@ -7012,10 +7395,10 @@
         <w:tc>
           <w:tcPr>
             <w:tcW w:w="2216" w:type="dxa"/>
-            <w:vAlign w:val="top"/>
-          </w:tcPr>
-          <w:p>
-            <w:pPr>
+          </w:tcPr>
+          <w:p>
+            <w:pPr>
+              <w:ind w:firstLine="0"/>
               <w:cnfStyle w:val="100000000000" w:firstRow="1" w:lastRow="0" w:firstColumn="0" w:lastColumn="0" w:oddVBand="0" w:evenVBand="0" w:oddHBand="0" w:evenHBand="0" w:firstRowFirstColumn="0" w:firstRowLastColumn="0" w:lastRowFirstColumn="0" w:lastRowLastColumn="0"/>
             </w:pPr>
             <w:r>
@@ -7026,7 +7409,6 @@
         <w:tc>
           <w:tcPr>
             <w:tcW w:w="1837" w:type="dxa"/>
-            <w:vAlign w:val="top"/>
           </w:tcPr>
           <w:p>
             <w:pPr>
@@ -7043,9 +7425,11 @@
           <w:tcPr>
             <w:cnfStyle w:val="001000000000" w:firstRow="0" w:lastRow="0" w:firstColumn="1" w:lastColumn="0" w:oddVBand="0" w:evenVBand="0" w:oddHBand="0" w:evenHBand="0" w:firstRowFirstColumn="0" w:firstRowLastColumn="0" w:lastRowFirstColumn="0" w:lastRowLastColumn="0"/>
             <w:tcW w:w="708" w:type="dxa"/>
-            <w:vAlign w:val="top"/>
-          </w:tcPr>
-          <w:p>
+          </w:tcPr>
+          <w:p>
+            <w:pPr>
+              <w:ind w:firstLine="0"/>
+            </w:pPr>
             <w:r>
               <w:t>1</w:t>
             </w:r>
@@ -7054,10 +7438,11 @@
         <w:tc>
           <w:tcPr>
             <w:tcW w:w="1849" w:type="dxa"/>
-            <w:vAlign w:val="top"/>
-          </w:tcPr>
-          <w:p>
-            <w:pPr>
+          </w:tcPr>
+          <w:p>
+            <w:pPr>
+              <w:ind w:firstLine="0"/>
+              <w:jc w:val="center"/>
               <w:cnfStyle w:val="000000000000" w:firstRow="0" w:lastRow="0" w:firstColumn="0" w:lastColumn="0" w:oddVBand="0" w:evenVBand="0" w:oddHBand="0" w:evenHBand="0" w:firstRowFirstColumn="0" w:firstRowLastColumn="0" w:lastRowFirstColumn="0" w:lastRowLastColumn="0"/>
             </w:pPr>
             <w:r>
@@ -7068,10 +7453,11 @@
         <w:tc>
           <w:tcPr>
             <w:tcW w:w="2168" w:type="dxa"/>
-            <w:vAlign w:val="top"/>
-          </w:tcPr>
-          <w:p>
-            <w:pPr>
+          </w:tcPr>
+          <w:p>
+            <w:pPr>
+              <w:ind w:firstLine="0"/>
+              <w:jc w:val="center"/>
               <w:cnfStyle w:val="000000000000" w:firstRow="0" w:lastRow="0" w:firstColumn="0" w:lastColumn="0" w:oddVBand="0" w:evenVBand="0" w:oddHBand="0" w:evenHBand="0" w:firstRowFirstColumn="0" w:firstRowLastColumn="0" w:lastRowFirstColumn="0" w:lastRowLastColumn="0"/>
             </w:pPr>
             <w:r>
@@ -7082,10 +7468,11 @@
         <w:tc>
           <w:tcPr>
             <w:tcW w:w="2216" w:type="dxa"/>
-            <w:vAlign w:val="top"/>
-          </w:tcPr>
-          <w:p>
-            <w:pPr>
+          </w:tcPr>
+          <w:p>
+            <w:pPr>
+              <w:ind w:firstLine="0"/>
+              <w:jc w:val="center"/>
               <w:cnfStyle w:val="000000000000" w:firstRow="0" w:lastRow="0" w:firstColumn="0" w:lastColumn="0" w:oddVBand="0" w:evenVBand="0" w:oddHBand="0" w:evenHBand="0" w:firstRowFirstColumn="0" w:firstRowLastColumn="0" w:lastRowFirstColumn="0" w:lastRowLastColumn="0"/>
             </w:pPr>
             <w:r>
@@ -7096,10 +7483,11 @@
         <w:tc>
           <w:tcPr>
             <w:tcW w:w="1837" w:type="dxa"/>
-            <w:vAlign w:val="top"/>
-          </w:tcPr>
-          <w:p>
-            <w:pPr>
+          </w:tcPr>
+          <w:p>
+            <w:pPr>
+              <w:ind w:firstLine="0"/>
+              <w:jc w:val="center"/>
               <w:cnfStyle w:val="000000000000" w:firstRow="0" w:lastRow="0" w:firstColumn="0" w:lastColumn="0" w:oddVBand="0" w:evenVBand="0" w:oddHBand="0" w:evenHBand="0" w:firstRowFirstColumn="0" w:firstRowLastColumn="0" w:lastRowFirstColumn="0" w:lastRowLastColumn="0"/>
             </w:pPr>
             <w:r>
@@ -7113,9 +7501,11 @@
           <w:tcPr>
             <w:cnfStyle w:val="001000000000" w:firstRow="0" w:lastRow="0" w:firstColumn="1" w:lastColumn="0" w:oddVBand="0" w:evenVBand="0" w:oddHBand="0" w:evenHBand="0" w:firstRowFirstColumn="0" w:firstRowLastColumn="0" w:lastRowFirstColumn="0" w:lastRowLastColumn="0"/>
             <w:tcW w:w="708" w:type="dxa"/>
-            <w:vAlign w:val="top"/>
-          </w:tcPr>
-          <w:p>
+          </w:tcPr>
+          <w:p>
+            <w:pPr>
+              <w:ind w:firstLine="0"/>
+            </w:pPr>
             <w:r>
               <w:t>2</w:t>
             </w:r>
@@ -7124,10 +7514,11 @@
         <w:tc>
           <w:tcPr>
             <w:tcW w:w="1849" w:type="dxa"/>
-            <w:vAlign w:val="top"/>
-          </w:tcPr>
-          <w:p>
-            <w:pPr>
+          </w:tcPr>
+          <w:p>
+            <w:pPr>
+              <w:ind w:firstLine="0"/>
+              <w:jc w:val="center"/>
               <w:cnfStyle w:val="000000000000" w:firstRow="0" w:lastRow="0" w:firstColumn="0" w:lastColumn="0" w:oddVBand="0" w:evenVBand="0" w:oddHBand="0" w:evenHBand="0" w:firstRowFirstColumn="0" w:firstRowLastColumn="0" w:lastRowFirstColumn="0" w:lastRowLastColumn="0"/>
             </w:pPr>
             <w:r>
@@ -7138,10 +7529,11 @@
         <w:tc>
           <w:tcPr>
             <w:tcW w:w="2168" w:type="dxa"/>
-            <w:vAlign w:val="top"/>
-          </w:tcPr>
-          <w:p>
-            <w:pPr>
+          </w:tcPr>
+          <w:p>
+            <w:pPr>
+              <w:ind w:firstLine="0"/>
+              <w:jc w:val="center"/>
               <w:cnfStyle w:val="000000000000" w:firstRow="0" w:lastRow="0" w:firstColumn="0" w:lastColumn="0" w:oddVBand="0" w:evenVBand="0" w:oddHBand="0" w:evenHBand="0" w:firstRowFirstColumn="0" w:firstRowLastColumn="0" w:lastRowFirstColumn="0" w:lastRowLastColumn="0"/>
             </w:pPr>
             <w:r>
@@ -7152,10 +7544,11 @@
         <w:tc>
           <w:tcPr>
             <w:tcW w:w="2216" w:type="dxa"/>
-            <w:vAlign w:val="top"/>
-          </w:tcPr>
-          <w:p>
-            <w:pPr>
+          </w:tcPr>
+          <w:p>
+            <w:pPr>
+              <w:ind w:firstLine="0"/>
+              <w:jc w:val="center"/>
               <w:cnfStyle w:val="000000000000" w:firstRow="0" w:lastRow="0" w:firstColumn="0" w:lastColumn="0" w:oddVBand="0" w:evenVBand="0" w:oddHBand="0" w:evenHBand="0" w:firstRowFirstColumn="0" w:firstRowLastColumn="0" w:lastRowFirstColumn="0" w:lastRowLastColumn="0"/>
             </w:pPr>
             <w:r>
@@ -7166,10 +7559,11 @@
         <w:tc>
           <w:tcPr>
             <w:tcW w:w="1837" w:type="dxa"/>
-            <w:vAlign w:val="top"/>
-          </w:tcPr>
-          <w:p>
-            <w:pPr>
+          </w:tcPr>
+          <w:p>
+            <w:pPr>
+              <w:ind w:firstLine="0"/>
+              <w:jc w:val="center"/>
               <w:cnfStyle w:val="000000000000" w:firstRow="0" w:lastRow="0" w:firstColumn="0" w:lastColumn="0" w:oddVBand="0" w:evenVBand="0" w:oddHBand="0" w:evenHBand="0" w:firstRowFirstColumn="0" w:firstRowLastColumn="0" w:lastRowFirstColumn="0" w:lastRowLastColumn="0"/>
             </w:pPr>
             <w:r>
@@ -7183,9 +7577,11 @@
           <w:tcPr>
             <w:cnfStyle w:val="001000000000" w:firstRow="0" w:lastRow="0" w:firstColumn="1" w:lastColumn="0" w:oddVBand="0" w:evenVBand="0" w:oddHBand="0" w:evenHBand="0" w:firstRowFirstColumn="0" w:firstRowLastColumn="0" w:lastRowFirstColumn="0" w:lastRowLastColumn="0"/>
             <w:tcW w:w="708" w:type="dxa"/>
-            <w:vAlign w:val="top"/>
-          </w:tcPr>
-          <w:p>
+          </w:tcPr>
+          <w:p>
+            <w:pPr>
+              <w:ind w:firstLine="0"/>
+            </w:pPr>
             <w:r>
               <w:t>3</w:t>
             </w:r>
@@ -7194,10 +7590,11 @@
         <w:tc>
           <w:tcPr>
             <w:tcW w:w="1849" w:type="dxa"/>
-            <w:vAlign w:val="top"/>
-          </w:tcPr>
-          <w:p>
-            <w:pPr>
+          </w:tcPr>
+          <w:p>
+            <w:pPr>
+              <w:ind w:firstLine="0"/>
+              <w:jc w:val="center"/>
               <w:cnfStyle w:val="000000000000" w:firstRow="0" w:lastRow="0" w:firstColumn="0" w:lastColumn="0" w:oddVBand="0" w:evenVBand="0" w:oddHBand="0" w:evenHBand="0" w:firstRowFirstColumn="0" w:firstRowLastColumn="0" w:lastRowFirstColumn="0" w:lastRowLastColumn="0"/>
             </w:pPr>
             <w:r>
@@ -7208,10 +7605,11 @@
         <w:tc>
           <w:tcPr>
             <w:tcW w:w="2168" w:type="dxa"/>
-            <w:vAlign w:val="top"/>
-          </w:tcPr>
-          <w:p>
-            <w:pPr>
+          </w:tcPr>
+          <w:p>
+            <w:pPr>
+              <w:ind w:firstLine="0"/>
+              <w:jc w:val="center"/>
               <w:cnfStyle w:val="000000000000" w:firstRow="0" w:lastRow="0" w:firstColumn="0" w:lastColumn="0" w:oddVBand="0" w:evenVBand="0" w:oddHBand="0" w:evenHBand="0" w:firstRowFirstColumn="0" w:firstRowLastColumn="0" w:lastRowFirstColumn="0" w:lastRowLastColumn="0"/>
             </w:pPr>
             <w:r>
@@ -7222,10 +7620,11 @@
         <w:tc>
           <w:tcPr>
             <w:tcW w:w="2216" w:type="dxa"/>
-            <w:vAlign w:val="top"/>
-          </w:tcPr>
-          <w:p>
-            <w:pPr>
+          </w:tcPr>
+          <w:p>
+            <w:pPr>
+              <w:ind w:firstLine="0"/>
+              <w:jc w:val="center"/>
               <w:cnfStyle w:val="000000000000" w:firstRow="0" w:lastRow="0" w:firstColumn="0" w:lastColumn="0" w:oddVBand="0" w:evenVBand="0" w:oddHBand="0" w:evenHBand="0" w:firstRowFirstColumn="0" w:firstRowLastColumn="0" w:lastRowFirstColumn="0" w:lastRowLastColumn="0"/>
             </w:pPr>
             <w:r>
@@ -7236,10 +7635,11 @@
         <w:tc>
           <w:tcPr>
             <w:tcW w:w="1837" w:type="dxa"/>
-            <w:vAlign w:val="top"/>
-          </w:tcPr>
-          <w:p>
-            <w:pPr>
+          </w:tcPr>
+          <w:p>
+            <w:pPr>
+              <w:ind w:firstLine="0"/>
+              <w:jc w:val="center"/>
               <w:cnfStyle w:val="000000000000" w:firstRow="0" w:lastRow="0" w:firstColumn="0" w:lastColumn="0" w:oddVBand="0" w:evenVBand="0" w:oddHBand="0" w:evenHBand="0" w:firstRowFirstColumn="0" w:firstRowLastColumn="0" w:lastRowFirstColumn="0" w:lastRowLastColumn="0"/>
             </w:pPr>
             <w:r>
@@ -7253,9 +7653,11 @@
           <w:tcPr>
             <w:cnfStyle w:val="001000000000" w:firstRow="0" w:lastRow="0" w:firstColumn="1" w:lastColumn="0" w:oddVBand="0" w:evenVBand="0" w:oddHBand="0" w:evenHBand="0" w:firstRowFirstColumn="0" w:firstRowLastColumn="0" w:lastRowFirstColumn="0" w:lastRowLastColumn="0"/>
             <w:tcW w:w="708" w:type="dxa"/>
-            <w:vAlign w:val="top"/>
-          </w:tcPr>
-          <w:p>
+          </w:tcPr>
+          <w:p>
+            <w:pPr>
+              <w:ind w:firstLine="0"/>
+            </w:pPr>
             <w:r>
               <w:t>4</w:t>
             </w:r>
@@ -7264,10 +7666,11 @@
         <w:tc>
           <w:tcPr>
             <w:tcW w:w="1849" w:type="dxa"/>
-            <w:vAlign w:val="top"/>
-          </w:tcPr>
-          <w:p>
-            <w:pPr>
+          </w:tcPr>
+          <w:p>
+            <w:pPr>
+              <w:ind w:firstLine="0"/>
+              <w:jc w:val="center"/>
               <w:cnfStyle w:val="000000000000" w:firstRow="0" w:lastRow="0" w:firstColumn="0" w:lastColumn="0" w:oddVBand="0" w:evenVBand="0" w:oddHBand="0" w:evenHBand="0" w:firstRowFirstColumn="0" w:firstRowLastColumn="0" w:lastRowFirstColumn="0" w:lastRowLastColumn="0"/>
             </w:pPr>
             <w:r>
@@ -7278,10 +7681,11 @@
         <w:tc>
           <w:tcPr>
             <w:tcW w:w="2168" w:type="dxa"/>
-            <w:vAlign w:val="top"/>
-          </w:tcPr>
-          <w:p>
-            <w:pPr>
+          </w:tcPr>
+          <w:p>
+            <w:pPr>
+              <w:ind w:firstLine="0"/>
+              <w:jc w:val="center"/>
               <w:cnfStyle w:val="000000000000" w:firstRow="0" w:lastRow="0" w:firstColumn="0" w:lastColumn="0" w:oddVBand="0" w:evenVBand="0" w:oddHBand="0" w:evenHBand="0" w:firstRowFirstColumn="0" w:firstRowLastColumn="0" w:lastRowFirstColumn="0" w:lastRowLastColumn="0"/>
             </w:pPr>
             <w:r>
@@ -7292,10 +7696,11 @@
         <w:tc>
           <w:tcPr>
             <w:tcW w:w="2216" w:type="dxa"/>
-            <w:vAlign w:val="top"/>
-          </w:tcPr>
-          <w:p>
-            <w:pPr>
+          </w:tcPr>
+          <w:p>
+            <w:pPr>
+              <w:ind w:firstLine="0"/>
+              <w:jc w:val="center"/>
               <w:cnfStyle w:val="000000000000" w:firstRow="0" w:lastRow="0" w:firstColumn="0" w:lastColumn="0" w:oddVBand="0" w:evenVBand="0" w:oddHBand="0" w:evenHBand="0" w:firstRowFirstColumn="0" w:firstRowLastColumn="0" w:lastRowFirstColumn="0" w:lastRowLastColumn="0"/>
             </w:pPr>
             <w:r>
@@ -7306,10 +7711,11 @@
         <w:tc>
           <w:tcPr>
             <w:tcW w:w="1837" w:type="dxa"/>
-            <w:vAlign w:val="top"/>
-          </w:tcPr>
-          <w:p>
-            <w:pPr>
+          </w:tcPr>
+          <w:p>
+            <w:pPr>
+              <w:ind w:firstLine="0"/>
+              <w:jc w:val="center"/>
               <w:cnfStyle w:val="000000000000" w:firstRow="0" w:lastRow="0" w:firstColumn="0" w:lastColumn="0" w:oddVBand="0" w:evenVBand="0" w:oddHBand="0" w:evenHBand="0" w:firstRowFirstColumn="0" w:firstRowLastColumn="0" w:lastRowFirstColumn="0" w:lastRowLastColumn="0"/>
             </w:pPr>
             <w:r>
@@ -7323,9 +7729,11 @@
           <w:tcPr>
             <w:cnfStyle w:val="001000000000" w:firstRow="0" w:lastRow="0" w:firstColumn="1" w:lastColumn="0" w:oddVBand="0" w:evenVBand="0" w:oddHBand="0" w:evenHBand="0" w:firstRowFirstColumn="0" w:firstRowLastColumn="0" w:lastRowFirstColumn="0" w:lastRowLastColumn="0"/>
             <w:tcW w:w="708" w:type="dxa"/>
-            <w:vAlign w:val="top"/>
-          </w:tcPr>
-          <w:p>
+          </w:tcPr>
+          <w:p>
+            <w:pPr>
+              <w:ind w:firstLine="0"/>
+            </w:pPr>
             <w:r>
               <w:t>5</w:t>
             </w:r>
@@ -7334,10 +7742,11 @@
         <w:tc>
           <w:tcPr>
             <w:tcW w:w="1849" w:type="dxa"/>
-            <w:vAlign w:val="top"/>
-          </w:tcPr>
-          <w:p>
-            <w:pPr>
+          </w:tcPr>
+          <w:p>
+            <w:pPr>
+              <w:ind w:firstLine="0"/>
+              <w:jc w:val="center"/>
               <w:cnfStyle w:val="000000000000" w:firstRow="0" w:lastRow="0" w:firstColumn="0" w:lastColumn="0" w:oddVBand="0" w:evenVBand="0" w:oddHBand="0" w:evenHBand="0" w:firstRowFirstColumn="0" w:firstRowLastColumn="0" w:lastRowFirstColumn="0" w:lastRowLastColumn="0"/>
             </w:pPr>
             <w:r>
@@ -7348,10 +7757,11 @@
         <w:tc>
           <w:tcPr>
             <w:tcW w:w="2168" w:type="dxa"/>
-            <w:vAlign w:val="top"/>
-          </w:tcPr>
-          <w:p>
-            <w:pPr>
+          </w:tcPr>
+          <w:p>
+            <w:pPr>
+              <w:ind w:firstLine="0"/>
+              <w:jc w:val="center"/>
               <w:cnfStyle w:val="000000000000" w:firstRow="0" w:lastRow="0" w:firstColumn="0" w:lastColumn="0" w:oddVBand="0" w:evenVBand="0" w:oddHBand="0" w:evenHBand="0" w:firstRowFirstColumn="0" w:firstRowLastColumn="0" w:lastRowFirstColumn="0" w:lastRowLastColumn="0"/>
             </w:pPr>
             <w:r>
@@ -7362,10 +7772,11 @@
         <w:tc>
           <w:tcPr>
             <w:tcW w:w="2216" w:type="dxa"/>
-            <w:vAlign w:val="top"/>
-          </w:tcPr>
-          <w:p>
-            <w:pPr>
+          </w:tcPr>
+          <w:p>
+            <w:pPr>
+              <w:ind w:firstLine="0"/>
+              <w:jc w:val="center"/>
               <w:cnfStyle w:val="000000000000" w:firstRow="0" w:lastRow="0" w:firstColumn="0" w:lastColumn="0" w:oddVBand="0" w:evenVBand="0" w:oddHBand="0" w:evenHBand="0" w:firstRowFirstColumn="0" w:firstRowLastColumn="0" w:lastRowFirstColumn="0" w:lastRowLastColumn="0"/>
             </w:pPr>
             <w:r>
@@ -7376,10 +7787,11 @@
         <w:tc>
           <w:tcPr>
             <w:tcW w:w="1837" w:type="dxa"/>
-            <w:vAlign w:val="top"/>
-          </w:tcPr>
-          <w:p>
-            <w:pPr>
+          </w:tcPr>
+          <w:p>
+            <w:pPr>
+              <w:ind w:firstLine="0"/>
+              <w:jc w:val="center"/>
               <w:cnfStyle w:val="000000000000" w:firstRow="0" w:lastRow="0" w:firstColumn="0" w:lastColumn="0" w:oddVBand="0" w:evenVBand="0" w:oddHBand="0" w:evenHBand="0" w:firstRowFirstColumn="0" w:firstRowLastColumn="0" w:lastRowFirstColumn="0" w:lastRowLastColumn="0"/>
             </w:pPr>
           </w:p>
@@ -7388,6 +7800,9 @@
     </w:tbl>
     <w:p/>
     <w:p>
+      <w:pPr>
+        <w:spacing w:line="360" w:lineRule="auto"/>
+      </w:pPr>
       <w:r>
         <w:t>Các mối quan hệ giữa các thực thể được thiết lập tường minh: Một danh mục chứa nhiều sản phẩm; một nhà cung cấp cung cấp nhiều sản phẩm; một sản phẩm có nhiều ảnh minh họa; một khách hàng có thể đặt nhiều đơn hàng; và một đơn hàng bao gồm nhiều chi tiết sản phẩm. Hệ thống sử dụng khóa chính (PK) và khóa ngoại (FK) kết hợp các ràng buộc toàn vẹn nhằm đảm bảo dữ liệu luôn chính xác và an toàn tuyệt đối trong mọi tình huống vận hành.</w:t>
       </w:r>
@@ -7397,6 +7812,7 @@
         <w:pStyle w:val="Heading2"/>
       </w:pPr>
       <w:r>
+        <w:lastRenderedPageBreak/>
         <w:t>Thiết kế giao diện và luồng tương tác người dùng</w:t>
       </w:r>
     </w:p>
@@ -7410,8 +7826,9 @@
         <w:pStyle w:val="ListParagraph"/>
         <w:numPr>
           <w:ilvl w:val="0"/>
-          <w:numId w:val="33"/>
+          <w:numId w:val="37"/>
         </w:numPr>
+        <w:spacing w:line="360" w:lineRule="auto"/>
       </w:pPr>
       <w:r>
         <w:t>Trang chủ: Trình bày banner quảng cáo, danh mục sản phẩm nổi bật và các sản phẩm bán chạy, hỗ trợ điều hướng nhanh chóng đến các trang chức năng.</w:t>
@@ -7422,11 +7839,11 @@
         <w:pStyle w:val="ListParagraph"/>
         <w:numPr>
           <w:ilvl w:val="0"/>
-          <w:numId w:val="33"/>
+          <w:numId w:val="37"/>
         </w:numPr>
-      </w:pPr>
-      <w:r>
-        <w:lastRenderedPageBreak/>
+        <w:spacing w:line="360" w:lineRule="auto"/>
+      </w:pPr>
+      <w:r>
         <w:t>Trang danh sách sản phẩm: Cung cấp bộ lọc theo danh mục, công cụ tìm kiếm theo tên hoặc mã SKU, hiển thị danh đưới dạng lưới thẻ (Grid card) trực quan.</w:t>
       </w:r>
     </w:p>
@@ -7435,8 +7852,9 @@
         <w:pStyle w:val="ListParagraph"/>
         <w:numPr>
           <w:ilvl w:val="0"/>
-          <w:numId w:val="33"/>
+          <w:numId w:val="37"/>
         </w:numPr>
+        <w:spacing w:line="360" w:lineRule="auto"/>
       </w:pPr>
       <w:r>
         <w:t>Trang chi tiết sản phẩm: Hiển thị hình ảnh kích thước lớn, mô tả chi tiết, giá bán, tình trạng tồn kho và cho phép người dùng lựa chọn số lượng để thêm vào giỏ hàng.</w:t>
@@ -7447,8 +7865,9 @@
         <w:pStyle w:val="ListParagraph"/>
         <w:numPr>
           <w:ilvl w:val="0"/>
-          <w:numId w:val="33"/>
+          <w:numId w:val="37"/>
         </w:numPr>
+        <w:spacing w:line="360" w:lineRule="auto"/>
       </w:pPr>
       <w:r>
         <w:t>Trang giỏ hàng: Liệt kê chi tiết các sản phẩm đã chọn, cho phép cập nhật số lượng, xóa sản phẩm và tự động tổng hợp thành tiền.</w:t>
@@ -7459,8 +7878,9 @@
         <w:pStyle w:val="ListParagraph"/>
         <w:numPr>
           <w:ilvl w:val="0"/>
-          <w:numId w:val="33"/>
+          <w:numId w:val="37"/>
         </w:numPr>
+        <w:spacing w:line="360" w:lineRule="auto"/>
       </w:pPr>
       <w:r>
         <w:t>Trang thanh toán / Đặt hàng: Form nhập thông tin nhận hàng và xác nhận đơn hàng an toàn.</w:t>
@@ -7471,11 +7891,17 @@
         <w:pStyle w:val="ListParagraph"/>
         <w:numPr>
           <w:ilvl w:val="0"/>
-          <w:numId w:val="33"/>
+          <w:numId w:val="37"/>
         </w:numPr>
-      </w:pPr>
-      <w:r>
-        <w:t>Khu vực Quản trị (Admin Dashboard): Bố trí thanh điều hướng sidebar khoa học, cung cấp các bảng dữ liệu quản lý danh mục, sản phẩm, đơn hàng và thống kê trực quan dành riêng cho người quản trị hệ thống.</w:t>
+        <w:spacing w:line="360" w:lineRule="auto"/>
+      </w:pPr>
+      <w:r>
+        <w:t>Khu vực Quản trị (A</w:t>
+      </w:r>
+      <w:bookmarkStart w:id="0" w:name="_GoBack"/>
+      <w:bookmarkEnd w:id="0"/>
+      <w:r>
+        <w:t>dmin Dashboard): Bố trí thanh điều hướng sidebar khoa học, cung cấp các bảng dữ liệu quản lý danh mục, sản phẩm, đơn hàng và thống kê trực quan dành riêng cho người quản trị hệ thống.</w:t>
       </w:r>
     </w:p>
     <w:p>
@@ -7634,7 +8060,7 @@
       <w:rPr>
         <w:noProof/>
       </w:rPr>
-      <w:t>20</w:t>
+      <w:t>24</w:t>
     </w:r>
     <w:r>
       <w:rPr>
@@ -8424,6 +8850,119 @@
     </w:lvl>
   </w:abstractNum>
   <w:abstractNum w:abstractNumId="8">
+    <w:nsid w:val="2CDE7777"/>
+    <w:multiLevelType w:val="hybridMultilevel"/>
+    <w:tmpl w:val="B2FE660A"/>
+    <w:lvl w:ilvl="0" w:tplc="5638FF42">
+      <w:start w:val="1"/>
+      <w:numFmt w:val="bullet"/>
+      <w:lvlText w:val="‐"/>
+      <w:lvlJc w:val="left"/>
+      <w:pPr>
+        <w:ind w:left="1440" w:hanging="360"/>
+      </w:pPr>
+      <w:rPr>
+        <w:rFonts w:ascii="Times New Roman" w:hAnsi="Times New Roman" w:cs="Times New Roman" w:hint="default"/>
+      </w:rPr>
+    </w:lvl>
+    <w:lvl w:ilvl="1" w:tplc="04090003" w:tentative="1">
+      <w:start w:val="1"/>
+      <w:numFmt w:val="bullet"/>
+      <w:lvlText w:val="o"/>
+      <w:lvlJc w:val="left"/>
+      <w:pPr>
+        <w:ind w:left="2160" w:hanging="360"/>
+      </w:pPr>
+      <w:rPr>
+        <w:rFonts w:ascii="Courier New" w:hAnsi="Courier New" w:cs="Courier New" w:hint="default"/>
+      </w:rPr>
+    </w:lvl>
+    <w:lvl w:ilvl="2" w:tplc="04090005" w:tentative="1">
+      <w:start w:val="1"/>
+      <w:numFmt w:val="bullet"/>
+      <w:lvlText w:val=""/>
+      <w:lvlJc w:val="left"/>
+      <w:pPr>
+        <w:ind w:left="2880" w:hanging="360"/>
+      </w:pPr>
+      <w:rPr>
+        <w:rFonts w:ascii="Wingdings" w:hAnsi="Wingdings" w:hint="default"/>
+      </w:rPr>
+    </w:lvl>
+    <w:lvl w:ilvl="3" w:tplc="04090001" w:tentative="1">
+      <w:start w:val="1"/>
+      <w:numFmt w:val="bullet"/>
+      <w:lvlText w:val=""/>
+      <w:lvlJc w:val="left"/>
+      <w:pPr>
+        <w:ind w:left="3600" w:hanging="360"/>
+      </w:pPr>
+      <w:rPr>
+        <w:rFonts w:ascii="Symbol" w:hAnsi="Symbol" w:hint="default"/>
+      </w:rPr>
+    </w:lvl>
+    <w:lvl w:ilvl="4" w:tplc="04090003" w:tentative="1">
+      <w:start w:val="1"/>
+      <w:numFmt w:val="bullet"/>
+      <w:lvlText w:val="o"/>
+      <w:lvlJc w:val="left"/>
+      <w:pPr>
+        <w:ind w:left="4320" w:hanging="360"/>
+      </w:pPr>
+      <w:rPr>
+        <w:rFonts w:ascii="Courier New" w:hAnsi="Courier New" w:cs="Courier New" w:hint="default"/>
+      </w:rPr>
+    </w:lvl>
+    <w:lvl w:ilvl="5" w:tplc="04090005" w:tentative="1">
+      <w:start w:val="1"/>
+      <w:numFmt w:val="bullet"/>
+      <w:lvlText w:val=""/>
+      <w:lvlJc w:val="left"/>
+      <w:pPr>
+        <w:ind w:left="5040" w:hanging="360"/>
+      </w:pPr>
+      <w:rPr>
+        <w:rFonts w:ascii="Wingdings" w:hAnsi="Wingdings" w:hint="default"/>
+      </w:rPr>
+    </w:lvl>
+    <w:lvl w:ilvl="6" w:tplc="04090001" w:tentative="1">
+      <w:start w:val="1"/>
+      <w:numFmt w:val="bullet"/>
+      <w:lvlText w:val=""/>
+      <w:lvlJc w:val="left"/>
+      <w:pPr>
+        <w:ind w:left="5760" w:hanging="360"/>
+      </w:pPr>
+      <w:rPr>
+        <w:rFonts w:ascii="Symbol" w:hAnsi="Symbol" w:hint="default"/>
+      </w:rPr>
+    </w:lvl>
+    <w:lvl w:ilvl="7" w:tplc="04090003" w:tentative="1">
+      <w:start w:val="1"/>
+      <w:numFmt w:val="bullet"/>
+      <w:lvlText w:val="o"/>
+      <w:lvlJc w:val="left"/>
+      <w:pPr>
+        <w:ind w:left="6480" w:hanging="360"/>
+      </w:pPr>
+      <w:rPr>
+        <w:rFonts w:ascii="Courier New" w:hAnsi="Courier New" w:cs="Courier New" w:hint="default"/>
+      </w:rPr>
+    </w:lvl>
+    <w:lvl w:ilvl="8" w:tplc="04090005" w:tentative="1">
+      <w:start w:val="1"/>
+      <w:numFmt w:val="bullet"/>
+      <w:lvlText w:val=""/>
+      <w:lvlJc w:val="left"/>
+      <w:pPr>
+        <w:ind w:left="7200" w:hanging="360"/>
+      </w:pPr>
+      <w:rPr>
+        <w:rFonts w:ascii="Wingdings" w:hAnsi="Wingdings" w:hint="default"/>
+      </w:rPr>
+    </w:lvl>
+  </w:abstractNum>
+  <w:abstractNum w:abstractNumId="9">
     <w:nsid w:val="2F3539A5"/>
     <w:multiLevelType w:val="hybridMultilevel"/>
     <w:tmpl w:val="724EB85A"/>
@@ -8536,7 +9075,7 @@
       </w:rPr>
     </w:lvl>
   </w:abstractNum>
-  <w:abstractNum w:abstractNumId="9">
+  <w:abstractNum w:abstractNumId="10">
     <w:nsid w:val="41F51E5C"/>
     <w:multiLevelType w:val="hybridMultilevel"/>
     <w:tmpl w:val="EDAC83F2"/>
@@ -8622,7 +9161,7 @@
       </w:pPr>
     </w:lvl>
   </w:abstractNum>
-  <w:abstractNum w:abstractNumId="10">
+  <w:abstractNum w:abstractNumId="11">
     <w:nsid w:val="4CF21846"/>
     <w:multiLevelType w:val="hybridMultilevel"/>
     <w:tmpl w:val="DA0A6912"/>
@@ -8735,7 +9274,7 @@
       </w:rPr>
     </w:lvl>
   </w:abstractNum>
-  <w:abstractNum w:abstractNumId="11">
+  <w:abstractNum w:abstractNumId="12">
     <w:nsid w:val="57F27C82"/>
     <w:multiLevelType w:val="multilevel"/>
     <w:tmpl w:val="131466C2"/>
@@ -8867,7 +9406,7 @@
       </w:rPr>
     </w:lvl>
   </w:abstractNum>
-  <w:abstractNum w:abstractNumId="12">
+  <w:abstractNum w:abstractNumId="13">
     <w:nsid w:val="5AD27D0F"/>
     <w:multiLevelType w:val="hybridMultilevel"/>
     <w:tmpl w:val="1492914C"/>
@@ -8980,7 +9519,7 @@
       </w:rPr>
     </w:lvl>
   </w:abstractNum>
-  <w:abstractNum w:abstractNumId="13">
+  <w:abstractNum w:abstractNumId="14">
     <w:nsid w:val="61EA27E8"/>
     <w:multiLevelType w:val="hybridMultilevel"/>
     <w:tmpl w:val="73FAD808"/>
@@ -9093,7 +9632,7 @@
       </w:rPr>
     </w:lvl>
   </w:abstractNum>
-  <w:abstractNum w:abstractNumId="14">
+  <w:abstractNum w:abstractNumId="15">
     <w:nsid w:val="649D264C"/>
     <w:multiLevelType w:val="hybridMultilevel"/>
     <w:tmpl w:val="D4823C80"/>
@@ -9206,7 +9745,7 @@
       </w:rPr>
     </w:lvl>
   </w:abstractNum>
-  <w:abstractNum w:abstractNumId="15">
+  <w:abstractNum w:abstractNumId="16">
     <w:nsid w:val="68C779EF"/>
     <w:multiLevelType w:val="hybridMultilevel"/>
     <w:tmpl w:val="4FBEA876"/>
@@ -9319,7 +9858,7 @@
       </w:rPr>
     </w:lvl>
   </w:abstractNum>
-  <w:abstractNum w:abstractNumId="16">
+  <w:abstractNum w:abstractNumId="17">
     <w:nsid w:val="74DA682E"/>
     <w:multiLevelType w:val="singleLevel"/>
     <w:tmpl w:val="74DA682E"/>
@@ -9339,7 +9878,7 @@
       </w:rPr>
     </w:lvl>
   </w:abstractNum>
-  <w:abstractNum w:abstractNumId="17">
+  <w:abstractNum w:abstractNumId="18">
     <w:nsid w:val="75673B95"/>
     <w:multiLevelType w:val="hybridMultilevel"/>
     <w:tmpl w:val="209C4BC4"/>
@@ -9452,7 +9991,7 @@
       </w:rPr>
     </w:lvl>
   </w:abstractNum>
-  <w:abstractNum w:abstractNumId="18">
+  <w:abstractNum w:abstractNumId="19">
     <w:nsid w:val="79061CA1"/>
     <w:multiLevelType w:val="hybridMultilevel"/>
     <w:tmpl w:val="0EA2BB2A"/>
@@ -9566,7 +10105,7 @@
     </w:lvl>
   </w:abstractNum>
   <w:num w:numId="1">
-    <w:abstractNumId w:val="11"/>
+    <w:abstractNumId w:val="12"/>
   </w:num>
   <w:num w:numId="2">
     <w:abstractNumId w:val="2"/>
@@ -9575,7 +10114,7 @@
     <w:abstractNumId w:val="4"/>
   </w:num>
   <w:num w:numId="4">
-    <w:abstractNumId w:val="16"/>
+    <w:abstractNumId w:val="17"/>
   </w:num>
   <w:num w:numId="5">
     <w:abstractNumId w:val="0"/>
@@ -9593,85 +10132,88 @@
     <w:abstractNumId w:val="6"/>
   </w:num>
   <w:num w:numId="10">
-    <w:abstractNumId w:val="11"/>
+    <w:abstractNumId w:val="12"/>
   </w:num>
   <w:num w:numId="11">
-    <w:abstractNumId w:val="11"/>
+    <w:abstractNumId w:val="12"/>
   </w:num>
   <w:num w:numId="12">
-    <w:abstractNumId w:val="11"/>
+    <w:abstractNumId w:val="12"/>
   </w:num>
   <w:num w:numId="13">
-    <w:abstractNumId w:val="11"/>
+    <w:abstractNumId w:val="12"/>
   </w:num>
   <w:num w:numId="14">
-    <w:abstractNumId w:val="11"/>
+    <w:abstractNumId w:val="12"/>
   </w:num>
   <w:num w:numId="15">
-    <w:abstractNumId w:val="11"/>
+    <w:abstractNumId w:val="12"/>
   </w:num>
   <w:num w:numId="16">
-    <w:abstractNumId w:val="11"/>
+    <w:abstractNumId w:val="12"/>
   </w:num>
   <w:num w:numId="17">
-    <w:abstractNumId w:val="11"/>
+    <w:abstractNumId w:val="12"/>
   </w:num>
   <w:num w:numId="18">
-    <w:abstractNumId w:val="11"/>
+    <w:abstractNumId w:val="12"/>
   </w:num>
   <w:num w:numId="19">
-    <w:abstractNumId w:val="11"/>
+    <w:abstractNumId w:val="12"/>
   </w:num>
   <w:num w:numId="20">
-    <w:abstractNumId w:val="11"/>
+    <w:abstractNumId w:val="12"/>
   </w:num>
   <w:num w:numId="21">
-    <w:abstractNumId w:val="11"/>
+    <w:abstractNumId w:val="12"/>
   </w:num>
   <w:num w:numId="22">
-    <w:abstractNumId w:val="11"/>
+    <w:abstractNumId w:val="12"/>
   </w:num>
   <w:num w:numId="23">
-    <w:abstractNumId w:val="11"/>
+    <w:abstractNumId w:val="12"/>
   </w:num>
   <w:num w:numId="24">
-    <w:abstractNumId w:val="11"/>
+    <w:abstractNumId w:val="12"/>
   </w:num>
   <w:num w:numId="25">
-    <w:abstractNumId w:val="9"/>
+    <w:abstractNumId w:val="10"/>
   </w:num>
   <w:num w:numId="26">
-    <w:abstractNumId w:val="11"/>
+    <w:abstractNumId w:val="12"/>
   </w:num>
   <w:num w:numId="27">
-    <w:abstractNumId w:val="11"/>
+    <w:abstractNumId w:val="12"/>
   </w:num>
   <w:num w:numId="28">
-    <w:abstractNumId w:val="10"/>
+    <w:abstractNumId w:val="11"/>
   </w:num>
   <w:num w:numId="29">
     <w:abstractNumId w:val="5"/>
   </w:num>
   <w:num w:numId="30">
-    <w:abstractNumId w:val="12"/>
+    <w:abstractNumId w:val="13"/>
   </w:num>
   <w:num w:numId="31">
-    <w:abstractNumId w:val="8"/>
+    <w:abstractNumId w:val="9"/>
   </w:num>
   <w:num w:numId="32">
-    <w:abstractNumId w:val="17"/>
+    <w:abstractNumId w:val="18"/>
   </w:num>
   <w:num w:numId="33">
-    <w:abstractNumId w:val="13"/>
+    <w:abstractNumId w:val="14"/>
   </w:num>
   <w:num w:numId="34">
-    <w:abstractNumId w:val="18"/>
+    <w:abstractNumId w:val="19"/>
   </w:num>
   <w:num w:numId="35">
-    <w:abstractNumId w:val="14"/>
+    <w:abstractNumId w:val="15"/>
   </w:num>
   <w:num w:numId="36">
-    <w:abstractNumId w:val="15"/>
+    <w:abstractNumId w:val="16"/>
+  </w:num>
+  <w:num w:numId="37">
+    <w:abstractNumId w:val="8"/>
   </w:num>
 </w:numbering>
 </file>
@@ -10991,7 +11533,7 @@
 </file>
 
 <file path=customXml/itemProps2.xml><?xml version="1.0" encoding="utf-8"?>
-<ds:datastoreItem xmlns:ds="http://schemas.openxmlformats.org/officeDocument/2006/customXml" ds:itemID="{3BBD5921-A535-4B2B-B847-A7747676F1FC}">
+<ds:datastoreItem xmlns:ds="http://schemas.openxmlformats.org/officeDocument/2006/customXml" ds:itemID="{197172DA-6CD1-40AD-8D6D-8EC7ACA1E1EF}">
   <ds:schemaRefs>
     <ds:schemaRef ds:uri="http://schemas.openxmlformats.org/officeDocument/2006/bibliography"/>
   </ds:schemaRefs>

</xml_diff>

<commit_message>
FEAT: Adding in seeding for multi page testing
</commit_message>
<xml_diff>
--- a/doc/110123011 HIEU.docx
+++ b/doc/110123011 HIEU.docx
@@ -987,19 +987,9 @@
       <w:pPr>
         <w:spacing w:line="360" w:lineRule="auto"/>
       </w:pPr>
-    </w:p>
-    <w:p>
-      <w:pPr>
-        <w:spacing w:line="360" w:lineRule="auto"/>
-      </w:pPr>
       <w:r>
         <w:t>REST API nhẹ và JavaScript Fetch: Kết hợp cùng SSR, hệ thống sử dụng các API nhẹ xử lý dữ liệu động bằng JavaScript thuần kết hợp Fetch API nhằm cập nhật trạng thái giao diện linh hoạt (như cập nhật số lượng giỏ hàng, tìm kiếm nhanh sản phẩm) mà không cần tải lại toàn bộ trang.</w:t>
       </w:r>
-    </w:p>
-    <w:p>
-      <w:pPr>
-        <w:spacing w:line="360" w:lineRule="auto"/>
-      </w:pPr>
     </w:p>
     <w:p>
       <w:pPr>
@@ -1101,11 +1091,7 @@
         <w:spacing w:line="360" w:lineRule="auto"/>
       </w:pPr>
       <w:r>
-        <w:t xml:space="preserve">Bootstrap Framework: Là framework CSS mã nguồn mở phổ biến giúp thiết kế giao diện theo mô hình lưới (Grid system) linh hoạt, cung cấp sẵn các thành phần </w:t>
-      </w:r>
-      <w:r>
-        <w:lastRenderedPageBreak/>
-        <w:t>UI (components) thân thiện, trực quan, giúp rút ngắn đáng kể thời gian thiết kế giao diện thương mại điện tử mà vẫn đảm bảo tính thẩm mỹ</w:t>
+        <w:t>Bootstrap Framework: Là framework CSS mã nguồn mở phổ biến giúp thiết kế giao diện theo mô hình lưới (Grid system) linh hoạt, cung cấp sẵn các thành phần UI (components) thân thiện, trực quan, giúp rút ngắn đáng kể thời gian thiết kế giao diện thương mại điện tử mà vẫn đảm bảo tính thẩm mỹ</w:t>
       </w:r>
       <w:r>
         <w:t xml:space="preserve"> và responsive.</w:t>
@@ -1122,6 +1108,7 @@
         <w:rPr>
           <w:szCs w:val="26"/>
         </w:rPr>
+        <w:lastRenderedPageBreak/>
         <w:t>Docker và Docker Compose</w:t>
       </w:r>
     </w:p>
@@ -7993,19 +7980,248 @@
           <w:lang w:val="en-US"/>
         </w:rPr>
       </w:pPr>
+    </w:p>
+    <w:p>
+      <w:pPr>
+        <w:spacing w:line="360" w:lineRule="auto"/>
+      </w:pPr>
+      <w:r>
+        <w:t>Chương này trình bày toàn bộ kết quả đạt được của đề tài sau quá trình phân tích, thiết kế và triển khai hệ thống, đi sâu vào chi tiết giao diện, chức năng thực tế của từng phân hệ (Khách hàng và Quản trị), kết quả kiểm thử hệ thống, đánh giá tổng quan cũng như các hạn chế và định hướng phát triển.</w:t>
+      </w:r>
+    </w:p>
+    <w:p>
+      <w:pPr>
+        <w:pStyle w:val="Heading2"/>
+      </w:pPr>
+      <w:r>
+        <w:t>Giao diện hệ thống và chức năng chi tiết</w:t>
+      </w:r>
+    </w:p>
+    <w:p>
+      <w:pPr>
+        <w:spacing w:line="360" w:lineRule="auto"/>
+        <w:rPr>
+          <w:b/>
+        </w:rPr>
+      </w:pPr>
+      <w:r>
+        <w:rPr>
+          <w:b/>
+        </w:rPr>
+        <w:t>Giao diện khách hàng (Frontend)</w:t>
+      </w:r>
+    </w:p>
+    <w:p>
+      <w:pPr>
+        <w:pStyle w:val="Heading3"/>
+      </w:pPr>
+      <w:r>
+        <w:t>Trang chủ</w:t>
+      </w:r>
+    </w:p>
+    <w:p>
+      <w:pPr>
+        <w:spacing w:line="360" w:lineRule="auto"/>
+      </w:pPr>
+      <w:r>
+        <w:t>C</w:t>
+      </w:r>
+      <w:r>
+        <w:t xml:space="preserve">hức năng: </w:t>
+      </w:r>
+      <w:r>
+        <w:t>Giao diện cơ bản, đơn giản cho khách hàng biết trang web đang chạy với thanh điều hướng ở phía trên (bao gồm logo, các danh mục, giỏ hàng, thông tin tài khoản/đăng nhập).</w:t>
+      </w:r>
+    </w:p>
+    <w:p>
+      <w:pPr>
+        <w:pStyle w:val="Hinh"/>
+      </w:pPr>
+      <w:r>
+        <w:t>Hình 4.1: Giao diện Trang chủ khách hàng</w:t>
+      </w:r>
+    </w:p>
+    <w:p>
+      <w:pPr>
+        <w:spacing w:line="360" w:lineRule="auto"/>
+        <w:ind w:firstLine="0"/>
+        <w:jc w:val="center"/>
+      </w:pPr>
+      <w:r>
+        <w:drawing>
+          <wp:inline distT="0" distB="0" distL="0" distR="0" wp14:anchorId="39052EFD" wp14:editId="52D39D2E">
+            <wp:extent cx="5580380" cy="1299845"/>
+            <wp:effectExtent l="0" t="0" r="1270" b="0"/>
+            <wp:docPr id="2" name="Picture 2"/>
+            <wp:cNvGraphicFramePr>
+              <a:graphicFrameLocks xmlns:a="http://schemas.openxmlformats.org/drawingml/2006/main" noChangeAspect="1"/>
+            </wp:cNvGraphicFramePr>
+            <a:graphic xmlns:a="http://schemas.openxmlformats.org/drawingml/2006/main">
+              <a:graphicData uri="http://schemas.openxmlformats.org/drawingml/2006/picture">
+                <pic:pic xmlns:pic="http://schemas.openxmlformats.org/drawingml/2006/picture">
+                  <pic:nvPicPr>
+                    <pic:cNvPr id="1" name=""/>
+                    <pic:cNvPicPr/>
+                  </pic:nvPicPr>
+                  <pic:blipFill>
+                    <a:blip r:embed="rId13"/>
+                    <a:stretch>
+                      <a:fillRect/>
+                    </a:stretch>
+                  </pic:blipFill>
+                  <pic:spPr>
+                    <a:xfrm>
+                      <a:off x="0" y="0"/>
+                      <a:ext cx="5580380" cy="1299845"/>
+                    </a:xfrm>
+                    <a:prstGeom prst="rect">
+                      <a:avLst/>
+                    </a:prstGeom>
+                  </pic:spPr>
+                </pic:pic>
+              </a:graphicData>
+            </a:graphic>
+          </wp:inline>
+        </w:drawing>
+      </w:r>
+    </w:p>
+    <w:p>
+      <w:pPr>
+        <w:pStyle w:val="Heading3"/>
+      </w:pPr>
+      <w:r>
+        <w:t>Trang danh sách sản phẩm</w:t>
+      </w:r>
+    </w:p>
+    <w:p>
+      <w:pPr>
+        <w:rPr>
+          <w:lang w:val="en-US"/>
+        </w:rPr>
+      </w:pPr>
+      <w:r>
+        <w:rPr>
+          <w:lang w:val="en-US"/>
+        </w:rPr>
+        <w:t>C</w:t>
+      </w:r>
+      <w:r>
+        <w:rPr>
+          <w:lang w:val="en-US"/>
+        </w:rPr>
+        <w:t>hức năng: Hiển thị toàn bộ sản phẩm hoặc lọc theo danh mục sản phẩm. Hỗ trợ thanh tìm kiếm sản phẩm theo từ khóa và cho phép người dùng click chọn xem chi tiết sản phẩm.</w:t>
+      </w:r>
+    </w:p>
+    <w:p>
+      <w:pPr>
+        <w:rPr>
+          <w:lang w:val="en-US"/>
+        </w:rPr>
+      </w:pPr>
+    </w:p>
+    <w:p>
+      <w:pPr>
+        <w:rPr>
+          <w:lang w:val="en-US"/>
+        </w:rPr>
+      </w:pPr>
+    </w:p>
+    <w:p>
+      <w:pPr>
+        <w:rPr>
+          <w:lang w:val="en-US"/>
+        </w:rPr>
+      </w:pPr>
+    </w:p>
+    <w:p>
+      <w:pPr>
+        <w:rPr>
+          <w:lang w:val="en-US"/>
+        </w:rPr>
+      </w:pPr>
+    </w:p>
+    <w:p>
+      <w:pPr>
+        <w:rPr>
+          <w:lang w:val="en-US"/>
+        </w:rPr>
+      </w:pPr>
+    </w:p>
+    <w:p>
+      <w:pPr>
+        <w:rPr>
+          <w:lang w:val="en-US"/>
+        </w:rPr>
+      </w:pPr>
+    </w:p>
+    <w:p>
+      <w:pPr>
+        <w:rPr>
+          <w:lang w:val="en-US"/>
+        </w:rPr>
+      </w:pPr>
       <w:bookmarkStart w:id="0" w:name="_GoBack"/>
       <w:bookmarkEnd w:id="0"/>
     </w:p>
     <w:p>
       <w:pPr>
+        <w:pStyle w:val="Hinh"/>
+        <w:rPr>
+          <w:lang w:val="en-US"/>
+        </w:rPr>
+      </w:pPr>
+      <w:r>
+        <w:lastRenderedPageBreak/>
+        <w:t>Hình 4.2: Giao diện Danh sách sản phẩm</w:t>
+      </w:r>
+    </w:p>
+    <w:p>
+      <w:pPr>
         <w:ind w:firstLine="0"/>
+        <w:jc w:val="center"/>
         <w:rPr>
-          <w:rFonts w:eastAsiaTheme="majorEastAsia"/>
-          <w:color w:val="000000" w:themeColor="text1"/>
+          <w:lang w:val="en-US"/>
         </w:rPr>
       </w:pPr>
       <w:r>
-        <w:br w:type="page"/>
+        <w:rPr>
+          <w:lang w:val="en-US"/>
+        </w:rPr>
+        <w:drawing>
+          <wp:inline distT="0" distB="0" distL="0" distR="0" wp14:anchorId="0036EE08" wp14:editId="0CBF3D76">
+            <wp:extent cx="5580380" cy="5605780"/>
+            <wp:effectExtent l="0" t="0" r="1270" b="0"/>
+            <wp:docPr id="3" name="Picture 3"/>
+            <wp:cNvGraphicFramePr>
+              <a:graphicFrameLocks xmlns:a="http://schemas.openxmlformats.org/drawingml/2006/main" noChangeAspect="1"/>
+            </wp:cNvGraphicFramePr>
+            <a:graphic xmlns:a="http://schemas.openxmlformats.org/drawingml/2006/main">
+              <a:graphicData uri="http://schemas.openxmlformats.org/drawingml/2006/picture">
+                <pic:pic xmlns:pic="http://schemas.openxmlformats.org/drawingml/2006/picture">
+                  <pic:nvPicPr>
+                    <pic:cNvPr id="1" name=""/>
+                    <pic:cNvPicPr/>
+                  </pic:nvPicPr>
+                  <pic:blipFill>
+                    <a:blip r:embed="rId14"/>
+                    <a:stretch>
+                      <a:fillRect/>
+                    </a:stretch>
+                  </pic:blipFill>
+                  <pic:spPr>
+                    <a:xfrm>
+                      <a:off x="0" y="0"/>
+                      <a:ext cx="5580380" cy="5605780"/>
+                    </a:xfrm>
+                    <a:prstGeom prst="rect">
+                      <a:avLst/>
+                    </a:prstGeom>
+                  </pic:spPr>
+                </pic:pic>
+              </a:graphicData>
+            </a:graphic>
+          </wp:inline>
+        </w:drawing>
       </w:r>
     </w:p>
     <w:p>
@@ -8104,7 +8320,7 @@
       <w:rPr>
         <w:noProof/>
       </w:rPr>
-      <w:t>25</w:t>
+      <w:t>27</w:t>
     </w:r>
     <w:r>
       <w:rPr>
@@ -10259,6 +10475,9 @@
   </w:num>
   <w:num w:numId="37">
     <w:abstractNumId w:val="8"/>
+  </w:num>
+  <w:num w:numId="38">
+    <w:abstractNumId w:val="12"/>
   </w:num>
 </w:numbering>
 </file>
@@ -11298,6 +11517,34 @@
       <w:lang w:val="vi-VN"/>
     </w:rPr>
   </w:style>
+  <w:style w:type="paragraph" w:customStyle="1" w:styleId="Hinh">
+    <w:name w:val="Hinh"/>
+    <w:basedOn w:val="Normal"/>
+    <w:link w:val="HinhChar"/>
+    <w:qFormat/>
+    <w:rsid w:val="00EC6EA8"/>
+    <w:pPr>
+      <w:spacing w:line="360" w:lineRule="auto"/>
+      <w:ind w:firstLine="0"/>
+      <w:jc w:val="center"/>
+    </w:pPr>
+    <w:rPr>
+      <w:i/>
+    </w:rPr>
+  </w:style>
+  <w:style w:type="character" w:customStyle="1" w:styleId="HinhChar">
+    <w:name w:val="Hinh Char"/>
+    <w:basedOn w:val="DefaultParagraphFont"/>
+    <w:link w:val="Hinh"/>
+    <w:rsid w:val="00EC6EA8"/>
+    <w:rPr>
+      <w:rFonts w:eastAsiaTheme="minorHAnsi"/>
+      <w:i/>
+      <w:sz w:val="26"/>
+      <w:szCs w:val="26"/>
+      <w:lang w:val="vi-VN"/>
+    </w:rPr>
+  </w:style>
 </w:styles>
 </file>
 
@@ -11583,7 +11830,7 @@
 </file>
 
 <file path=customXml/itemProps2.xml><?xml version="1.0" encoding="utf-8"?>
-<ds:datastoreItem xmlns:ds="http://schemas.openxmlformats.org/officeDocument/2006/customXml" ds:itemID="{3FF5B592-DF77-4D68-831B-DEE72749F9FC}">
+<ds:datastoreItem xmlns:ds="http://schemas.openxmlformats.org/officeDocument/2006/customXml" ds:itemID="{2085B7FB-ACEE-41A4-A3D4-217D21F61FD9}">
   <ds:schemaRefs>
     <ds:schemaRef ds:uri="http://schemas.openxmlformats.org/officeDocument/2006/bibliography"/>
   </ds:schemaRefs>

</xml_diff>

<commit_message>
FIX: Checkout directory error islogin var
</commit_message>
<xml_diff>
--- a/doc/110123011 HIEU.docx
+++ b/doc/110123011 HIEU.docx
@@ -8048,6 +8048,10 @@
         <w:jc w:val="center"/>
       </w:pPr>
       <w:r>
+        <w:rPr>
+          <w:noProof/>
+          <w:lang w:val="en-US"/>
+        </w:rPr>
         <w:drawing>
           <wp:inline distT="0" distB="0" distL="0" distR="0" wp14:anchorId="39052EFD" wp14:editId="52D39D2E">
             <wp:extent cx="5580380" cy="1299845"/>
@@ -8160,8 +8164,6 @@
           <w:lang w:val="en-US"/>
         </w:rPr>
       </w:pPr>
-      <w:bookmarkStart w:id="0" w:name="_GoBack"/>
-      <w:bookmarkEnd w:id="0"/>
     </w:p>
     <w:p>
       <w:pPr>
@@ -8185,12 +8187,13 @@
       </w:pPr>
       <w:r>
         <w:rPr>
+          <w:noProof/>
           <w:lang w:val="en-US"/>
         </w:rPr>
         <w:drawing>
           <wp:inline distT="0" distB="0" distL="0" distR="0" wp14:anchorId="0036EE08" wp14:editId="0CBF3D76">
-            <wp:extent cx="5580380" cy="5605780"/>
-            <wp:effectExtent l="0" t="0" r="1270" b="0"/>
+            <wp:extent cx="4672651" cy="4693920"/>
+            <wp:effectExtent l="0" t="0" r="0" b="0"/>
             <wp:docPr id="3" name="Picture 3"/>
             <wp:cNvGraphicFramePr>
               <a:graphicFrameLocks xmlns:a="http://schemas.openxmlformats.org/drawingml/2006/main" noChangeAspect="1"/>
@@ -8211,7 +8214,7 @@
                   <pic:spPr>
                     <a:xfrm>
                       <a:off x="0" y="0"/>
-                      <a:ext cx="5580380" cy="5605780"/>
+                      <a:ext cx="4675984" cy="4697269"/>
                     </a:xfrm>
                     <a:prstGeom prst="rect">
                       <a:avLst/>
@@ -8223,6 +8226,275 @@
           </wp:inline>
         </w:drawing>
       </w:r>
+    </w:p>
+    <w:p>
+      <w:pPr>
+        <w:pStyle w:val="Heading3"/>
+        <w:rPr>
+          <w:lang w:val="en-US"/>
+        </w:rPr>
+      </w:pPr>
+      <w:r>
+        <w:rPr>
+          <w:lang w:val="en-US"/>
+        </w:rPr>
+        <w:t>Trang chi tiết sản phẩm</w:t>
+      </w:r>
+    </w:p>
+    <w:p>
+      <w:pPr>
+        <w:rPr>
+          <w:lang w:val="en-US"/>
+        </w:rPr>
+      </w:pPr>
+      <w:r>
+        <w:rPr>
+          <w:lang w:val="en-US"/>
+        </w:rPr>
+        <w:t>C</w:t>
+      </w:r>
+      <w:r>
+        <w:rPr>
+          <w:lang w:val="en-US"/>
+        </w:rPr>
+        <w:t>hức năng: Hiển thị thông tin chi tiết của sản phẩm bao gồm: tên sản phẩm, giá bán, mô tả chi tiết, hình ảnh minh họa và số lượng sản phẩm còn lại trong kho. Tích hợp nút chức năng "Thêm vào giỏ hàng".</w:t>
+      </w:r>
+    </w:p>
+    <w:p>
+      <w:pPr>
+        <w:pStyle w:val="Hinh"/>
+      </w:pPr>
+      <w:r>
+        <w:t>Hình 4.3: Giao diện Chi tiết sản phẩm</w:t>
+      </w:r>
+    </w:p>
+    <w:p>
+      <w:pPr>
+        <w:ind w:firstLine="0"/>
+        <w:rPr>
+          <w:lang w:val="en-US"/>
+        </w:rPr>
+      </w:pPr>
+      <w:r>
+        <w:rPr>
+          <w:lang w:val="en-US"/>
+        </w:rPr>
+        <w:drawing>
+          <wp:inline distT="0" distB="0" distL="0" distR="0" wp14:anchorId="42D1B3EA" wp14:editId="64060D50">
+            <wp:extent cx="5097780" cy="2422432"/>
+            <wp:effectExtent l="0" t="0" r="7620" b="0"/>
+            <wp:docPr id="4" name="Picture 4"/>
+            <wp:cNvGraphicFramePr>
+              <a:graphicFrameLocks xmlns:a="http://schemas.openxmlformats.org/drawingml/2006/main" noChangeAspect="1"/>
+            </wp:cNvGraphicFramePr>
+            <a:graphic xmlns:a="http://schemas.openxmlformats.org/drawingml/2006/main">
+              <a:graphicData uri="http://schemas.openxmlformats.org/drawingml/2006/picture">
+                <pic:pic xmlns:pic="http://schemas.openxmlformats.org/drawingml/2006/picture">
+                  <pic:nvPicPr>
+                    <pic:cNvPr id="1" name=""/>
+                    <pic:cNvPicPr/>
+                  </pic:nvPicPr>
+                  <pic:blipFill>
+                    <a:blip r:embed="rId15"/>
+                    <a:stretch>
+                      <a:fillRect/>
+                    </a:stretch>
+                  </pic:blipFill>
+                  <pic:spPr>
+                    <a:xfrm>
+                      <a:off x="0" y="0"/>
+                      <a:ext cx="5102508" cy="2424679"/>
+                    </a:xfrm>
+                    <a:prstGeom prst="rect">
+                      <a:avLst/>
+                    </a:prstGeom>
+                  </pic:spPr>
+                </pic:pic>
+              </a:graphicData>
+            </a:graphic>
+          </wp:inline>
+        </w:drawing>
+      </w:r>
+    </w:p>
+    <w:p>
+      <w:pPr>
+        <w:pStyle w:val="Heading3"/>
+      </w:pPr>
+      <w:r>
+        <w:lastRenderedPageBreak/>
+        <w:t>Giỏ hàng</w:t>
+      </w:r>
+    </w:p>
+    <w:p>
+      <w:r>
+        <w:rPr>
+          <w:lang w:val="en-US"/>
+        </w:rPr>
+        <w:t>C</w:t>
+      </w:r>
+      <w:r>
+        <w:t>hức năng: Hiển thị danh sách các sản phẩm mà khách hàng đã chọn mua. Cho phép cập nhật lại số lượng sản phẩm, xóa sản phẩm khỏi giỏ hàng và tự động tính tổng tiền tạm tính.</w:t>
+      </w:r>
+    </w:p>
+    <w:p>
+      <w:pPr>
+        <w:pStyle w:val="Hinh"/>
+      </w:pPr>
+      <w:r>
+        <w:t>Hình 4.4: Giao diện Giỏ hàng</w:t>
+      </w:r>
+    </w:p>
+    <w:p>
+      <w:pPr>
+        <w:ind w:firstLine="0"/>
+      </w:pPr>
+      <w:r>
+        <w:drawing>
+          <wp:inline distT="0" distB="0" distL="0" distR="0" wp14:anchorId="3B5F799C" wp14:editId="3DAB3433">
+            <wp:extent cx="5580380" cy="3029585"/>
+            <wp:effectExtent l="0" t="0" r="1270" b="0"/>
+            <wp:docPr id="6" name="Picture 6"/>
+            <wp:cNvGraphicFramePr>
+              <a:graphicFrameLocks xmlns:a="http://schemas.openxmlformats.org/drawingml/2006/main" noChangeAspect="1"/>
+            </wp:cNvGraphicFramePr>
+            <a:graphic xmlns:a="http://schemas.openxmlformats.org/drawingml/2006/main">
+              <a:graphicData uri="http://schemas.openxmlformats.org/drawingml/2006/picture">
+                <pic:pic xmlns:pic="http://schemas.openxmlformats.org/drawingml/2006/picture">
+                  <pic:nvPicPr>
+                    <pic:cNvPr id="1" name=""/>
+                    <pic:cNvPicPr/>
+                  </pic:nvPicPr>
+                  <pic:blipFill>
+                    <a:blip r:embed="rId16"/>
+                    <a:stretch>
+                      <a:fillRect/>
+                    </a:stretch>
+                  </pic:blipFill>
+                  <pic:spPr>
+                    <a:xfrm>
+                      <a:off x="0" y="0"/>
+                      <a:ext cx="5580380" cy="3029585"/>
+                    </a:xfrm>
+                    <a:prstGeom prst="rect">
+                      <a:avLst/>
+                    </a:prstGeom>
+                  </pic:spPr>
+                </pic:pic>
+              </a:graphicData>
+            </a:graphic>
+          </wp:inline>
+        </w:drawing>
+      </w:r>
+    </w:p>
+    <w:p>
+      <w:pPr>
+        <w:pStyle w:val="Heading3"/>
+      </w:pPr>
+      <w:r>
+        <w:t>Thanh toán</w:t>
+      </w:r>
+    </w:p>
+    <w:p>
+      <w:r>
+        <w:rPr>
+          <w:lang w:val="en-US"/>
+        </w:rPr>
+        <w:t>C</w:t>
+      </w:r>
+      <w:r>
+        <w:t>hức năng: Cho phép người dùng nhập thông tin khách hàng (họ tên, số điện thoại, địa chỉ nhận hàng), chọn phương thức giao hàng / thanh toán (ví dụ: COD) và tiến hành tạo đơn hàng sau khi xác nhận.</w:t>
+      </w:r>
+    </w:p>
+    <w:p>
+      <w:pPr>
+        <w:ind w:firstLine="0"/>
+        <w:jc w:val="center"/>
+      </w:pPr>
+      <w:r>
+        <w:t>Hình 4.5: Giao diện Thanh toán Checkout</w:t>
+      </w:r>
+    </w:p>
+    <w:p>
+      <w:pPr>
+        <w:ind w:firstLine="0"/>
+      </w:pPr>
+      <w:r>
+        <w:drawing>
+          <wp:inline distT="0" distB="0" distL="0" distR="0" wp14:anchorId="1EC21345" wp14:editId="00DD5112">
+            <wp:extent cx="5580380" cy="2684780"/>
+            <wp:effectExtent l="0" t="0" r="1270" b="1270"/>
+            <wp:docPr id="7" name="Picture 7"/>
+            <wp:cNvGraphicFramePr>
+              <a:graphicFrameLocks xmlns:a="http://schemas.openxmlformats.org/drawingml/2006/main" noChangeAspect="1"/>
+            </wp:cNvGraphicFramePr>
+            <a:graphic xmlns:a="http://schemas.openxmlformats.org/drawingml/2006/main">
+              <a:graphicData uri="http://schemas.openxmlformats.org/drawingml/2006/picture">
+                <pic:pic xmlns:pic="http://schemas.openxmlformats.org/drawingml/2006/picture">
+                  <pic:nvPicPr>
+                    <pic:cNvPr id="1" name=""/>
+                    <pic:cNvPicPr/>
+                  </pic:nvPicPr>
+                  <pic:blipFill>
+                    <a:blip r:embed="rId17"/>
+                    <a:stretch>
+                      <a:fillRect/>
+                    </a:stretch>
+                  </pic:blipFill>
+                  <pic:spPr>
+                    <a:xfrm>
+                      <a:off x="0" y="0"/>
+                      <a:ext cx="5580380" cy="2684780"/>
+                    </a:xfrm>
+                    <a:prstGeom prst="rect">
+                      <a:avLst/>
+                    </a:prstGeom>
+                  </pic:spPr>
+                </pic:pic>
+              </a:graphicData>
+            </a:graphic>
+          </wp:inline>
+        </w:drawing>
+      </w:r>
+    </w:p>
+    <w:p>
+      <w:pPr>
+        <w:ind w:firstLine="0"/>
+      </w:pPr>
+    </w:p>
+    <w:p>
+      <w:pPr>
+        <w:pStyle w:val="Heading3"/>
+      </w:pPr>
+      <w:r>
+        <w:lastRenderedPageBreak/>
+        <w:t>Đăng nhập</w:t>
+      </w:r>
+    </w:p>
+    <w:p>
+      <w:r>
+        <w:rPr>
+          <w:lang w:val="en-US"/>
+        </w:rPr>
+        <w:t>C</w:t>
+      </w:r>
+      <w:r>
+        <w:t>hức năng: Cho phép người dùng đăng nhập vào hệ thống bằng tài khoản cá nhân. Hệ thống tiến hành xác thực tài khoản qua cơ sở dữ liệu.</w:t>
+      </w:r>
+    </w:p>
+    <w:p>
+      <w:pPr>
+        <w:ind w:firstLine="0"/>
+      </w:pPr>
+      <w:r>
+        <w:t>Hình 4.6: Giao diện Đăng nhập</w:t>
+      </w:r>
+    </w:p>
+    <w:p>
+      <w:pPr>
+        <w:ind w:firstLine="0"/>
+      </w:pPr>
+      <w:bookmarkStart w:id="0" w:name="_GoBack"/>
+      <w:bookmarkEnd w:id="0"/>
     </w:p>
     <w:p>
       <w:pPr>
@@ -11830,7 +12102,7 @@
 </file>
 
 <file path=customXml/itemProps2.xml><?xml version="1.0" encoding="utf-8"?>
-<ds:datastoreItem xmlns:ds="http://schemas.openxmlformats.org/officeDocument/2006/customXml" ds:itemID="{2085B7FB-ACEE-41A4-A3D4-217D21F61FD9}">
+<ds:datastoreItem xmlns:ds="http://schemas.openxmlformats.org/officeDocument/2006/customXml" ds:itemID="{17498415-0D9B-40EC-A7DE-6EE02BAC4D71}">
   <ds:schemaRefs>
     <ds:schemaRef ds:uri="http://schemas.openxmlformats.org/officeDocument/2006/bibliography"/>
   </ds:schemaRefs>

</xml_diff>